<commit_message>
Add initial draft of report for Advanced Robotics Automation and Computer Vision
</commit_message>
<xml_diff>
--- a/Sem2/Advanced Robotics Automation and Computer Vision/Report.docx
+++ b/Sem2/Advanced Robotics Automation and Computer Vision/Report.docx
@@ -12,6 +12,7 @@
       <w:r>
         <w:rPr>
           <w:rFonts w:cs="Times New Roman"/>
+          <w:noProof/>
         </w:rPr>
         <w:drawing>
           <wp:inline distT="0" distB="0" distL="0" distR="0" wp14:anchorId="421473EE" wp14:editId="5F10D0D5">
@@ -88,6 +89,7 @@
       <w:r>
         <w:rPr>
           <w:rFonts w:cs="Times New Roman"/>
+          <w:noProof/>
         </w:rPr>
         <w:drawing>
           <wp:inline distT="0" distB="0" distL="0" distR="0" wp14:anchorId="0965AE87" wp14:editId="0C1C8256">
@@ -530,7 +532,25 @@
           <w:sz w:val="28"/>
           <w:szCs w:val="28"/>
         </w:rPr>
-        <w:t>Dr Fahmid Al Farid</w:t>
+        <w:t xml:space="preserve">Dr </w:t>
+      </w:r>
+      <w:proofErr w:type="spellStart"/>
+      <w:r>
+        <w:rPr>
+          <w:rFonts w:cs="Times New Roman"/>
+          <w:sz w:val="28"/>
+          <w:szCs w:val="28"/>
+        </w:rPr>
+        <w:t>Fahmid</w:t>
+      </w:r>
+      <w:proofErr w:type="spellEnd"/>
+      <w:r>
+        <w:rPr>
+          <w:rFonts w:cs="Times New Roman"/>
+          <w:sz w:val="28"/>
+          <w:szCs w:val="28"/>
+        </w:rPr>
+        <w:t xml:space="preserve"> Al Farid</w:t>
       </w:r>
     </w:p>
     <w:p>
@@ -1286,6 +1306,7 @@
             <w:r>
               <w:rPr>
                 <w:rFonts w:cs="Times New Roman"/>
+                <w:noProof/>
               </w:rPr>
               <w:drawing>
                 <wp:inline distT="0" distB="0" distL="0" distR="0" wp14:anchorId="077D6C1E" wp14:editId="7DC3F183">
@@ -4160,6 +4181,7 @@
       <w:r>
         <w:rPr>
           <w:rFonts w:cs="Times New Roman"/>
+          <w:noProof/>
         </w:rPr>
         <w:drawing>
           <wp:inline distT="0" distB="0" distL="0" distR="0" wp14:anchorId="1F8444EF" wp14:editId="6C09E3E0">
@@ -4316,7 +4338,21 @@
         <w:rPr>
           <w:rFonts w:ascii="Times New Roman" w:hAnsi="Times New Roman" w:cs="Times New Roman"/>
         </w:rPr>
-        <w:t>This report covers two related projects for the module Advanced Robotics Automation and Computer Vision. The first is a deep learning vision system for crop health monitoring, trained on PlantVillage and adapted through augmentation to approximate low-altitude drone imagery, covering viewpoint change, motion blur and variable lighting. A MobileNetV2 backbone, pretrained on ImageNet, was fine-tuned on 54,305 leaf images across 38 classes using an 80/20 split, reaching 99.11% validation accuracy, 98.64% macro precision, 99.06% macro recall and 98.83% macro F1 over eight epochs. The classifier has around 2.27 million parameters, suited to onboard drone inference.</w:t>
+        <w:t xml:space="preserve">This report covers two related projects for the module Advanced Robotics Automation and Computer Vision. The first is a deep learning vision system for crop health monitoring, trained on </w:t>
+      </w:r>
+      <w:proofErr w:type="spellStart"/>
+      <w:r>
+        <w:rPr>
+          <w:rFonts w:ascii="Times New Roman" w:hAnsi="Times New Roman" w:cs="Times New Roman"/>
+        </w:rPr>
+        <w:t>PlantVillage</w:t>
+      </w:r>
+      <w:proofErr w:type="spellEnd"/>
+      <w:r>
+        <w:rPr>
+          <w:rFonts w:ascii="Times New Roman" w:hAnsi="Times New Roman" w:cs="Times New Roman"/>
+        </w:rPr>
+        <w:t xml:space="preserve"> and adapted through augmentation to approximate low-altitude drone imagery, covering viewpoint change, motion blur and variable lighting. A MobileNetV2 backbone, pretrained on ImageNet, was fine-tuned on 54,305 leaf images across 38 classes using an 80/20 split, reaching 99.11% validation accuracy, 98.64% macro precision, 99.06% macro recall and 98.83% macro F1 over eight epochs. The classifier has around 2.27 million parameters, suited to onboard drone inference.</w:t>
       </w:r>
     </w:p>
     <w:p>
@@ -4341,7 +4377,21 @@
         <w:rPr>
           <w:rFonts w:ascii="Times New Roman" w:hAnsi="Times New Roman" w:cs="Times New Roman"/>
         </w:rPr>
-        <w:t>second project implements vision guided navigation for a simulated TurtleBot3 in a ROS 2 Gazebo environment, using OpenCV colour thresholding to detect a marker and a rule-based controller to search, turn and approach it. Perception and control were verified offline against seven synthetic test frames covering centred, off-centre, near, far, absent and distractor scenarios, and a live query of the deployed ROSject reproduced the same proportional turning behaviour to five decimal places. Together, the two projects show how a learned, offline approach and a classical, real-time approach each suit their own robotic context.</w:t>
+        <w:t xml:space="preserve">second project implements vision guided navigation for a simulated TurtleBot3 in a ROS 2 Gazebo environment, using OpenCV colour thresholding to detect a marker and a rule-based controller to search, turn and approach it. Perception and control were verified offline against seven synthetic test frames covering centred, off-centre, near, far, absent and distractor scenarios, and a live query of the deployed </w:t>
+      </w:r>
+      <w:proofErr w:type="spellStart"/>
+      <w:r>
+        <w:rPr>
+          <w:rFonts w:ascii="Times New Roman" w:hAnsi="Times New Roman" w:cs="Times New Roman"/>
+        </w:rPr>
+        <w:t>ROSject</w:t>
+      </w:r>
+      <w:proofErr w:type="spellEnd"/>
+      <w:r>
+        <w:rPr>
+          <w:rFonts w:ascii="Times New Roman" w:hAnsi="Times New Roman" w:cs="Times New Roman"/>
+        </w:rPr>
+        <w:t xml:space="preserve"> reproduced the same proportional turning behaviour to five decimal places. Together, the two projects show how a learned, offline approach and a classical, real-time approach each suit their own robotic context.</w:t>
       </w:r>
       <w:r>
         <w:rPr>
@@ -4387,13 +4437,7 @@
         <w:rPr>
           <w:rFonts w:ascii="Times New Roman" w:hAnsi="Times New Roman" w:cs="Times New Roman"/>
         </w:rPr>
-        <w:t xml:space="preserve"> </w:t>
-      </w:r>
-      <w:r>
-        <w:rPr>
-          <w:rFonts w:ascii="Times New Roman" w:hAnsi="Times New Roman" w:cs="Times New Roman"/>
-        </w:rPr>
-        <w:t>vision systems now underpin two areas of practical importance: in precision agriculture, early crop disease detection affects yield and food security, while in mobile robotics, visual interpretation of surroundings determines how far a robot can operate without supervision. This report addresses both areas through two tasks issued under one assignment brief for the module Advanced Robotics Automation and Computer Vision, presented together in one document.</w:t>
+        <w:t xml:space="preserve"> vision systems now underpin two areas of practical importance: in precision agriculture, early crop disease detection affects yield and food security, while in mobile robotics, visual interpretation of surroundings determines how far a robot can operate without supervision. This report addresses both areas through two tasks issued under one assignment brief for the module Advanced Robotics Automation and Computer Vision, presented together in one document.</w:t>
       </w:r>
     </w:p>
     <w:p>
@@ -4532,8 +4576,8 @@
           <w:rFonts w:cs="Times New Roman"/>
         </w:rPr>
       </w:pPr>
-      <w:bookmarkStart w:id="4" w:name="design-and-implementation"/>
-      <w:bookmarkStart w:id="5" w:name="_Toc240463720"/>
+      <w:bookmarkStart w:id="4" w:name="_Toc240463720"/>
+      <w:bookmarkStart w:id="5" w:name="design-and-implementation"/>
       <w:r>
         <w:rPr>
           <w:rFonts w:cs="Times New Roman"/>
@@ -4546,7 +4590,7 @@
         </w:rPr>
         <w:t>Literature Review</w:t>
       </w:r>
-      <w:bookmarkEnd w:id="5"/>
+      <w:bookmarkEnd w:id="4"/>
     </w:p>
     <w:p>
       <w:pPr>
@@ -4592,7 +4636,35 @@
         <w:rPr>
           <w:rFonts w:cs="Times New Roman"/>
         </w:rPr>
-        <w:t>Hughes and Salathe (2016) were among the first to show deep CNNs trained on PlantVillage could exceed 99% accuracy, though using the dataset's original close range, controlled photographs. Pal et al. (2025) built on this with a lightweight, explainable CNN reaching 99.47% on PlantVillage and 97.73% on a larger 58 class dataset, suggesting smaller models need not sacrifice accuracy for efficiency.</w:t>
+        <w:t xml:space="preserve">Hughes and Salathe (2016) were among the first to show deep CNNs trained on </w:t>
+      </w:r>
+      <w:proofErr w:type="spellStart"/>
+      <w:r>
+        <w:rPr>
+          <w:rFonts w:cs="Times New Roman"/>
+        </w:rPr>
+        <w:t>PlantVillage</w:t>
+      </w:r>
+      <w:proofErr w:type="spellEnd"/>
+      <w:r>
+        <w:rPr>
+          <w:rFonts w:cs="Times New Roman"/>
+        </w:rPr>
+        <w:t xml:space="preserve"> could exceed 99% accuracy, though using the dataset's original close range, controlled photographs. Pal et al. (2025) built on this with a lightweight, explainable CNN reaching 99.47% on </w:t>
+      </w:r>
+      <w:proofErr w:type="spellStart"/>
+      <w:r>
+        <w:rPr>
+          <w:rFonts w:cs="Times New Roman"/>
+        </w:rPr>
+        <w:t>PlantVillage</w:t>
+      </w:r>
+      <w:proofErr w:type="spellEnd"/>
+      <w:r>
+        <w:rPr>
+          <w:rFonts w:cs="Times New Roman"/>
+        </w:rPr>
+        <w:t xml:space="preserve"> and 97.73% on a larger 58 class dataset, suggesting smaller models need not sacrifice accuracy for efficiency.</w:t>
       </w:r>
     </w:p>
     <w:p>
@@ -4625,7 +4697,21 @@
         <w:rPr>
           <w:rFonts w:cs="Times New Roman"/>
         </w:rPr>
-        <w:t>Manoj et al. (2025) applied disease detection directly to drone imagery over large fields, and a review of AI enabled UAV systems (arXiv, 2023) outlines the sensing and onboard processing limits of aerial platforms. Both point to a gap this project could not fully replicate: real UAV imagery differs from ground level photography in scale, viewpoint and motion blur, approximated here through augmentation rather than genuine aerial data.</w:t>
+        <w:t>Manoj et al. (2025) applied disease detection directly to drone imagery over large fields, and a review of AI enabled UAV systems (</w:t>
+      </w:r>
+      <w:proofErr w:type="spellStart"/>
+      <w:r>
+        <w:rPr>
+          <w:rFonts w:cs="Times New Roman"/>
+        </w:rPr>
+        <w:t>arXiv</w:t>
+      </w:r>
+      <w:proofErr w:type="spellEnd"/>
+      <w:r>
+        <w:rPr>
+          <w:rFonts w:cs="Times New Roman"/>
+        </w:rPr>
+        <w:t>, 2023) outlines the sensing and onboard processing limits of aerial platforms. Both point to a gap this project could not fully replicate: real UAV imagery differs from ground level photography in scale, viewpoint and motion blur, approximated here through augmentation rather than genuine aerial data.</w:t>
       </w:r>
     </w:p>
     <w:p>
@@ -4665,7 +4751,21 @@
           <w:rFonts w:cs="Times New Roman"/>
         </w:rPr>
         <w:lastRenderedPageBreak/>
-        <w:t>scale. Jlassi et al. (2024) applied MobileNetV2 transfer learning with reweighting to potato leaf disease classification for imbalanced data, with strong results on underrepresented classes, relevant since PlantVillage is also imbalanced.</w:t>
+        <w:t xml:space="preserve">scale. Jlassi et al. (2024) applied MobileNetV2 transfer learning with reweighting to potato leaf disease classification for imbalanced data, with strong results on underrepresented classes, relevant since </w:t>
+      </w:r>
+      <w:proofErr w:type="spellStart"/>
+      <w:r>
+        <w:rPr>
+          <w:rFonts w:cs="Times New Roman"/>
+        </w:rPr>
+        <w:t>PlantVillage</w:t>
+      </w:r>
+      <w:proofErr w:type="spellEnd"/>
+      <w:r>
+        <w:rPr>
+          <w:rFonts w:cs="Times New Roman"/>
+        </w:rPr>
+        <w:t xml:space="preserve"> is also imbalanced.</w:t>
       </w:r>
     </w:p>
     <w:p>
@@ -4720,11 +4820,89 @@
         </w:rPr>
         <w:t xml:space="preserve">The </w:t>
       </w:r>
+      <w:proofErr w:type="spellStart"/>
       <w:r>
         <w:rPr>
           <w:rFonts w:ascii="Times New Roman" w:hAnsi="Times New Roman" w:cs="Times New Roman"/>
         </w:rPr>
-        <w:t>PlantVillage dataset was used via the Hugging Face datasets library (mohanty/PlantVillage), using the colour configuration, mirroring the original repository (mohanty/PlantVillage, 2016; PlantVillage-Dataset, 2016), comprising 54,305 labelled leaf images across 38 classes, a widely used baseline in plant pathology research (Mohanty, Hughes and Salathe, 2016).</w:t>
+        <w:t>PlantVillage</w:t>
+      </w:r>
+      <w:proofErr w:type="spellEnd"/>
+      <w:r>
+        <w:rPr>
+          <w:rFonts w:ascii="Times New Roman" w:hAnsi="Times New Roman" w:cs="Times New Roman"/>
+        </w:rPr>
+        <w:t xml:space="preserve"> dataset was used via the Hugging Face datasets library (</w:t>
+      </w:r>
+      <w:proofErr w:type="spellStart"/>
+      <w:r>
+        <w:rPr>
+          <w:rFonts w:ascii="Times New Roman" w:hAnsi="Times New Roman" w:cs="Times New Roman"/>
+        </w:rPr>
+        <w:t>mohanty</w:t>
+      </w:r>
+      <w:proofErr w:type="spellEnd"/>
+      <w:r>
+        <w:rPr>
+          <w:rFonts w:ascii="Times New Roman" w:hAnsi="Times New Roman" w:cs="Times New Roman"/>
+        </w:rPr>
+        <w:t>/</w:t>
+      </w:r>
+      <w:proofErr w:type="spellStart"/>
+      <w:r>
+        <w:rPr>
+          <w:rFonts w:ascii="Times New Roman" w:hAnsi="Times New Roman" w:cs="Times New Roman"/>
+        </w:rPr>
+        <w:t>PlantVillage</w:t>
+      </w:r>
+      <w:proofErr w:type="spellEnd"/>
+      <w:r>
+        <w:rPr>
+          <w:rFonts w:ascii="Times New Roman" w:hAnsi="Times New Roman" w:cs="Times New Roman"/>
+        </w:rPr>
+        <w:t>), using the colour configuration, mirroring the original repository (</w:t>
+      </w:r>
+      <w:proofErr w:type="spellStart"/>
+      <w:r>
+        <w:rPr>
+          <w:rFonts w:ascii="Times New Roman" w:hAnsi="Times New Roman" w:cs="Times New Roman"/>
+        </w:rPr>
+        <w:t>mohanty</w:t>
+      </w:r>
+      <w:proofErr w:type="spellEnd"/>
+      <w:r>
+        <w:rPr>
+          <w:rFonts w:ascii="Times New Roman" w:hAnsi="Times New Roman" w:cs="Times New Roman"/>
+        </w:rPr>
+        <w:t>/</w:t>
+      </w:r>
+      <w:proofErr w:type="spellStart"/>
+      <w:r>
+        <w:rPr>
+          <w:rFonts w:ascii="Times New Roman" w:hAnsi="Times New Roman" w:cs="Times New Roman"/>
+        </w:rPr>
+        <w:t>PlantVillage</w:t>
+      </w:r>
+      <w:proofErr w:type="spellEnd"/>
+      <w:r>
+        <w:rPr>
+          <w:rFonts w:ascii="Times New Roman" w:hAnsi="Times New Roman" w:cs="Times New Roman"/>
+        </w:rPr>
+        <w:t xml:space="preserve">, 2016; </w:t>
+      </w:r>
+      <w:proofErr w:type="spellStart"/>
+      <w:r>
+        <w:rPr>
+          <w:rFonts w:ascii="Times New Roman" w:hAnsi="Times New Roman" w:cs="Times New Roman"/>
+        </w:rPr>
+        <w:t>PlantVillage</w:t>
+      </w:r>
+      <w:proofErr w:type="spellEnd"/>
+      <w:r>
+        <w:rPr>
+          <w:rFonts w:ascii="Times New Roman" w:hAnsi="Times New Roman" w:cs="Times New Roman"/>
+        </w:rPr>
+        <w:t>-Dataset, 2016), comprising 54,305 labelled leaf images across 38 classes, a widely used baseline in plant pathology research (Mohanty, Hughes and Salathe, 2016).</w:t>
       </w:r>
     </w:p>
     <w:p>
@@ -4739,7 +4917,21 @@
         <w:rPr>
           <w:rFonts w:cs="Times New Roman"/>
         </w:rPr>
-        <w:t>Class counts were inspected prior to splitting, since PlantVillage is not perfectly balanced; some disease categories are represented by substantially fewer images than the most common classes.</w:t>
+        <w:t xml:space="preserve">Class counts were inspected prior to splitting, since </w:t>
+      </w:r>
+      <w:proofErr w:type="spellStart"/>
+      <w:r>
+        <w:rPr>
+          <w:rFonts w:cs="Times New Roman"/>
+        </w:rPr>
+        <w:t>PlantVillage</w:t>
+      </w:r>
+      <w:proofErr w:type="spellEnd"/>
+      <w:r>
+        <w:rPr>
+          <w:rFonts w:cs="Times New Roman"/>
+        </w:rPr>
+        <w:t xml:space="preserve"> is not perfectly balanced; some disease categories are represented by substantially fewer images than the most common classes.</w:t>
       </w:r>
     </w:p>
     <w:p>
@@ -4754,6 +4946,7 @@
       <w:r>
         <w:rPr>
           <w:rFonts w:cs="Times New Roman"/>
+          <w:noProof/>
         </w:rPr>
         <w:drawing>
           <wp:inline distT="0" distB="0" distL="0" distR="0" wp14:anchorId="1615427C" wp14:editId="24773457">
@@ -4825,7 +5018,15 @@
         <w:fldChar w:fldCharType="end"/>
       </w:r>
       <w:r>
-        <w:t>: Distribution of images across the 38 PlantVillage classes, illustrating the class imbalance referred to above.</w:t>
+        <w:t xml:space="preserve">: Distribution of images across the 38 </w:t>
+      </w:r>
+      <w:proofErr w:type="spellStart"/>
+      <w:r>
+        <w:t>PlantVillage</w:t>
+      </w:r>
+      <w:proofErr w:type="spellEnd"/>
+      <w:r>
+        <w:t xml:space="preserve"> classes, illustrating the class imbalance referred to above.</w:t>
       </w:r>
       <w:bookmarkEnd w:id="7"/>
     </w:p>
@@ -4862,13 +5063,7 @@
         <w:rPr>
           <w:rFonts w:cs="Times New Roman"/>
         </w:rPr>
-        <w:t xml:space="preserve"> </w:t>
-      </w:r>
-      <w:r>
-        <w:rPr>
-          <w:rFonts w:cs="Times New Roman"/>
-        </w:rPr>
-        <w:t xml:space="preserve">resized images to 224x224 and normalised pixel values using ImageNet mean and standard deviation, consistent with the pretrained MobileNetV2 weights. Augmentation, </w:t>
+        <w:t xml:space="preserve"> resized images to 224x224 and normalised pixel values using ImageNet mean and standard deviation, consistent with the pretrained MobileNetV2 weights. Augmentation, </w:t>
       </w:r>
       <w:r>
         <w:rPr>
@@ -4889,6 +5084,7 @@
       <w:r>
         <w:rPr>
           <w:rFonts w:cs="Times New Roman"/>
+          <w:noProof/>
         </w:rPr>
         <w:drawing>
           <wp:inline distT="0" distB="0" distL="0" distR="0" wp14:anchorId="61F1D0D5" wp14:editId="14E558F8">
@@ -5003,13 +5199,35 @@
         <w:rPr>
           <w:rFonts w:cs="Times New Roman"/>
         </w:rPr>
-        <w:t xml:space="preserve"> </w:t>
-      </w:r>
-      <w:r>
-        <w:rPr>
-          <w:rFonts w:cs="Times New Roman"/>
-        </w:rPr>
-        <w:t>was selected as backbone, pretrained on ImageNet and fine-tuned on PlantVillage, with the 1000-class output layer replaced by a linear layer for the 38 PlantVillage classes, giving a final model of approximately 2.27 million trainable parameters.</w:t>
+        <w:t xml:space="preserve"> was selected as backbone, pretrained on ImageNet and fine-tuned on </w:t>
+      </w:r>
+      <w:proofErr w:type="spellStart"/>
+      <w:r>
+        <w:rPr>
+          <w:rFonts w:cs="Times New Roman"/>
+        </w:rPr>
+        <w:t>PlantVillage</w:t>
+      </w:r>
+      <w:proofErr w:type="spellEnd"/>
+      <w:r>
+        <w:rPr>
+          <w:rFonts w:cs="Times New Roman"/>
+        </w:rPr>
+        <w:t xml:space="preserve">, with the 1000-class output layer replaced by a linear layer for the 38 </w:t>
+      </w:r>
+      <w:proofErr w:type="spellStart"/>
+      <w:r>
+        <w:rPr>
+          <w:rFonts w:cs="Times New Roman"/>
+        </w:rPr>
+        <w:t>PlantVillage</w:t>
+      </w:r>
+      <w:proofErr w:type="spellEnd"/>
+      <w:r>
+        <w:rPr>
+          <w:rFonts w:cs="Times New Roman"/>
+        </w:rPr>
+        <w:t xml:space="preserve"> classes, giving a final model of approximately 2.27 million trainable parameters.</w:t>
       </w:r>
       <w:r>
         <w:rPr>
@@ -5036,7 +5254,35 @@
         <w:rPr>
           <w:rFonts w:cs="Times New Roman"/>
         </w:rPr>
-        <w:t>defining feature is the inverted residual block with linear bottlenecks, using depthwise separable convolutions to reduce parameter count relative to standard architectures of comparable depth (Sandler et al., 2018), suiting a drone's tight compute, memory and power constraints. Figure 3 summarises this structure, showing the pretrained backbone feeding the replaced classification head. Pal et al. (2025) and Kumar et al. (2025) similarly report MobileNet-family accuracy above 99% while remaining edge deployable, supporting the choice made here.</w:t>
+        <w:t xml:space="preserve">defining feature is the inverted residual block with linear bottlenecks, using </w:t>
+      </w:r>
+      <w:proofErr w:type="spellStart"/>
+      <w:r>
+        <w:rPr>
+          <w:rFonts w:cs="Times New Roman"/>
+        </w:rPr>
+        <w:t>depthwise</w:t>
+      </w:r>
+      <w:proofErr w:type="spellEnd"/>
+      <w:r>
+        <w:rPr>
+          <w:rFonts w:cs="Times New Roman"/>
+        </w:rPr>
+        <w:t xml:space="preserve"> separable convolutions to reduce parameter count relative to standard architectures of comparable depth (Sandler et al., 2018), suiting a drone's tight compute, memory and power constraints. Figure 3 summarises this structure, showing the pretrained backbone feeding the replaced classification head. Pal et al. (2025) and Kumar et al. (2025) similarly report </w:t>
+      </w:r>
+      <w:proofErr w:type="spellStart"/>
+      <w:r>
+        <w:rPr>
+          <w:rFonts w:cs="Times New Roman"/>
+        </w:rPr>
+        <w:t>MobileNet</w:t>
+      </w:r>
+      <w:proofErr w:type="spellEnd"/>
+      <w:r>
+        <w:rPr>
+          <w:rFonts w:cs="Times New Roman"/>
+        </w:rPr>
+        <w:t>-family accuracy above 99% while remaining edge deployable, supporting the choice made here.</w:t>
       </w:r>
     </w:p>
     <w:p>
@@ -5052,6 +5298,7 @@
       <w:r>
         <w:rPr>
           <w:rFonts w:cs="Times New Roman"/>
+          <w:noProof/>
         </w:rPr>
         <w:lastRenderedPageBreak/>
         <w:drawing>
@@ -5162,9 +5409,9 @@
           <w:rFonts w:cs="Times New Roman"/>
         </w:rPr>
       </w:pPr>
-      <w:bookmarkStart w:id="10" w:name="execution-and-testing"/>
-      <w:bookmarkStart w:id="11" w:name="_Toc240463722"/>
-      <w:bookmarkEnd w:id="4"/>
+      <w:bookmarkStart w:id="10" w:name="_Toc240463722"/>
+      <w:bookmarkStart w:id="11" w:name="execution-and-testing"/>
+      <w:bookmarkEnd w:id="5"/>
       <w:r>
         <w:rPr>
           <w:rFonts w:cs="Times New Roman"/>
@@ -5183,7 +5430,7 @@
         </w:rPr>
         <w:t xml:space="preserve"> Execution and Testing</w:t>
       </w:r>
-      <w:bookmarkEnd w:id="11"/>
+      <w:bookmarkEnd w:id="10"/>
     </w:p>
     <w:p>
       <w:pPr>
@@ -5212,7 +5459,21 @@
         <w:rPr>
           <w:rFonts w:ascii="Times New Roman" w:hAnsi="Times New Roman" w:cs="Times New Roman"/>
         </w:rPr>
-        <w:t xml:space="preserve"> on a machine with a single CUDA GPU visible to PyTorch, for eight epochs with a batch size of 32 and a learning rate of 3e-4. The notebook is publicly available at </w:t>
+        <w:t xml:space="preserve"> on a machine with a single CUDA GPU visible to </w:t>
+      </w:r>
+      <w:proofErr w:type="spellStart"/>
+      <w:r>
+        <w:rPr>
+          <w:rFonts w:ascii="Times New Roman" w:hAnsi="Times New Roman" w:cs="Times New Roman"/>
+        </w:rPr>
+        <w:t>PyTorch</w:t>
+      </w:r>
+      <w:proofErr w:type="spellEnd"/>
+      <w:r>
+        <w:rPr>
+          <w:rFonts w:ascii="Times New Roman" w:hAnsi="Times New Roman" w:cs="Times New Roman"/>
+        </w:rPr>
+        <w:t xml:space="preserve">, for eight epochs with a batch size of 32 and a learning rate of 3e-4. The notebook is publicly available at </w:t>
       </w:r>
       <w:hyperlink r:id="rId17">
         <w:r>
@@ -5243,14 +5504,7 @@
         <w:rPr>
           <w:rFonts w:ascii="Times New Roman" w:hAnsi="Times New Roman" w:cs="Times New Roman"/>
         </w:rPr>
-        <w:t xml:space="preserve">A thermal safeguard paused training whenever the GPU reached 70°C and resumed at 45°C, a precaution for a local GPU running an extended period, which triggered repeatedly given the </w:t>
-      </w:r>
-      <w:r>
-        <w:rPr>
-          <w:rFonts w:ascii="Times New Roman" w:hAnsi="Times New Roman" w:cs="Times New Roman"/>
-        </w:rPr>
-        <w:lastRenderedPageBreak/>
-        <w:t>run's length. Total training time was 73.6 minutes, of which 48.5 were spent paused for cooldown, leaving roughly 25 minutes of active computation.</w:t>
+        <w:t>A thermal safeguard paused training whenever the GPU reached 70°C, resuming at 45°C, triggered repeatedly given the run's length. Total training time was 73.6 minutes, of which 48.5 were spent paused for cooldown, leaving roughly 25 minutes of active computation.</w:t>
       </w:r>
     </w:p>
     <w:p>
@@ -5266,6 +5520,7 @@
         <w:rPr>
           <w:rFonts w:ascii="Times New Roman" w:hAnsi="Times New Roman" w:cs="Times New Roman"/>
         </w:rPr>
+        <w:lastRenderedPageBreak/>
         <w:t>Table 1 summarises the final four training epochs, by which point the model, benefiting from ImageNet pretraining, was already converging.</w:t>
       </w:r>
     </w:p>
@@ -5317,11 +5572,11 @@
         <w:tblLook w:val="0020" w:firstRow="1" w:lastRow="0" w:firstColumn="0" w:lastColumn="0" w:noHBand="0" w:noVBand="0"/>
       </w:tblPr>
       <w:tblGrid>
-        <w:gridCol w:w="830"/>
-        <w:gridCol w:w="1170"/>
-        <w:gridCol w:w="1649"/>
-        <w:gridCol w:w="996"/>
-        <w:gridCol w:w="1476"/>
+        <w:gridCol w:w="727"/>
+        <w:gridCol w:w="1011"/>
+        <w:gridCol w:w="1410"/>
+        <w:gridCol w:w="866"/>
+        <w:gridCol w:w="1266"/>
       </w:tblGrid>
       <w:tr>
         <w:trPr>
@@ -6008,6 +6263,7 @@
       <w:r>
         <w:rPr>
           <w:rFonts w:ascii="Times New Roman" w:hAnsi="Times New Roman" w:cs="Times New Roman"/>
+          <w:noProof/>
         </w:rPr>
         <w:drawing>
           <wp:inline distT="0" distB="0" distL="0" distR="0" wp14:anchorId="3D92D08D" wp14:editId="44577C60">
@@ -6122,8 +6378,8 @@
       <w:r>
         <w:rPr>
           <w:rFonts w:ascii="Times New Roman" w:hAnsi="Times New Roman" w:cs="Times New Roman"/>
-        </w:rPr>
-        <w:lastRenderedPageBreak/>
+          <w:noProof/>
+        </w:rPr>
         <w:drawing>
           <wp:inline distT="0" distB="0" distL="0" distR="0" wp14:anchorId="6B4B4FD4" wp14:editId="1F1171C7">
             <wp:extent cx="5334000" cy="2748847"/>
@@ -6205,13 +6461,14 @@
           <w:rFonts w:cs="Times New Roman"/>
         </w:rPr>
       </w:pPr>
-      <w:bookmarkStart w:id="15" w:name="evaluation-and-reflection"/>
-      <w:bookmarkStart w:id="16" w:name="_Toc240463723"/>
-      <w:bookmarkEnd w:id="10"/>
-      <w:r>
-        <w:rPr>
-          <w:rFonts w:cs="Times New Roman"/>
-        </w:rPr>
+      <w:bookmarkStart w:id="15" w:name="_Toc240463723"/>
+      <w:bookmarkStart w:id="16" w:name="evaluation-and-reflection"/>
+      <w:bookmarkEnd w:id="11"/>
+      <w:r>
+        <w:rPr>
+          <w:rFonts w:cs="Times New Roman"/>
+        </w:rPr>
+        <w:lastRenderedPageBreak/>
         <w:t>3.</w:t>
       </w:r>
       <w:r>
@@ -6226,7 +6483,7 @@
         </w:rPr>
         <w:t xml:space="preserve"> Evaluation and Reflection</w:t>
       </w:r>
-      <w:bookmarkEnd w:id="16"/>
+      <w:bookmarkEnd w:id="15"/>
     </w:p>
     <w:p>
       <w:pPr>
@@ -6727,6 +6984,7 @@
       <w:r>
         <w:rPr>
           <w:rFonts w:ascii="Times New Roman" w:hAnsi="Times New Roman" w:cs="Times New Roman"/>
+          <w:noProof/>
         </w:rPr>
         <w:lastRenderedPageBreak/>
         <w:drawing>
@@ -6852,7 +7110,21 @@
         <w:rPr>
           <w:rFonts w:cs="Times New Roman"/>
         </w:rPr>
-        <w:t>Independently of these results, two design level limitations are identified. First, the aerial imaging conditions targeted here are simulated through augmentation of ground level, close range photographs rather than genuine drone imagery. This is a reasonable proxy where aerial training data is unavailable, but it does not reproduce every characteristic of true UAV imagery, such as the relationship between altitude and object scale; UAV specific datasets referenced in reviews of AI enabled UAV systems (arXiv, 2023) and recent drone-based work (Manoj et al., 2025) offer a more direct path to closing this gap.</w:t>
+        <w:t>Independently of these results, two design level limitations are identified. First, the aerial imaging conditions targeted here are simulated through augmentation of ground level, close range photographs rather than genuine drone imagery. This is a reasonable proxy where aerial training data is unavailable, but it does not reproduce every characteristic of true UAV imagery, such as the relationship between altitude and object scale; UAV specific datasets referenced in reviews of AI enabled UAV systems (</w:t>
+      </w:r>
+      <w:proofErr w:type="spellStart"/>
+      <w:r>
+        <w:rPr>
+          <w:rFonts w:cs="Times New Roman"/>
+        </w:rPr>
+        <w:t>arXiv</w:t>
+      </w:r>
+      <w:proofErr w:type="spellEnd"/>
+      <w:r>
+        <w:rPr>
+          <w:rFonts w:cs="Times New Roman"/>
+        </w:rPr>
+        <w:t>, 2023) and recent drone-based work (Manoj et al., 2025) offer a more direct path to closing this gap.</w:t>
       </w:r>
     </w:p>
     <w:p>
@@ -6868,10 +7140,24 @@
         <w:rPr>
           <w:rFonts w:cs="Times New Roman"/>
         </w:rPr>
-        <w:t>Second, class imbalance in PlantVillage means that, without intervention such as class weighted loss, the classifier risks weaker performance on rarer disease categories, where correct detection matters most. The parameter count achieved supports the goal of onboard, low power inference. A realistic path to field deployment would require converting the model to a runtime format such as TensorFlow Lite or ONNX, integrating GPS metadata to map detections onto the field, and validating against genuine UAV imagery.</w:t>
-      </w:r>
-    </w:p>
-    <w:bookmarkEnd w:id="15"/>
+        <w:t xml:space="preserve">Second, class imbalance in </w:t>
+      </w:r>
+      <w:proofErr w:type="spellStart"/>
+      <w:r>
+        <w:rPr>
+          <w:rFonts w:cs="Times New Roman"/>
+        </w:rPr>
+        <w:t>PlantVillage</w:t>
+      </w:r>
+      <w:proofErr w:type="spellEnd"/>
+      <w:r>
+        <w:rPr>
+          <w:rFonts w:cs="Times New Roman"/>
+        </w:rPr>
+        <w:t xml:space="preserve"> means that, without intervention such as class weighted loss, the classifier risks weaker performance on rarer disease categories, where correct detection matters most. The parameter count achieved supports the goal of onboard, low power inference. A realistic path to field deployment would require converting the model to a runtime format such as TensorFlow Lite or ONNX, integrating GPS metadata to map detections onto the field, and validating against genuine UAV imagery.</w:t>
+      </w:r>
+    </w:p>
+    <w:bookmarkEnd w:id="16"/>
     <w:p>
       <w:pPr>
         <w:pStyle w:val="BodyText"/>
@@ -6916,15 +7202,15 @@
           <w:rFonts w:cs="Times New Roman"/>
         </w:rPr>
       </w:pPr>
-      <w:bookmarkStart w:id="20" w:name="project-definition-1"/>
-      <w:bookmarkStart w:id="21" w:name="_Toc240463725"/>
+      <w:bookmarkStart w:id="20" w:name="_Toc240463725"/>
+      <w:bookmarkStart w:id="21" w:name="project-definition-1"/>
       <w:r>
         <w:rPr>
           <w:rFonts w:cs="Times New Roman"/>
         </w:rPr>
         <w:t>4.1 Project Definition</w:t>
       </w:r>
-      <w:bookmarkEnd w:id="21"/>
+      <w:bookmarkEnd w:id="20"/>
     </w:p>
     <w:p>
       <w:pPr>
@@ -6939,7 +7225,21 @@
         <w:rPr>
           <w:rFonts w:ascii="Times New Roman" w:hAnsi="Times New Roman" w:cs="Times New Roman"/>
         </w:rPr>
-        <w:t>Task 2 addresses vision guided navigation for a simulated TurtleBot3 mobile robot, run within TheConstruct.ai's ROS 2 Gazebo environment (TheConstruct.ai, 2024). The objective is for the robot to detect a coloured marker using its onboard RGB camera and navigate toward it using simple, interpretable vision-based rules rather than a learned control policy.</w:t>
+        <w:t xml:space="preserve">Task 2 addresses vision guided navigation for a simulated TurtleBot3 mobile robot, run within </w:t>
+      </w:r>
+      <w:proofErr w:type="spellStart"/>
+      <w:r>
+        <w:rPr>
+          <w:rFonts w:ascii="Times New Roman" w:hAnsi="Times New Roman" w:cs="Times New Roman"/>
+        </w:rPr>
+        <w:t>TheConstruct.ai's</w:t>
+      </w:r>
+      <w:proofErr w:type="spellEnd"/>
+      <w:r>
+        <w:rPr>
+          <w:rFonts w:ascii="Times New Roman" w:hAnsi="Times New Roman" w:cs="Times New Roman"/>
+        </w:rPr>
+        <w:t xml:space="preserve"> ROS 2 Gazebo environment (TheConstruct.ai, 2024). The objective is for the robot to detect a coloured marker using its onboard RGB camera and navigate toward it using simple, interpretable vision-based rules rather than a learned control policy.</w:t>
       </w:r>
     </w:p>
     <w:p>
@@ -6954,7 +7254,49 @@
         <w:rPr>
           <w:rFonts w:cs="Times New Roman"/>
         </w:rPr>
-        <w:t>Development and testing were carried out on TheConstruct.ai's browser based ROSject platform, inside ROSject vVGb1L3fxD (URL identifier 1049584), workspace ros2_ws. The free tier does not issue a permanent shareable URL; the project was instead made public under its title, vVGb1L3fxD, in the platform's public index, satisfying the brief's accessibility requirement. Figure 7 shows this workspace, including the turtlebot3_vision_nav package structure and a terminal session used to query the running nodes.</w:t>
+        <w:t xml:space="preserve">Development and testing were carried out on </w:t>
+      </w:r>
+      <w:proofErr w:type="spellStart"/>
+      <w:r>
+        <w:rPr>
+          <w:rFonts w:cs="Times New Roman"/>
+        </w:rPr>
+        <w:t>TheConstruct.ai's</w:t>
+      </w:r>
+      <w:proofErr w:type="spellEnd"/>
+      <w:r>
+        <w:rPr>
+          <w:rFonts w:cs="Times New Roman"/>
+        </w:rPr>
+        <w:t xml:space="preserve"> browser based </w:t>
+      </w:r>
+      <w:proofErr w:type="spellStart"/>
+      <w:r>
+        <w:rPr>
+          <w:rFonts w:cs="Times New Roman"/>
+        </w:rPr>
+        <w:t>ROSject</w:t>
+      </w:r>
+      <w:proofErr w:type="spellEnd"/>
+      <w:r>
+        <w:rPr>
+          <w:rFonts w:cs="Times New Roman"/>
+        </w:rPr>
+        <w:t xml:space="preserve"> platform, inside </w:t>
+      </w:r>
+      <w:proofErr w:type="spellStart"/>
+      <w:r>
+        <w:rPr>
+          <w:rFonts w:cs="Times New Roman"/>
+        </w:rPr>
+        <w:t>ROSject</w:t>
+      </w:r>
+      <w:proofErr w:type="spellEnd"/>
+      <w:r>
+        <w:rPr>
+          <w:rFonts w:cs="Times New Roman"/>
+        </w:rPr>
+        <w:t xml:space="preserve"> vVGb1L3fxD (URL identifier 1049584), workspace ros2_ws. The free tier does not issue a permanent shareable URL; the project was instead made public under its title, vVGb1L3fxD, in the platform's public index, satisfying the brief's accessibility requirement. Figure 7 shows this workspace, including the turtlebot3_vision_nav package structure and a terminal session used to query the running nodes.</w:t>
       </w:r>
     </w:p>
     <w:p>
@@ -6969,6 +7311,7 @@
       <w:r>
         <w:rPr>
           <w:rFonts w:ascii="Times New Roman" w:hAnsi="Times New Roman" w:cs="Times New Roman"/>
+          <w:noProof/>
         </w:rPr>
         <w:drawing>
           <wp:inline distT="0" distB="0" distL="0" distR="0" wp14:anchorId="459E8BAC" wp14:editId="298F1C42">
@@ -7040,7 +7383,47 @@
         <w:fldChar w:fldCharType="end"/>
       </w:r>
       <w:r>
-        <w:t>: TheConstruct.ai ROSject workspace (rosject 1049584), showing the turtlebot3_vision_nav package files and a terminal session used to inspect /cmd_vel, /target_offset and /target_visible directly with ros2 topic echo.</w:t>
+        <w:t xml:space="preserve">: TheConstruct.ai </w:t>
+      </w:r>
+      <w:proofErr w:type="spellStart"/>
+      <w:r>
+        <w:t>ROSject</w:t>
+      </w:r>
+      <w:proofErr w:type="spellEnd"/>
+      <w:r>
+        <w:t xml:space="preserve"> workspace (</w:t>
+      </w:r>
+      <w:proofErr w:type="spellStart"/>
+      <w:r>
+        <w:t>rosject</w:t>
+      </w:r>
+      <w:proofErr w:type="spellEnd"/>
+      <w:r>
+        <w:t xml:space="preserve"> 1049584), showing the turtlebot3_vision_nav package files and a terminal session used to inspect /</w:t>
+      </w:r>
+      <w:proofErr w:type="spellStart"/>
+      <w:r>
+        <w:t>cmd_vel</w:t>
+      </w:r>
+      <w:proofErr w:type="spellEnd"/>
+      <w:r>
+        <w:t>, /</w:t>
+      </w:r>
+      <w:proofErr w:type="spellStart"/>
+      <w:r>
+        <w:t>target_offset</w:t>
+      </w:r>
+      <w:proofErr w:type="spellEnd"/>
+      <w:r>
+        <w:t xml:space="preserve"> and /</w:t>
+      </w:r>
+      <w:proofErr w:type="spellStart"/>
+      <w:r>
+        <w:t>target_visible</w:t>
+      </w:r>
+      <w:proofErr w:type="spellEnd"/>
+      <w:r>
+        <w:t xml:space="preserve"> directly with ros2 topic echo.</w:t>
       </w:r>
       <w:bookmarkEnd w:id="22"/>
     </w:p>
@@ -7081,6 +7464,7 @@
         </w:rPr>
         <w:t xml:space="preserve"> provided with the TurtleBot3 packages, run in Gazebo Sim with the </w:t>
       </w:r>
+      <w:proofErr w:type="spellStart"/>
       <w:r>
         <w:rPr>
           <w:rStyle w:val="VerbatimChar"/>
@@ -7088,6 +7472,7 @@
         </w:rPr>
         <w:t>waffle_pi</w:t>
       </w:r>
+      <w:proofErr w:type="spellEnd"/>
       <w:r>
         <w:rPr>
           <w:rFonts w:cs="Times New Roman"/>
@@ -7107,6 +7492,7 @@
       <w:r>
         <w:rPr>
           <w:rFonts w:ascii="Times New Roman" w:hAnsi="Times New Roman" w:cs="Times New Roman"/>
+          <w:noProof/>
         </w:rPr>
         <w:drawing>
           <wp:inline distT="0" distB="0" distL="0" distR="0" wp14:anchorId="1E68EB6C" wp14:editId="3A1C53B2">
@@ -7178,7 +7564,15 @@
         <w:fldChar w:fldCharType="end"/>
       </w:r>
       <w:r>
-        <w:t>: The waffle_pi TurtleBot3 spawned in turtlebot3_world, showing the entity tree and simulation configuration.</w:t>
+        <w:t xml:space="preserve">: The </w:t>
+      </w:r>
+      <w:proofErr w:type="spellStart"/>
+      <w:r>
+        <w:t>waffle_pi</w:t>
+      </w:r>
+      <w:proofErr w:type="spellEnd"/>
+      <w:r>
+        <w:t xml:space="preserve"> TurtleBot3 spawned in turtlebot3_world, showing the entity tree and simulation configuration.</w:t>
       </w:r>
       <w:bookmarkEnd w:id="23"/>
     </w:p>
@@ -7194,6 +7588,7 @@
       <w:r>
         <w:rPr>
           <w:rFonts w:ascii="Times New Roman" w:hAnsi="Times New Roman" w:cs="Times New Roman"/>
+          <w:noProof/>
         </w:rPr>
         <w:lastRenderedPageBreak/>
         <w:drawing>
@@ -7277,16 +7672,16 @@
           <w:rFonts w:cs="Times New Roman"/>
         </w:rPr>
       </w:pPr>
-      <w:bookmarkStart w:id="25" w:name="design-and-implementation-1"/>
-      <w:bookmarkStart w:id="26" w:name="_Toc240463726"/>
-      <w:bookmarkEnd w:id="20"/>
+      <w:bookmarkStart w:id="25" w:name="_Toc240463726"/>
+      <w:bookmarkStart w:id="26" w:name="design-and-implementation-1"/>
+      <w:bookmarkEnd w:id="21"/>
       <w:r>
         <w:rPr>
           <w:rFonts w:cs="Times New Roman"/>
         </w:rPr>
         <w:t>4.2 Design and Implementation</w:t>
       </w:r>
-      <w:bookmarkEnd w:id="26"/>
+      <w:bookmarkEnd w:id="25"/>
     </w:p>
     <w:p>
       <w:pPr>
@@ -7317,6 +7712,7 @@
       <w:r>
         <w:rPr>
           <w:rFonts w:ascii="Times New Roman" w:hAnsi="Times New Roman" w:cs="Times New Roman"/>
+          <w:noProof/>
         </w:rPr>
         <w:lastRenderedPageBreak/>
         <w:drawing>
@@ -7415,7 +7811,35 @@
         <w:rPr>
           <w:rFonts w:cs="Times New Roman"/>
         </w:rPr>
-        <w:t>The perception logic, in the node vision_detector, converts each camera frame to HSV colour space, since HSV separates colour from brightness and is more robust to lighting variation than RGB thresholding. A binary mask isolating the target colour range is cleaned using morphological opening and closing, and the largest resulting contour, above a minimum area threshold, is taken as the detected marker. Its centroid's horizontal offset from the frame's vertical centre is normalised to minus one to one and published with a boolean visibility flag.</w:t>
+        <w:t xml:space="preserve">The perception logic, in the node </w:t>
+      </w:r>
+      <w:proofErr w:type="spellStart"/>
+      <w:r>
+        <w:rPr>
+          <w:rFonts w:cs="Times New Roman"/>
+        </w:rPr>
+        <w:t>vision_detector</w:t>
+      </w:r>
+      <w:proofErr w:type="spellEnd"/>
+      <w:r>
+        <w:rPr>
+          <w:rFonts w:cs="Times New Roman"/>
+        </w:rPr>
+        <w:t xml:space="preserve">, converts each camera frame to HSV colour space, since HSV separates colour from brightness and is more robust to lighting variation than RGB thresholding. A binary mask isolating the target colour range is cleaned using morphological opening and closing, and the largest resulting contour, above a minimum area threshold, is taken as the detected marker. Its centroid's horizontal offset from the frame's vertical centre is normalised to minus one to one and published with a </w:t>
+      </w:r>
+      <w:proofErr w:type="spellStart"/>
+      <w:r>
+        <w:rPr>
+          <w:rFonts w:cs="Times New Roman"/>
+        </w:rPr>
+        <w:t>boolean</w:t>
+      </w:r>
+      <w:proofErr w:type="spellEnd"/>
+      <w:r>
+        <w:rPr>
+          <w:rFonts w:cs="Times New Roman"/>
+        </w:rPr>
+        <w:t xml:space="preserve"> visibility flag.</w:t>
       </w:r>
     </w:p>
     <w:p>
@@ -7430,7 +7854,21 @@
         <w:rPr>
           <w:rFonts w:cs="Times New Roman"/>
         </w:rPr>
-        <w:t>The navigation logic, in the node navigation_controller, subscribes to both signals and implements the rule-based control. If no marker is visible, the robot rotates slowly to search. If visible and its offset exceeds a centring threshold, it rotates toward the marker, turn rate scaled to the offset and clamped to a maximum angular velocity. If visible and centred, it drives forward at a fixed, capped speed. Velocity commands publish at roughly ten hertz.</w:t>
+        <w:t xml:space="preserve">The navigation logic, in the node </w:t>
+      </w:r>
+      <w:proofErr w:type="spellStart"/>
+      <w:r>
+        <w:rPr>
+          <w:rFonts w:cs="Times New Roman"/>
+        </w:rPr>
+        <w:t>navigation_controller</w:t>
+      </w:r>
+      <w:proofErr w:type="spellEnd"/>
+      <w:r>
+        <w:rPr>
+          <w:rFonts w:cs="Times New Roman"/>
+        </w:rPr>
+        <w:t>, subscribes to both signals and implements the rule-based control. If no marker is visible, the robot rotates slowly to search. If visible and its offset exceeds a centring threshold, it rotates toward the marker, turn rate scaled to the offset and clamped to a maximum angular velocity. If visible and centred, it drives forward at a fixed, capped speed. Velocity commands publish at roughly ten hertz.</w:t>
       </w:r>
     </w:p>
     <w:p>
@@ -7440,16 +7878,16 @@
           <w:rFonts w:cs="Times New Roman"/>
         </w:rPr>
       </w:pPr>
-      <w:bookmarkStart w:id="28" w:name="execution-and-testing-1"/>
-      <w:bookmarkStart w:id="29" w:name="_Toc240463727"/>
-      <w:bookmarkEnd w:id="25"/>
+      <w:bookmarkStart w:id="28" w:name="_Toc240463727"/>
+      <w:bookmarkStart w:id="29" w:name="execution-and-testing-1"/>
+      <w:bookmarkEnd w:id="26"/>
       <w:r>
         <w:rPr>
           <w:rFonts w:cs="Times New Roman"/>
         </w:rPr>
         <w:t>4.3 Execution and Testing</w:t>
       </w:r>
-      <w:bookmarkEnd w:id="29"/>
+      <w:bookmarkEnd w:id="28"/>
     </w:p>
     <w:p>
       <w:pPr>
@@ -7464,7 +7902,21 @@
         <w:rPr>
           <w:rFonts w:ascii="Times New Roman" w:hAnsi="Times New Roman" w:cs="Times New Roman"/>
         </w:rPr>
-        <w:t>Testing proceeded in two stages: perception and control logic was first verified offline against seven synthetic test frames covering the scenarios the brief recommends, shown in Figure 11, then the same nodes were launched inside the ROSject and queried directly against the live simulation using ros2 topic echo.</w:t>
+        <w:t xml:space="preserve">Testing proceeded in two stages: perception and control logic was first verified offline against seven synthetic test frames covering the scenarios the brief recommends, shown in Figure 11, then the same nodes were launched inside the </w:t>
+      </w:r>
+      <w:proofErr w:type="spellStart"/>
+      <w:r>
+        <w:rPr>
+          <w:rFonts w:ascii="Times New Roman" w:hAnsi="Times New Roman" w:cs="Times New Roman"/>
+        </w:rPr>
+        <w:t>ROSject</w:t>
+      </w:r>
+      <w:proofErr w:type="spellEnd"/>
+      <w:r>
+        <w:rPr>
+          <w:rFonts w:ascii="Times New Roman" w:hAnsi="Times New Roman" w:cs="Times New Roman"/>
+        </w:rPr>
+        <w:t xml:space="preserve"> and queried directly against the live simulation using ros2 topic echo.</w:t>
       </w:r>
     </w:p>
     <w:p>
@@ -7479,6 +7931,7 @@
       <w:r>
         <w:rPr>
           <w:rFonts w:ascii="Times New Roman" w:hAnsi="Times New Roman" w:cs="Times New Roman"/>
+          <w:noProof/>
         </w:rPr>
         <w:lastRenderedPageBreak/>
         <w:drawing>
@@ -7599,12 +8052,12 @@
         <w:tblLook w:val="0020" w:firstRow="1" w:lastRow="0" w:firstColumn="0" w:lastColumn="0" w:noHBand="0" w:noVBand="0"/>
       </w:tblPr>
       <w:tblGrid>
-        <w:gridCol w:w="2047"/>
-        <w:gridCol w:w="816"/>
-        <w:gridCol w:w="910"/>
-        <w:gridCol w:w="984"/>
-        <w:gridCol w:w="1142"/>
-        <w:gridCol w:w="3097"/>
+        <w:gridCol w:w="2095"/>
+        <w:gridCol w:w="716"/>
+        <w:gridCol w:w="794"/>
+        <w:gridCol w:w="956"/>
+        <w:gridCol w:w="1101"/>
+        <w:gridCol w:w="3334"/>
       </w:tblGrid>
       <w:tr>
         <w:trPr>
@@ -7712,11 +8165,19 @@
                 <w:rFonts w:ascii="Times New Roman" w:hAnsi="Times New Roman" w:cs="Times New Roman"/>
               </w:rPr>
             </w:pPr>
-            <w:r>
-              <w:rPr>
-                <w:rFonts w:ascii="Times New Roman" w:hAnsi="Times New Roman" w:cs="Times New Roman"/>
-              </w:rPr>
-              <w:t>lin_x (m/s)</w:t>
+            <w:proofErr w:type="spellStart"/>
+            <w:r>
+              <w:rPr>
+                <w:rFonts w:ascii="Times New Roman" w:hAnsi="Times New Roman" w:cs="Times New Roman"/>
+              </w:rPr>
+              <w:t>lin_x</w:t>
+            </w:r>
+            <w:proofErr w:type="spellEnd"/>
+            <w:r>
+              <w:rPr>
+                <w:rFonts w:ascii="Times New Roman" w:hAnsi="Times New Roman" w:cs="Times New Roman"/>
+              </w:rPr>
+              <w:t xml:space="preserve"> (m/s)</w:t>
             </w:r>
           </w:p>
         </w:tc>
@@ -7739,11 +8200,19 @@
                 <w:rFonts w:ascii="Times New Roman" w:hAnsi="Times New Roman" w:cs="Times New Roman"/>
               </w:rPr>
             </w:pPr>
-            <w:r>
-              <w:rPr>
-                <w:rFonts w:ascii="Times New Roman" w:hAnsi="Times New Roman" w:cs="Times New Roman"/>
-              </w:rPr>
-              <w:t>ang_z (rad/s)</w:t>
+            <w:proofErr w:type="spellStart"/>
+            <w:r>
+              <w:rPr>
+                <w:rFonts w:ascii="Times New Roman" w:hAnsi="Times New Roman" w:cs="Times New Roman"/>
+              </w:rPr>
+              <w:t>ang_z</w:t>
+            </w:r>
+            <w:proofErr w:type="spellEnd"/>
+            <w:r>
+              <w:rPr>
+                <w:rFonts w:ascii="Times New Roman" w:hAnsi="Times New Roman" w:cs="Times New Roman"/>
+              </w:rPr>
+              <w:t xml:space="preserve"> (rad/s)</w:t>
             </w:r>
           </w:p>
         </w:tc>
@@ -8919,7 +9388,21 @@
           <w:rFonts w:cs="Times New Roman"/>
         </w:rPr>
         <w:lastRenderedPageBreak/>
-        <w:t>Following this offline verification, the same nodes were launched inside the ROSject and queried directly while a marker was visible to the simulated camera, giving a genuine closed loop result rather than a synthetic prediction. Table 4 reports the values obtained.</w:t>
+        <w:t xml:space="preserve">Following this offline verification, the same nodes were launched inside the </w:t>
+      </w:r>
+      <w:proofErr w:type="spellStart"/>
+      <w:r>
+        <w:rPr>
+          <w:rFonts w:cs="Times New Roman"/>
+        </w:rPr>
+        <w:t>ROSject</w:t>
+      </w:r>
+      <w:proofErr w:type="spellEnd"/>
+      <w:r>
+        <w:rPr>
+          <w:rFonts w:cs="Times New Roman"/>
+        </w:rPr>
+        <w:t xml:space="preserve"> and queried directly while a marker was visible to the simulated camera, giving a genuine closed loop result rather than a synthetic prediction. Table 4 reports the values obtained.</w:t>
       </w:r>
     </w:p>
     <w:p>
@@ -8950,7 +9433,15 @@
         <w:fldChar w:fldCharType="end"/>
       </w:r>
       <w:r>
-        <w:t xml:space="preserve">: Live ROSject verification (ros2 topic echo, single query each, shown in Figure </w:t>
+        <w:t xml:space="preserve">: Live </w:t>
+      </w:r>
+      <w:proofErr w:type="spellStart"/>
+      <w:r>
+        <w:t>ROSject</w:t>
+      </w:r>
+      <w:proofErr w:type="spellEnd"/>
+      <w:r>
+        <w:t xml:space="preserve"> verification (ros2 topic echo, single query each, shown in Figure </w:t>
       </w:r>
       <w:r>
         <w:t>7</w:t>
@@ -8968,7 +9459,7 @@
         <w:tblLook w:val="0020" w:firstRow="1" w:lastRow="0" w:firstColumn="0" w:lastColumn="0" w:noHBand="0" w:noVBand="0"/>
       </w:tblPr>
       <w:tblGrid>
-        <w:gridCol w:w="1981"/>
+        <w:gridCol w:w="1824"/>
         <w:gridCol w:w="2251"/>
       </w:tblGrid>
       <w:tr>
@@ -9059,8 +9550,17 @@
                 <w:rStyle w:val="VerbatimChar"/>
                 <w:rFonts w:ascii="Times New Roman" w:hAnsi="Times New Roman" w:cs="Times New Roman"/>
               </w:rPr>
-              <w:t>/target_visible</w:t>
-            </w:r>
+              <w:t>/</w:t>
+            </w:r>
+            <w:proofErr w:type="spellStart"/>
+            <w:r>
+              <w:rPr>
+                <w:rStyle w:val="VerbatimChar"/>
+                <w:rFonts w:ascii="Times New Roman" w:hAnsi="Times New Roman" w:cs="Times New Roman"/>
+              </w:rPr>
+              <w:t>target_visible</w:t>
+            </w:r>
+            <w:proofErr w:type="spellEnd"/>
           </w:p>
         </w:tc>
         <w:tc>
@@ -9117,8 +9617,17 @@
                 <w:rStyle w:val="VerbatimChar"/>
                 <w:rFonts w:ascii="Times New Roman" w:hAnsi="Times New Roman" w:cs="Times New Roman"/>
               </w:rPr>
-              <w:t>/target_offset</w:t>
-            </w:r>
+              <w:t>/</w:t>
+            </w:r>
+            <w:proofErr w:type="spellStart"/>
+            <w:r>
+              <w:rPr>
+                <w:rStyle w:val="VerbatimChar"/>
+                <w:rFonts w:ascii="Times New Roman" w:hAnsi="Times New Roman" w:cs="Times New Roman"/>
+              </w:rPr>
+              <w:t>target_offset</w:t>
+            </w:r>
+            <w:proofErr w:type="spellEnd"/>
           </w:p>
         </w:tc>
         <w:tc>
@@ -9174,14 +9683,31 @@
                 <w:rStyle w:val="VerbatimChar"/>
                 <w:rFonts w:ascii="Times New Roman" w:hAnsi="Times New Roman" w:cs="Times New Roman"/>
               </w:rPr>
-              <w:t>/cmd_vel</w:t>
-            </w:r>
-            <w:r>
-              <w:rPr>
-                <w:rFonts w:ascii="Times New Roman" w:hAnsi="Times New Roman" w:cs="Times New Roman"/>
-              </w:rPr>
-              <w:t xml:space="preserve"> linear.x</w:t>
-            </w:r>
+              <w:t>/</w:t>
+            </w:r>
+            <w:proofErr w:type="spellStart"/>
+            <w:r>
+              <w:rPr>
+                <w:rStyle w:val="VerbatimChar"/>
+                <w:rFonts w:ascii="Times New Roman" w:hAnsi="Times New Roman" w:cs="Times New Roman"/>
+              </w:rPr>
+              <w:t>cmd_vel</w:t>
+            </w:r>
+            <w:proofErr w:type="spellEnd"/>
+            <w:r>
+              <w:rPr>
+                <w:rFonts w:ascii="Times New Roman" w:hAnsi="Times New Roman" w:cs="Times New Roman"/>
+              </w:rPr>
+              <w:t xml:space="preserve"> </w:t>
+            </w:r>
+            <w:proofErr w:type="spellStart"/>
+            <w:r>
+              <w:rPr>
+                <w:rFonts w:ascii="Times New Roman" w:hAnsi="Times New Roman" w:cs="Times New Roman"/>
+              </w:rPr>
+              <w:t>linear.x</w:t>
+            </w:r>
+            <w:proofErr w:type="spellEnd"/>
           </w:p>
         </w:tc>
         <w:tc>
@@ -9238,14 +9764,31 @@
                 <w:rStyle w:val="VerbatimChar"/>
                 <w:rFonts w:ascii="Times New Roman" w:hAnsi="Times New Roman" w:cs="Times New Roman"/>
               </w:rPr>
-              <w:t>/cmd_vel</w:t>
-            </w:r>
-            <w:r>
-              <w:rPr>
-                <w:rFonts w:ascii="Times New Roman" w:hAnsi="Times New Roman" w:cs="Times New Roman"/>
-              </w:rPr>
-              <w:t xml:space="preserve"> angular.z</w:t>
-            </w:r>
+              <w:t>/</w:t>
+            </w:r>
+            <w:proofErr w:type="spellStart"/>
+            <w:r>
+              <w:rPr>
+                <w:rStyle w:val="VerbatimChar"/>
+                <w:rFonts w:ascii="Times New Roman" w:hAnsi="Times New Roman" w:cs="Times New Roman"/>
+              </w:rPr>
+              <w:t>cmd_vel</w:t>
+            </w:r>
+            <w:proofErr w:type="spellEnd"/>
+            <w:r>
+              <w:rPr>
+                <w:rFonts w:ascii="Times New Roman" w:hAnsi="Times New Roman" w:cs="Times New Roman"/>
+              </w:rPr>
+              <w:t xml:space="preserve"> </w:t>
+            </w:r>
+            <w:proofErr w:type="spellStart"/>
+            <w:r>
+              <w:rPr>
+                <w:rFonts w:ascii="Times New Roman" w:hAnsi="Times New Roman" w:cs="Times New Roman"/>
+              </w:rPr>
+              <w:t>angular.z</w:t>
+            </w:r>
+            <w:proofErr w:type="spellEnd"/>
           </w:p>
         </w:tc>
         <w:tc>
@@ -9290,7 +9833,63 @@
         <w:rPr>
           <w:rFonts w:cs="Times New Roman"/>
         </w:rPr>
-        <w:t>This is consistent with the proportional law verified offline: the maximum angular velocity, 0.60 rad/s, is reached at the maximum test offset, 0.75, giving a gain of 0.8 rad/s per unit offset. Applying this to the live offset of -0.4618 gives 0.3694 rad/s, matching the live /cmd_vel value of 0.36944 rad/s to five decimal places. The negative offset correctly produced a positive angular.z (a left turn), and linear.x remained zero since the offset exceeded the centring threshold, closing the loop between offline verification and genuine ROSject behaviour.</w:t>
+        <w:t>This is consistent with the proportional law verified offline: the maximum angular velocity, 0.60 rad/s, is reached at the maximum test offset, 0.75, giving a gain of 0.8 rad/s per unit offset. Applying this to the live offset of -0.4618 gives 0.3694 rad/s, matching the live /</w:t>
+      </w:r>
+      <w:proofErr w:type="spellStart"/>
+      <w:r>
+        <w:rPr>
+          <w:rFonts w:cs="Times New Roman"/>
+        </w:rPr>
+        <w:t>cmd_vel</w:t>
+      </w:r>
+      <w:proofErr w:type="spellEnd"/>
+      <w:r>
+        <w:rPr>
+          <w:rFonts w:cs="Times New Roman"/>
+        </w:rPr>
+        <w:t xml:space="preserve"> value of 0.36944 rad/s to five decimal places. The negative offset correctly produced a positive </w:t>
+      </w:r>
+      <w:proofErr w:type="spellStart"/>
+      <w:r>
+        <w:rPr>
+          <w:rFonts w:cs="Times New Roman"/>
+        </w:rPr>
+        <w:t>angular.z</w:t>
+      </w:r>
+      <w:proofErr w:type="spellEnd"/>
+      <w:r>
+        <w:rPr>
+          <w:rFonts w:cs="Times New Roman"/>
+        </w:rPr>
+        <w:t xml:space="preserve"> (a left turn), and </w:t>
+      </w:r>
+      <w:proofErr w:type="spellStart"/>
+      <w:r>
+        <w:rPr>
+          <w:rFonts w:cs="Times New Roman"/>
+        </w:rPr>
+        <w:t>linear.x</w:t>
+      </w:r>
+      <w:proofErr w:type="spellEnd"/>
+      <w:r>
+        <w:rPr>
+          <w:rFonts w:cs="Times New Roman"/>
+        </w:rPr>
+        <w:t xml:space="preserve"> remained zero since the offset exceeded the centring threshold, closing the loop between offline verification and genuine </w:t>
+      </w:r>
+      <w:proofErr w:type="spellStart"/>
+      <w:r>
+        <w:rPr>
+          <w:rFonts w:cs="Times New Roman"/>
+        </w:rPr>
+        <w:t>ROSject</w:t>
+      </w:r>
+      <w:proofErr w:type="spellEnd"/>
+      <w:r>
+        <w:rPr>
+          <w:rFonts w:cs="Times New Roman"/>
+        </w:rPr>
+        <w:t xml:space="preserve"> behaviour.</w:t>
       </w:r>
     </w:p>
     <w:p>
@@ -9300,16 +9899,16 @@
           <w:rFonts w:cs="Times New Roman"/>
         </w:rPr>
       </w:pPr>
-      <w:bookmarkStart w:id="33" w:name="evaluation-and-reflection-1"/>
-      <w:bookmarkStart w:id="34" w:name="_Toc240463728"/>
-      <w:bookmarkEnd w:id="28"/>
+      <w:bookmarkStart w:id="33" w:name="_Toc240463728"/>
+      <w:bookmarkStart w:id="34" w:name="evaluation-and-reflection-1"/>
+      <w:bookmarkEnd w:id="29"/>
       <w:r>
         <w:rPr>
           <w:rFonts w:cs="Times New Roman"/>
         </w:rPr>
         <w:t>4.4 Evaluation and Reflection</w:t>
       </w:r>
-      <w:bookmarkEnd w:id="34"/>
+      <w:bookmarkEnd w:id="33"/>
     </w:p>
     <w:p>
       <w:pPr>
@@ -9348,22 +9947,24 @@
         <w:spacing w:before="240" w:after="0" w:line="360" w:lineRule="auto"/>
         <w:rPr>
           <w:rFonts w:cs="Times New Roman"/>
-          <w:lang w:val="en-US"/>
-        </w:rPr>
-      </w:pPr>
-      <w:r>
-        <w:rPr>
-          <w:rFonts w:cs="Times New Roman"/>
-        </w:rPr>
-        <w:t xml:space="preserve">The offline verification in Section 4.3, together with the live ros2 topic echo query in Table 4, demonstrate that the perception and control algorithms behave correctly both in isolation and once deployed, including correctly rejecting a distractor and applying the exact proportional gain used in the controller. A single live query does not exercise every offline scenario, such as the distractor or no-marker cases, inside the simulation itself; extending live testing to the full </w:t>
-      </w:r>
-      <w:r>
-        <w:rPr>
-          <w:rFonts w:cs="Times New Roman"/>
-        </w:rPr>
-        <w:lastRenderedPageBreak/>
-        <w:t>scenario set remains a direction for further work, but the live case obtained provides direct evidence that the deployed system matches its intended design.</w:t>
-      </w:r>
+        </w:rPr>
+      </w:pPr>
+      <w:bookmarkStart w:id="35" w:name="combined-evaluation-and-reflection"/>
+      <w:bookmarkEnd w:id="34"/>
+      <w:r>
+        <w:rPr>
+          <w:rFonts w:cs="Times New Roman"/>
+        </w:rPr>
+        <w:t xml:space="preserve">Together, the offline and live verification confirm that the perception and control algorithms behave correctly both in isolation and once deployed, including correctly rejecting the distractor and matching the controller's exact proportional gain. A full live sweep of every offline scenario remains a direction for a longer testing </w:t>
+      </w:r>
+      <w:proofErr w:type="spellStart"/>
+      <w:r>
+        <w:rPr>
+          <w:rFonts w:cs="Times New Roman"/>
+        </w:rPr>
+        <w:t>session.</w:t>
+      </w:r>
+      <w:proofErr w:type="spellEnd"/>
     </w:p>
     <w:p>
       <w:pPr>
@@ -9373,12 +9974,11 @@
           <w:rFonts w:cs="Times New Roman"/>
         </w:rPr>
       </w:pPr>
-      <w:bookmarkStart w:id="35" w:name="combined-evaluation-and-reflection"/>
-      <w:bookmarkEnd w:id="33"/>
-      <w:r>
-        <w:rPr>
-          <w:rFonts w:cs="Times New Roman"/>
-        </w:rPr>
+      <w:r>
+        <w:rPr>
+          <w:rFonts w:cs="Times New Roman"/>
+        </w:rPr>
+        <w:lastRenderedPageBreak/>
         <w:t>Mapping this design to real world mobile robotics, colour based marker following is a reasonable starting point for constrained indoor navigation where markers can be deliberately placed and coloured, but production systems for less controlled environments increasingly combine this kind of lightweight visual cue with learned object detection and SLAM, for navigation that does not depend on a target remaining continuously visible.</w:t>
       </w:r>
     </w:p>
@@ -9430,7 +10030,7 @@
         <w:rPr>
           <w:rFonts w:ascii="Times New Roman" w:hAnsi="Times New Roman" w:cs="Times New Roman"/>
         </w:rPr>
-        <w:t>Both tasks apply computer vision to a robotic decision-making problem, but differ in the nature of that problem and the technique used. Task 1 addresses a learned, data driven classification problem oriented toward offline decision making, where disease is assessed after imagery is captured. Task 2 addresses a rule based, geometric perception problem using classical HSV thresholding, within a continuous real time control loop where perception becomes a motor command roughly ten times per second.</w:t>
+        <w:t>Both tasks apply computer vision to a robotic decision-making problem but differ in nature and technique. Task 1 is a learned, data driven classification problem, oriented toward offline decision making after imagery is captured. Task 2 is a rule based, geometric perception problem using classical HSV thresholding within a continuous real time control loop, translating perception into a motor command roughly ten times per second.</w:t>
       </w:r>
     </w:p>
     <w:p>
@@ -9445,7 +10045,7 @@
         <w:rPr>
           <w:rFonts w:cs="Times New Roman"/>
         </w:rPr>
-        <w:t>This contrast follows from the tasks' differing requirements rather than inconsistency. A drone survey can tolerate a per-image delay of a fraction of a second, whereas real-time navigation must produce a control decision on every frame with minimal latency, favouring cheap colour thresholding over a neural network pass for this task. Together, the two tasks show robotic vision is not one technique applied uniformly, but complementary approaches chosen by computational budget, latency and available training data.</w:t>
+        <w:t>This follows from the tasks differing requirements rather than inconsistency. A drone survey can tolerate a per-image delay of a fraction of a second, whereas real-time navigation must produce a control decision on every frame with minimal latency, favouring cheap colour thresholding over a neural network pass for this task. Together, the two tasks show robotic vision is not one technique applied uniformly, but complementary approaches chosen by computational budget, latency and available training data.</w:t>
       </w:r>
     </w:p>
     <w:p>
@@ -9478,7 +10078,35 @@
         <w:rPr>
           <w:rFonts w:ascii="Times New Roman" w:hAnsi="Times New Roman" w:cs="Times New Roman"/>
         </w:rPr>
-        <w:t>This report has presented two robotic vision systems for the module Advanced Robotics Automation and Computer Vision. Task 1 produced a MobileNetV2 based plant disease classifier trained on PlantVillage, reaching 99.11% validation accuracy and 98.83% macro F1 with approximately 2.27 million parameters, selected for low power embedded deployment rather than accuracy alone. Task 2 produced a ROS 2 perception and navigation design for a simulated TurtleBot3, using HSV colour thresholding and a rule-based controller, verified offline against seven scenarios including a distractor and an absent marker, and confirmed on the live ROSject, where the observed angular velocity matched the controller's proportional gain to five decimal places.</w:t>
+        <w:t xml:space="preserve">This report has presented two robotic vision systems for the module Advanced Robotics Automation and Computer Vision. Task 1 produced a MobileNetV2 based plant disease classifier trained on </w:t>
+      </w:r>
+      <w:proofErr w:type="spellStart"/>
+      <w:r>
+        <w:rPr>
+          <w:rFonts w:ascii="Times New Roman" w:hAnsi="Times New Roman" w:cs="Times New Roman"/>
+        </w:rPr>
+        <w:t>PlantVillage</w:t>
+      </w:r>
+      <w:proofErr w:type="spellEnd"/>
+      <w:r>
+        <w:rPr>
+          <w:rFonts w:ascii="Times New Roman" w:hAnsi="Times New Roman" w:cs="Times New Roman"/>
+        </w:rPr>
+        <w:t xml:space="preserve">, reaching the accuracy and F1 performance reported in the Executive Summary while remaining light enough for embedded deployment. Task 2 produced a ROS 2 perception and navigation design for a simulated TurtleBot3 using HSV colour thresholding and a rule-based controller, verified offline across seven scenarios and confirmed on the live </w:t>
+      </w:r>
+      <w:proofErr w:type="spellStart"/>
+      <w:r>
+        <w:rPr>
+          <w:rFonts w:ascii="Times New Roman" w:hAnsi="Times New Roman" w:cs="Times New Roman"/>
+        </w:rPr>
+        <w:t>ROSject</w:t>
+      </w:r>
+      <w:proofErr w:type="spellEnd"/>
+      <w:r>
+        <w:rPr>
+          <w:rFonts w:ascii="Times New Roman" w:hAnsi="Times New Roman" w:cs="Times New Roman"/>
+        </w:rPr>
+        <w:t>, matching the controller's proportional gain to five decimal places.</w:t>
       </w:r>
     </w:p>
     <w:p>
@@ -9595,6 +10223,207 @@
     </w:p>
     <w:p>
       <w:pPr>
+        <w:pStyle w:val="BodyText"/>
+        <w:spacing w:before="240" w:line="360" w:lineRule="auto"/>
+        <w:rPr>
+          <w:rFonts w:cs="Times New Roman"/>
+        </w:rPr>
+      </w:pPr>
+      <w:r>
+        <w:rPr>
+          <w:rFonts w:cs="Times New Roman"/>
+        </w:rPr>
+        <w:t xml:space="preserve">Jlassi, A., </w:t>
+      </w:r>
+      <w:proofErr w:type="spellStart"/>
+      <w:r>
+        <w:rPr>
+          <w:rFonts w:cs="Times New Roman"/>
+        </w:rPr>
+        <w:t>Elaoud</w:t>
+      </w:r>
+      <w:proofErr w:type="spellEnd"/>
+      <w:r>
+        <w:rPr>
+          <w:rFonts w:cs="Times New Roman"/>
+        </w:rPr>
+        <w:t xml:space="preserve">, A., Ghazouani, H., and Barhoumi, W. (2024) 'Potato Leaf Disease Classification Using Transfer Learning and Reweighting-Based Training with Imbalanced Data.' SN Computer Science 5, 987. [online] Available from </w:t>
+      </w:r>
+      <w:hyperlink r:id="rId26" w:history="1">
+        <w:r>
+          <w:rPr>
+            <w:rStyle w:val="Hyperlink"/>
+            <w:rFonts w:cs="Times New Roman"/>
+          </w:rPr>
+          <w:t>https://doi.org/10.1007/s42979-024-03334-x</w:t>
+        </w:r>
+      </w:hyperlink>
+      <w:r>
+        <w:rPr>
+          <w:rFonts w:cs="Times New Roman"/>
+        </w:rPr>
+        <w:t xml:space="preserve"> [Accessed 16 September 2026]</w:t>
+      </w:r>
+    </w:p>
+    <w:p>
+      <w:pPr>
+        <w:pStyle w:val="BodyText"/>
+        <w:spacing w:before="180" w:after="0" w:line="360" w:lineRule="auto"/>
+        <w:rPr>
+          <w:rFonts w:cs="Times New Roman"/>
+        </w:rPr>
+      </w:pPr>
+      <w:r>
+        <w:rPr>
+          <w:rFonts w:cs="Times New Roman"/>
+        </w:rPr>
+        <w:t xml:space="preserve">Kumar, A., Monga, H.P., Brahma, T., Kalra, S., and Sherif, N. (2025) ‘Mobile-Friendly Deep Learning for Plant Disease Detection: A Lightweight CNN Benchmark Across 101 Classes of 33 Crops.’ [online] Available from </w:t>
+      </w:r>
+      <w:hyperlink r:id="rId27">
+        <w:r>
+          <w:rPr>
+            <w:rStyle w:val="Hyperlink"/>
+            <w:rFonts w:cs="Times New Roman"/>
+          </w:rPr>
+          <w:t>https://arxiv.org/pdf/2508.10817</w:t>
+        </w:r>
+      </w:hyperlink>
+      <w:r>
+        <w:rPr>
+          <w:rFonts w:cs="Times New Roman"/>
+        </w:rPr>
+        <w:t xml:space="preserve"> [Accessed 4 September 2026].</w:t>
+      </w:r>
+    </w:p>
+    <w:p>
+      <w:pPr>
+        <w:pStyle w:val="BodyText"/>
+        <w:spacing w:before="180" w:after="0" w:line="360" w:lineRule="auto"/>
+        <w:rPr>
+          <w:rFonts w:cs="Times New Roman"/>
+        </w:rPr>
+      </w:pPr>
+      <w:r>
+        <w:rPr>
+          <w:rFonts w:cs="Times New Roman"/>
+        </w:rPr>
+        <w:t xml:space="preserve">Manoj, H.M., Shanthi, D.L., Lakshmi, B.N., Archana, K.J., Jyothi, E.V.N., and Archana, K. (2025) ‘AI-driven drone technology and computer vision for early detection of crop disease in large agricultural areas.’ Scientific Reports 16, 2479. [online] Available from </w:t>
+      </w:r>
+      <w:hyperlink r:id="rId28">
+        <w:r>
+          <w:rPr>
+            <w:rStyle w:val="Hyperlink"/>
+            <w:rFonts w:cs="Times New Roman"/>
+          </w:rPr>
+          <w:t>https://www.nature.com/articles/s41598-025-32384-1</w:t>
+        </w:r>
+      </w:hyperlink>
+      <w:r>
+        <w:rPr>
+          <w:rFonts w:cs="Times New Roman"/>
+        </w:rPr>
+        <w:t xml:space="preserve"> [Accessed 4 September 2026].</w:t>
+      </w:r>
+    </w:p>
+    <w:p>
+      <w:pPr>
+        <w:pStyle w:val="BodyText"/>
+        <w:spacing w:before="180" w:after="0" w:line="360" w:lineRule="auto"/>
+        <w:rPr>
+          <w:rFonts w:cs="Times New Roman"/>
+        </w:rPr>
+      </w:pPr>
+      <w:proofErr w:type="spellStart"/>
+      <w:r>
+        <w:rPr>
+          <w:rFonts w:cs="Times New Roman"/>
+        </w:rPr>
+        <w:t>mohanty</w:t>
+      </w:r>
+      <w:proofErr w:type="spellEnd"/>
+      <w:r>
+        <w:rPr>
+          <w:rFonts w:cs="Times New Roman"/>
+        </w:rPr>
+        <w:t>/</w:t>
+      </w:r>
+      <w:proofErr w:type="spellStart"/>
+      <w:r>
+        <w:rPr>
+          <w:rFonts w:cs="Times New Roman"/>
+        </w:rPr>
+        <w:t>PlantVillage</w:t>
+      </w:r>
+      <w:proofErr w:type="spellEnd"/>
+      <w:r>
+        <w:rPr>
+          <w:rFonts w:cs="Times New Roman"/>
+        </w:rPr>
+        <w:t xml:space="preserve"> (2016) [online] Available from </w:t>
+      </w:r>
+      <w:hyperlink r:id="rId29">
+        <w:r>
+          <w:rPr>
+            <w:rStyle w:val="Hyperlink"/>
+            <w:rFonts w:cs="Times New Roman"/>
+          </w:rPr>
+          <w:t>https://huggingface.co/datasets/mohanty/PlantVillage</w:t>
+        </w:r>
+      </w:hyperlink>
+      <w:r>
+        <w:rPr>
+          <w:rFonts w:cs="Times New Roman"/>
+        </w:rPr>
+        <w:t xml:space="preserve"> [Accessed 4 September 2026].</w:t>
+      </w:r>
+    </w:p>
+    <w:p>
+      <w:pPr>
+        <w:pStyle w:val="BodyText"/>
+        <w:spacing w:before="180" w:after="0" w:line="360" w:lineRule="auto"/>
+        <w:rPr>
+          <w:rFonts w:cs="Times New Roman"/>
+        </w:rPr>
+      </w:pPr>
+      <w:r>
+        <w:rPr>
+          <w:rFonts w:cs="Times New Roman"/>
+        </w:rPr>
+        <w:t>Mohanty, S.P., Hughes, D.P., and Salathe, M. (2016) ‘Using Deep Learning for Image-Based Plant Disease Detection.’ Frontiers in Plant Science 7, 1419.</w:t>
+      </w:r>
+    </w:p>
+    <w:p>
+      <w:pPr>
+        <w:pStyle w:val="BodyText"/>
+        <w:spacing w:before="180" w:after="0" w:line="360" w:lineRule="auto"/>
+        <w:rPr>
+          <w:rFonts w:cs="Times New Roman"/>
+        </w:rPr>
+      </w:pPr>
+      <w:r>
+        <w:rPr>
+          <w:rFonts w:cs="Times New Roman"/>
+        </w:rPr>
+        <w:t xml:space="preserve">Pal, C., Karmakar, S., Mukherjee, I., and Chakrabarti, P.P. (2025) ‘A lightweight and explainable CNN model for empowering plant disease diagnosis.’ Scientific Reports 15, 30720. [online] Available from </w:t>
+      </w:r>
+      <w:hyperlink r:id="rId30">
+        <w:r>
+          <w:rPr>
+            <w:rStyle w:val="Hyperlink"/>
+            <w:rFonts w:cs="Times New Roman"/>
+          </w:rPr>
+          <w:t>https://www.nature.com/articles/s41598-025-94083-1</w:t>
+        </w:r>
+      </w:hyperlink>
+      <w:r>
+        <w:rPr>
+          <w:rFonts w:cs="Times New Roman"/>
+        </w:rPr>
+        <w:t xml:space="preserve"> [Accessed 4 September 2026].</w:t>
+      </w:r>
+    </w:p>
+    <w:p>
+      <w:pPr>
         <w:pStyle w:val="FirstParagraph"/>
         <w:spacing w:after="0" w:line="360" w:lineRule="auto"/>
         <w:jc w:val="both"/>
@@ -9606,9 +10435,15 @@
         <w:rPr>
           <w:rFonts w:ascii="Times New Roman" w:hAnsi="Times New Roman" w:cs="Times New Roman"/>
         </w:rPr>
-        <w:t xml:space="preserve">arXiv (2023) ‘A Comprehensive Review of AI-enabled Unmanned Aerial Vehicle: Trends, Vision, and Challenges.’ [online] Available from </w:t>
-      </w:r>
-      <w:hyperlink r:id="rId26">
+        <w:t>Pal, O.K., Shovon, M.S.H., Mridha, M.F., and Shin, J. (2023)</w:t>
+      </w:r>
+      <w:r>
+        <w:rPr>
+          <w:rFonts w:ascii="Times New Roman" w:hAnsi="Times New Roman" w:cs="Times New Roman"/>
+        </w:rPr>
+        <w:t xml:space="preserve"> ‘A Comprehensive Review of AI-enabled Unmanned Aerial Vehicle: Trends, Vision, and Challenges.’ [online] Available from </w:t>
+      </w:r>
+      <w:hyperlink r:id="rId31">
         <w:r>
           <w:rPr>
             <w:rStyle w:val="Hyperlink"/>
@@ -9627,181 +10462,24 @@
     <w:p>
       <w:pPr>
         <w:pStyle w:val="BodyText"/>
-        <w:spacing w:before="240" w:line="360" w:lineRule="auto"/>
-        <w:rPr>
-          <w:rFonts w:cs="Times New Roman"/>
-        </w:rPr>
-      </w:pPr>
-      <w:r>
-        <w:rPr>
-          <w:rFonts w:cs="Times New Roman"/>
-        </w:rPr>
-        <w:t xml:space="preserve">Jlassi, A., Elaoud, A., Ghazouani, H., and Barhoumi, W. (2024) 'Potato Leaf Disease Classification Using Transfer Learning and Reweighting-Based Training with Imbalanced Data.' SN Computer Science 5, 987. [online] Available from </w:t>
-      </w:r>
-      <w:hyperlink r:id="rId27" w:history="1">
-        <w:r>
-          <w:rPr>
-            <w:rStyle w:val="Hyperlink"/>
-            <w:rFonts w:cs="Times New Roman"/>
-          </w:rPr>
-          <w:t>https://doi.org/10.1007/s42979-024-03334-x</w:t>
-        </w:r>
-      </w:hyperlink>
-      <w:r>
-        <w:rPr>
-          <w:rFonts w:cs="Times New Roman"/>
-        </w:rPr>
-        <w:t xml:space="preserve"> [Accessed 16 September 2026]</w:t>
-      </w:r>
-    </w:p>
-    <w:p>
-      <w:pPr>
-        <w:pStyle w:val="BodyText"/>
         <w:spacing w:before="180" w:after="0" w:line="360" w:lineRule="auto"/>
         <w:rPr>
           <w:rFonts w:cs="Times New Roman"/>
         </w:rPr>
       </w:pPr>
-      <w:r>
-        <w:rPr>
-          <w:rFonts w:cs="Times New Roman"/>
-        </w:rPr>
-        <w:t xml:space="preserve">Kumar, A., Monga, H.P., Brahma, T., Kalra, S., and Sherif, N. (2025) ‘Mobile-Friendly Deep Learning for Plant Disease Detection: A Lightweight CNN Benchmark Across 101 Classes of 33 Crops.’ [online] Available from </w:t>
-      </w:r>
-      <w:hyperlink r:id="rId28">
-        <w:r>
-          <w:rPr>
-            <w:rStyle w:val="Hyperlink"/>
-            <w:rFonts w:cs="Times New Roman"/>
-          </w:rPr>
-          <w:t>https://arxiv.org/pdf/2508.10817</w:t>
-        </w:r>
-      </w:hyperlink>
-      <w:r>
-        <w:rPr>
-          <w:rFonts w:cs="Times New Roman"/>
-        </w:rPr>
-        <w:t xml:space="preserve"> [Accessed 4 September 2026].</w:t>
-      </w:r>
-    </w:p>
-    <w:p>
-      <w:pPr>
-        <w:pStyle w:val="BodyText"/>
-        <w:spacing w:before="180" w:after="0" w:line="360" w:lineRule="auto"/>
-        <w:rPr>
-          <w:rFonts w:cs="Times New Roman"/>
-        </w:rPr>
-      </w:pPr>
-      <w:r>
-        <w:rPr>
-          <w:rFonts w:cs="Times New Roman"/>
-        </w:rPr>
-        <w:t xml:space="preserve">Manoj, H.M., Shanthi, D.L., Lakshmi, B.N., Archana, K.J., Jyothi, E.V.N., and Archana, K. (2025) ‘AI-driven drone technology and computer vision for early detection of crop disease in large agricultural areas.’ Scientific Reports 16, 2479. [online] Available from </w:t>
-      </w:r>
-      <w:hyperlink r:id="rId29">
-        <w:r>
-          <w:rPr>
-            <w:rStyle w:val="Hyperlink"/>
-            <w:rFonts w:cs="Times New Roman"/>
-          </w:rPr>
-          <w:t>https://www.nature.com/articles/s41598-025-32384-1</w:t>
-        </w:r>
-      </w:hyperlink>
-      <w:r>
-        <w:rPr>
-          <w:rFonts w:cs="Times New Roman"/>
-        </w:rPr>
-        <w:t xml:space="preserve"> [Accessed 4 September 2026].</w:t>
-      </w:r>
-    </w:p>
-    <w:p>
-      <w:pPr>
-        <w:pStyle w:val="BodyText"/>
-        <w:spacing w:before="180" w:after="0" w:line="360" w:lineRule="auto"/>
-        <w:rPr>
-          <w:rFonts w:cs="Times New Roman"/>
-        </w:rPr>
-      </w:pPr>
-      <w:r>
-        <w:rPr>
-          <w:rFonts w:cs="Times New Roman"/>
-        </w:rPr>
-        <w:t xml:space="preserve">mohanty/PlantVillage (2016) [online] Available from </w:t>
-      </w:r>
-      <w:hyperlink r:id="rId30">
-        <w:r>
-          <w:rPr>
-            <w:rStyle w:val="Hyperlink"/>
-            <w:rFonts w:cs="Times New Roman"/>
-          </w:rPr>
-          <w:t>https://huggingface.co/datasets/mohanty/PlantVillage</w:t>
-        </w:r>
-      </w:hyperlink>
-      <w:r>
-        <w:rPr>
-          <w:rFonts w:cs="Times New Roman"/>
-        </w:rPr>
-        <w:t xml:space="preserve"> [Accessed 4 September 2026].</w:t>
-      </w:r>
-    </w:p>
-    <w:p>
-      <w:pPr>
-        <w:pStyle w:val="BodyText"/>
-        <w:spacing w:before="180" w:after="0" w:line="360" w:lineRule="auto"/>
-        <w:rPr>
-          <w:rFonts w:cs="Times New Roman"/>
-        </w:rPr>
-      </w:pPr>
-      <w:r>
-        <w:rPr>
-          <w:rFonts w:cs="Times New Roman"/>
-        </w:rPr>
-        <w:t>Mohanty, S.P., Hughes, D.P., and Salathe, M. (2016) ‘Using Deep Learning for Image-Based Plant Disease Detection.’ Frontiers in Plant Science 7, 1419.</w:t>
-      </w:r>
-    </w:p>
-    <w:p>
-      <w:pPr>
-        <w:pStyle w:val="BodyText"/>
-        <w:spacing w:before="180" w:after="0" w:line="360" w:lineRule="auto"/>
-        <w:rPr>
-          <w:rFonts w:cs="Times New Roman"/>
-        </w:rPr>
-      </w:pPr>
-      <w:r>
-        <w:rPr>
-          <w:rFonts w:cs="Times New Roman"/>
-        </w:rPr>
-        <w:t xml:space="preserve">Pal, C., Karmakar, S., Mukherjee, I., and Chakrabarti, P.P. (2025) ‘A lightweight and explainable CNN model for empowering plant disease diagnosis.’ Scientific Reports 15, 30720. [online] Available from </w:t>
-      </w:r>
-      <w:hyperlink r:id="rId31">
-        <w:r>
-          <w:rPr>
-            <w:rStyle w:val="Hyperlink"/>
-            <w:rFonts w:cs="Times New Roman"/>
-          </w:rPr>
-          <w:t>https://www.nature.com/articles/s41598-025-94083-1</w:t>
-        </w:r>
-      </w:hyperlink>
-      <w:r>
-        <w:rPr>
-          <w:rFonts w:cs="Times New Roman"/>
-        </w:rPr>
-        <w:t xml:space="preserve"> [Accessed 4 September 2026].</w:t>
-      </w:r>
-    </w:p>
-    <w:p>
-      <w:pPr>
-        <w:pStyle w:val="BodyText"/>
-        <w:spacing w:before="180" w:after="0" w:line="360" w:lineRule="auto"/>
-        <w:rPr>
-          <w:rFonts w:cs="Times New Roman"/>
-        </w:rPr>
-      </w:pPr>
-      <w:r>
-        <w:rPr>
-          <w:rFonts w:cs="Times New Roman"/>
-        </w:rPr>
-        <w:t xml:space="preserve">PlantVillage-Dataset (2016) [online] Available from </w:t>
+      <w:proofErr w:type="spellStart"/>
+      <w:r>
+        <w:rPr>
+          <w:rFonts w:cs="Times New Roman"/>
+        </w:rPr>
+        <w:t>PlantVillage</w:t>
+      </w:r>
+      <w:proofErr w:type="spellEnd"/>
+      <w:r>
+        <w:rPr>
+          <w:rFonts w:cs="Times New Roman"/>
+        </w:rPr>
+        <w:t xml:space="preserve">-Dataset (2016) [online] Available from </w:t>
       </w:r>
       <w:hyperlink r:id="rId32">
         <w:r>
@@ -11286,6 +11964,8 @@
     </w:pPr>
     <w:rPr>
       <w:kern w:val="0"/>
+      <w:sz w:val="20"/>
+      <w:szCs w:val="20"/>
       <w14:ligatures w14:val="none"/>
     </w:rPr>
     <w:tblPr>

</xml_diff>

<commit_message>
Update report document with revised word count and improved clarity in project descriptions
</commit_message>
<xml_diff>
--- a/Sem2/Advanced Robotics Automation and Computer Vision/Report.docx
+++ b/Sem2/Advanced Robotics Automation and Computer Vision/Report.docx
@@ -532,25 +532,7 @@
           <w:sz w:val="28"/>
           <w:szCs w:val="28"/>
         </w:rPr>
-        <w:t xml:space="preserve">Dr </w:t>
-      </w:r>
-      <w:proofErr w:type="spellStart"/>
-      <w:r>
-        <w:rPr>
-          <w:rFonts w:cs="Times New Roman"/>
-          <w:sz w:val="28"/>
-          <w:szCs w:val="28"/>
-        </w:rPr>
-        <w:t>Fahmid</w:t>
-      </w:r>
-      <w:proofErr w:type="spellEnd"/>
-      <w:r>
-        <w:rPr>
-          <w:rFonts w:cs="Times New Roman"/>
-          <w:sz w:val="28"/>
-          <w:szCs w:val="28"/>
-        </w:rPr>
-        <w:t xml:space="preserve"> Al Farid</w:t>
+        <w:t>Dr Fahmid Al Farid</w:t>
       </w:r>
     </w:p>
     <w:p>
@@ -768,7 +750,21 @@
                 <w:rFonts w:eastAsiaTheme="majorEastAsia" w:cs="Times New Roman"/>
                 <w:color w:val="000000" w:themeColor="text1"/>
               </w:rPr>
-              <w:t>3000</w:t>
+              <w:t>3</w:t>
+            </w:r>
+            <w:r>
+              <w:rPr>
+                <w:rFonts w:eastAsiaTheme="majorEastAsia" w:cs="Times New Roman"/>
+                <w:color w:val="000000" w:themeColor="text1"/>
+              </w:rPr>
+              <w:t>2</w:t>
+            </w:r>
+            <w:r>
+              <w:rPr>
+                <w:rFonts w:eastAsiaTheme="majorEastAsia" w:cs="Times New Roman"/>
+                <w:color w:val="000000" w:themeColor="text1"/>
+              </w:rPr>
+              <w:t>25</w:t>
             </w:r>
           </w:p>
         </w:tc>
@@ -4338,21 +4334,7 @@
         <w:rPr>
           <w:rFonts w:ascii="Times New Roman" w:hAnsi="Times New Roman" w:cs="Times New Roman"/>
         </w:rPr>
-        <w:t xml:space="preserve">This report covers two related projects for the module Advanced Robotics Automation and Computer Vision. The first is a deep learning vision system for crop health monitoring, trained on </w:t>
-      </w:r>
-      <w:proofErr w:type="spellStart"/>
-      <w:r>
-        <w:rPr>
-          <w:rFonts w:ascii="Times New Roman" w:hAnsi="Times New Roman" w:cs="Times New Roman"/>
-        </w:rPr>
-        <w:t>PlantVillage</w:t>
-      </w:r>
-      <w:proofErr w:type="spellEnd"/>
-      <w:r>
-        <w:rPr>
-          <w:rFonts w:ascii="Times New Roman" w:hAnsi="Times New Roman" w:cs="Times New Roman"/>
-        </w:rPr>
-        <w:t xml:space="preserve"> and adapted through augmentation to approximate low-altitude drone imagery, covering viewpoint change, motion blur and variable lighting. A MobileNetV2 backbone, pretrained on ImageNet, was fine-tuned on 54,305 leaf images across 38 classes using an 80/20 split, reaching 99.11% validation accuracy, 98.64% macro precision, 99.06% macro recall and 98.83% macro F1 over eight epochs. The classifier has around 2.27 million parameters, suited to onboard drone inference.</w:t>
+        <w:t>This report covers two related projects for the module Advanced Robotics Automation and Computer Vision. The first is a deep learning vision system for crop health monitoring, trained on PlantVillage and adapted through augmentation to approximate low-altitude drone imagery, covering viewpoint change, motion blur and variable lighting. A MobileNetV2 backbone, pretrained on ImageNet, was fine-tuned on 54,305 leaf images across 38 classes using an 80/20 split, reaching 99.11% validation accuracy, 98.64% macro precision, 99.06% macro recall and 98.83% macro F1 over eight epochs. The classifier has around 2.27 million parameters, suited to onboard drone inference.</w:t>
       </w:r>
     </w:p>
     <w:p>
@@ -4377,21 +4359,13 @@
         <w:rPr>
           <w:rFonts w:ascii="Times New Roman" w:hAnsi="Times New Roman" w:cs="Times New Roman"/>
         </w:rPr>
-        <w:t xml:space="preserve">second project implements vision guided navigation for a simulated TurtleBot3 in a ROS 2 Gazebo environment, using OpenCV colour thresholding to detect a marker and a rule-based controller to search, turn and approach it. Perception and control were verified offline against seven synthetic test frames covering centred, off-centre, near, far, absent and distractor scenarios, and a live query of the deployed </w:t>
-      </w:r>
-      <w:proofErr w:type="spellStart"/>
+        <w:t xml:space="preserve">second project implements vision guided navigation for a simulated TurtleBot3 in a ROS 2 Gazebo environment, using OpenCV colour thresholding to detect a marker and a rule-based controller to search, turn and approach it. Perception and control were verified offline against seven synthetic test frames covering centred, off-centre, near, far, absent and distractor scenarios, and a live query of the deployed ROSject reproduced the same proportional turning behaviour to five decimal places. </w:t>
+      </w:r>
       <w:r>
         <w:rPr>
           <w:rFonts w:ascii="Times New Roman" w:hAnsi="Times New Roman" w:cs="Times New Roman"/>
         </w:rPr>
-        <w:t>ROSject</w:t>
-      </w:r>
-      <w:proofErr w:type="spellEnd"/>
-      <w:r>
-        <w:rPr>
-          <w:rFonts w:ascii="Times New Roman" w:hAnsi="Times New Roman" w:cs="Times New Roman"/>
-        </w:rPr>
-        <w:t xml:space="preserve"> reproduced the same proportional turning behaviour to five decimal places. Together, the two projects show how a learned, offline approach and a classical, real-time approach each suit their own robotic context.</w:t>
+        <w:t>Seen side by side, the two projects make the case that a learned, offline approach and a classical, real-time one each fit their own robotic context.</w:t>
       </w:r>
       <w:r>
         <w:rPr>
@@ -4431,13 +4405,13 @@
         <w:rPr>
           <w:rFonts w:ascii="Times New Roman" w:hAnsi="Times New Roman" w:cs="Times New Roman"/>
         </w:rPr>
-        <w:t>Robotic</w:t>
+        <w:t>Robotic vision now matters in two very different settings. In precision agriculture, catching crop disease early affects yield and food security; in mobile robotics, how well a machine reads its surroundings decides how far it can go without a person watching over it.</w:t>
       </w:r>
       <w:r>
         <w:rPr>
           <w:rFonts w:ascii="Times New Roman" w:hAnsi="Times New Roman" w:cs="Times New Roman"/>
         </w:rPr>
-        <w:t xml:space="preserve"> vision systems now underpin two areas of practical importance: in precision agriculture, early crop disease detection affects yield and food security, while in mobile robotics, visual interpretation of surroundings determines how far a robot can operate without supervision. This report addresses both areas through two tasks issued under one assignment brief for the module Advanced Robotics Automation and Computer Vision, presented together in one document.</w:t>
+        <w:t xml:space="preserve"> This report addresses both areas through two tasks issued under one assignment brief for the module Advanced Robotics Automation and Computer Vision, presented together in one document.</w:t>
       </w:r>
     </w:p>
     <w:p>
@@ -4479,7 +4453,19 @@
         <w:rPr>
           <w:rFonts w:cs="Times New Roman"/>
         </w:rPr>
-        <w:t>Although the two tasks operate in different contexts, both convert pixel level image data into a decision a robotic system can act on, under practical constraints of computational cost. Task 1 also aligns with UN Sustainable Development Goal 2, Zero Hunger, which identifies scalable disease detection as a contributor to food security. The tasks are reported together because they share a module, a cloud-based development approach and a design principle, discussed in the combined evaluation section.</w:t>
+        <w:t xml:space="preserve">Although the two tasks operate in different contexts, both convert pixel level image data into a decision a robotic system can act on, under practical constraints of computational cost. </w:t>
+      </w:r>
+      <w:r>
+        <w:rPr>
+          <w:rFonts w:cs="Times New Roman"/>
+        </w:rPr>
+        <w:t>Task 1 also speaks to UN Sustainable Development Goal 2 (Zero Hunger), since scalable disease detection is one of several recognised contributors to food security.</w:t>
+      </w:r>
+      <w:r>
+        <w:rPr>
+          <w:rFonts w:cs="Times New Roman"/>
+        </w:rPr>
+        <w:t xml:space="preserve"> The tasks are reported together because they share a module, a cloud-based development approach and a design principle, discussed in the combined evaluation section.</w:t>
       </w:r>
     </w:p>
     <w:p>
@@ -4636,35 +4622,7 @@
         <w:rPr>
           <w:rFonts w:cs="Times New Roman"/>
         </w:rPr>
-        <w:t xml:space="preserve">Hughes and Salathe (2016) were among the first to show deep CNNs trained on </w:t>
-      </w:r>
-      <w:proofErr w:type="spellStart"/>
-      <w:r>
-        <w:rPr>
-          <w:rFonts w:cs="Times New Roman"/>
-        </w:rPr>
-        <w:t>PlantVillage</w:t>
-      </w:r>
-      <w:proofErr w:type="spellEnd"/>
-      <w:r>
-        <w:rPr>
-          <w:rFonts w:cs="Times New Roman"/>
-        </w:rPr>
-        <w:t xml:space="preserve"> could exceed 99% accuracy, though using the dataset's original close range, controlled photographs. Pal et al. (2025) built on this with a lightweight, explainable CNN reaching 99.47% on </w:t>
-      </w:r>
-      <w:proofErr w:type="spellStart"/>
-      <w:r>
-        <w:rPr>
-          <w:rFonts w:cs="Times New Roman"/>
-        </w:rPr>
-        <w:t>PlantVillage</w:t>
-      </w:r>
-      <w:proofErr w:type="spellEnd"/>
-      <w:r>
-        <w:rPr>
-          <w:rFonts w:cs="Times New Roman"/>
-        </w:rPr>
-        <w:t xml:space="preserve"> and 97.73% on a larger 58 class dataset, suggesting smaller models need not sacrifice accuracy for efficiency.</w:t>
+        <w:t>Hughes and Salathe (2016) were among the first to show deep CNNs trained on PlantVillage could exceed 99% accuracy, though using the dataset's original close range, controlled photographs. Pal et al. (2025) built on this with a lightweight, explainable CNN reaching 99.47% on PlantVillage and 97.73% on a larger 58 class dataset, suggesting smaller models need not sacrifice accuracy for efficiency.</w:t>
       </w:r>
     </w:p>
     <w:p>
@@ -4697,21 +4655,7 @@
         <w:rPr>
           <w:rFonts w:cs="Times New Roman"/>
         </w:rPr>
-        <w:t>Manoj et al. (2025) applied disease detection directly to drone imagery over large fields, and a review of AI enabled UAV systems (</w:t>
-      </w:r>
-      <w:proofErr w:type="spellStart"/>
-      <w:r>
-        <w:rPr>
-          <w:rFonts w:cs="Times New Roman"/>
-        </w:rPr>
-        <w:t>arXiv</w:t>
-      </w:r>
-      <w:proofErr w:type="spellEnd"/>
-      <w:r>
-        <w:rPr>
-          <w:rFonts w:cs="Times New Roman"/>
-        </w:rPr>
-        <w:t>, 2023) outlines the sensing and onboard processing limits of aerial platforms. Both point to a gap this project could not fully replicate: real UAV imagery differs from ground level photography in scale, viewpoint and motion blur, approximated here through augmentation rather than genuine aerial data.</w:t>
+        <w:t>Manoj et al. (2025) applied disease detection directly to drone imagery over large fields, and a review of AI enabled UAV systems (arXiv, 2023) outlines the sensing and onboard processing limits of aerial platforms. Both point to a gap this project could not fully replicate: real UAV imagery differs from ground level photography in scale, viewpoint and motion blur, approximated here through augmentation rather than genuine aerial data.</w:t>
       </w:r>
     </w:p>
     <w:p>
@@ -4751,21 +4695,7 @@
           <w:rFonts w:cs="Times New Roman"/>
         </w:rPr>
         <w:lastRenderedPageBreak/>
-        <w:t xml:space="preserve">scale. Jlassi et al. (2024) applied MobileNetV2 transfer learning with reweighting to potato leaf disease classification for imbalanced data, with strong results on underrepresented classes, relevant since </w:t>
-      </w:r>
-      <w:proofErr w:type="spellStart"/>
-      <w:r>
-        <w:rPr>
-          <w:rFonts w:cs="Times New Roman"/>
-        </w:rPr>
-        <w:t>PlantVillage</w:t>
-      </w:r>
-      <w:proofErr w:type="spellEnd"/>
-      <w:r>
-        <w:rPr>
-          <w:rFonts w:cs="Times New Roman"/>
-        </w:rPr>
-        <w:t xml:space="preserve"> is also imbalanced.</w:t>
+        <w:t>scale. Jlassi et al. (2024) applied MobileNetV2 transfer learning with reweighting to potato leaf disease classification for imbalanced data, with strong results on underrepresented classes, relevant since PlantVillage is also imbalanced.</w:t>
       </w:r>
     </w:p>
     <w:p>
@@ -4780,13 +4710,19 @@
         <w:rPr>
           <w:rFonts w:cs="Times New Roman"/>
         </w:rPr>
-        <w:t xml:space="preserve">Taken together, </w:t>
-      </w:r>
-      <w:r>
-        <w:rPr>
-          <w:rFonts w:cs="Times New Roman"/>
-        </w:rPr>
-        <w:t>these papers show lightweight CNNs are usually tested on curated, close-range datasets rather than real aerial captures. The augmentation pipeline here, mimicking drone conditions like viewpoint change, motion blur and variable lighting, attempts to close part of that gap, though it stops short of genuine UAV imagery, a limitation revisited in Section 3.5.</w:t>
+        <w:t>Taken together, these papers share a gap: lightweight CNNs are usually tested on curated, close-range datasets rather than real aerial captures</w:t>
+      </w:r>
+      <w:r>
+        <w:rPr>
+          <w:rFonts w:cs="Times New Roman"/>
+        </w:rPr>
+        <w:t xml:space="preserve">. </w:t>
+      </w:r>
+      <w:r>
+        <w:rPr>
+          <w:rFonts w:cs="Times New Roman"/>
+        </w:rPr>
+        <w:t>The augmentation pipeline here, mimicking drone conditions like viewpoint change, motion blur and variable lighting, attempts to close part of that gap, though it stops short of genuine UAV imagery, a limitation revisited in Section 3.5.</w:t>
       </w:r>
     </w:p>
     <w:p>
@@ -4820,89 +4756,11 @@
         </w:rPr>
         <w:t xml:space="preserve">The </w:t>
       </w:r>
-      <w:proofErr w:type="spellStart"/>
       <w:r>
         <w:rPr>
           <w:rFonts w:ascii="Times New Roman" w:hAnsi="Times New Roman" w:cs="Times New Roman"/>
         </w:rPr>
-        <w:t>PlantVillage</w:t>
-      </w:r>
-      <w:proofErr w:type="spellEnd"/>
-      <w:r>
-        <w:rPr>
-          <w:rFonts w:ascii="Times New Roman" w:hAnsi="Times New Roman" w:cs="Times New Roman"/>
-        </w:rPr>
-        <w:t xml:space="preserve"> dataset was used via the Hugging Face datasets library (</w:t>
-      </w:r>
-      <w:proofErr w:type="spellStart"/>
-      <w:r>
-        <w:rPr>
-          <w:rFonts w:ascii="Times New Roman" w:hAnsi="Times New Roman" w:cs="Times New Roman"/>
-        </w:rPr>
-        <w:t>mohanty</w:t>
-      </w:r>
-      <w:proofErr w:type="spellEnd"/>
-      <w:r>
-        <w:rPr>
-          <w:rFonts w:ascii="Times New Roman" w:hAnsi="Times New Roman" w:cs="Times New Roman"/>
-        </w:rPr>
-        <w:t>/</w:t>
-      </w:r>
-      <w:proofErr w:type="spellStart"/>
-      <w:r>
-        <w:rPr>
-          <w:rFonts w:ascii="Times New Roman" w:hAnsi="Times New Roman" w:cs="Times New Roman"/>
-        </w:rPr>
-        <w:t>PlantVillage</w:t>
-      </w:r>
-      <w:proofErr w:type="spellEnd"/>
-      <w:r>
-        <w:rPr>
-          <w:rFonts w:ascii="Times New Roman" w:hAnsi="Times New Roman" w:cs="Times New Roman"/>
-        </w:rPr>
-        <w:t>), using the colour configuration, mirroring the original repository (</w:t>
-      </w:r>
-      <w:proofErr w:type="spellStart"/>
-      <w:r>
-        <w:rPr>
-          <w:rFonts w:ascii="Times New Roman" w:hAnsi="Times New Roman" w:cs="Times New Roman"/>
-        </w:rPr>
-        <w:t>mohanty</w:t>
-      </w:r>
-      <w:proofErr w:type="spellEnd"/>
-      <w:r>
-        <w:rPr>
-          <w:rFonts w:ascii="Times New Roman" w:hAnsi="Times New Roman" w:cs="Times New Roman"/>
-        </w:rPr>
-        <w:t>/</w:t>
-      </w:r>
-      <w:proofErr w:type="spellStart"/>
-      <w:r>
-        <w:rPr>
-          <w:rFonts w:ascii="Times New Roman" w:hAnsi="Times New Roman" w:cs="Times New Roman"/>
-        </w:rPr>
-        <w:t>PlantVillage</w:t>
-      </w:r>
-      <w:proofErr w:type="spellEnd"/>
-      <w:r>
-        <w:rPr>
-          <w:rFonts w:ascii="Times New Roman" w:hAnsi="Times New Roman" w:cs="Times New Roman"/>
-        </w:rPr>
-        <w:t xml:space="preserve">, 2016; </w:t>
-      </w:r>
-      <w:proofErr w:type="spellStart"/>
-      <w:r>
-        <w:rPr>
-          <w:rFonts w:ascii="Times New Roman" w:hAnsi="Times New Roman" w:cs="Times New Roman"/>
-        </w:rPr>
-        <w:t>PlantVillage</w:t>
-      </w:r>
-      <w:proofErr w:type="spellEnd"/>
-      <w:r>
-        <w:rPr>
-          <w:rFonts w:ascii="Times New Roman" w:hAnsi="Times New Roman" w:cs="Times New Roman"/>
-        </w:rPr>
-        <w:t>-Dataset, 2016), comprising 54,305 labelled leaf images across 38 classes, a widely used baseline in plant pathology research (Mohanty, Hughes and Salathe, 2016).</w:t>
+        <w:t>PlantVillage dataset was used via the Hugging Face datasets library (mohanty/PlantVillage), using the colour configuration, mirroring the original repository (mohanty/PlantVillage, 2016; PlantVillage-Dataset, 2016), comprising 54,305 labelled leaf images across 38 classes, a widely used baseline in plant pathology research (Mohanty, Hughes and Salathe, 2016).</w:t>
       </w:r>
     </w:p>
     <w:p>
@@ -4917,21 +4775,7 @@
         <w:rPr>
           <w:rFonts w:cs="Times New Roman"/>
         </w:rPr>
-        <w:t xml:space="preserve">Class counts were inspected prior to splitting, since </w:t>
-      </w:r>
-      <w:proofErr w:type="spellStart"/>
-      <w:r>
-        <w:rPr>
-          <w:rFonts w:cs="Times New Roman"/>
-        </w:rPr>
-        <w:t>PlantVillage</w:t>
-      </w:r>
-      <w:proofErr w:type="spellEnd"/>
-      <w:r>
-        <w:rPr>
-          <w:rFonts w:cs="Times New Roman"/>
-        </w:rPr>
-        <w:t xml:space="preserve"> is not perfectly balanced; some disease categories are represented by substantially fewer images than the most common classes.</w:t>
+        <w:t>Class counts were inspected prior to splitting, since PlantVillage is not perfectly balanced; some disease categories are represented by substantially fewer images than the most common classes.</w:t>
       </w:r>
     </w:p>
     <w:p>
@@ -5018,15 +4862,7 @@
         <w:fldChar w:fldCharType="end"/>
       </w:r>
       <w:r>
-        <w:t xml:space="preserve">: Distribution of images across the 38 </w:t>
-      </w:r>
-      <w:proofErr w:type="spellStart"/>
-      <w:r>
-        <w:t>PlantVillage</w:t>
-      </w:r>
-      <w:proofErr w:type="spellEnd"/>
-      <w:r>
-        <w:t xml:space="preserve"> classes, illustrating the class imbalance referred to above.</w:t>
+        <w:t>: Distribution of images across the 38 PlantVillage classes, illustrating the class imbalance referred to above.</w:t>
       </w:r>
       <w:bookmarkEnd w:id="7"/>
     </w:p>
@@ -5199,35 +5035,7 @@
         <w:rPr>
           <w:rFonts w:cs="Times New Roman"/>
         </w:rPr>
-        <w:t xml:space="preserve"> was selected as backbone, pretrained on ImageNet and fine-tuned on </w:t>
-      </w:r>
-      <w:proofErr w:type="spellStart"/>
-      <w:r>
-        <w:rPr>
-          <w:rFonts w:cs="Times New Roman"/>
-        </w:rPr>
-        <w:t>PlantVillage</w:t>
-      </w:r>
-      <w:proofErr w:type="spellEnd"/>
-      <w:r>
-        <w:rPr>
-          <w:rFonts w:cs="Times New Roman"/>
-        </w:rPr>
-        <w:t xml:space="preserve">, with the 1000-class output layer replaced by a linear layer for the 38 </w:t>
-      </w:r>
-      <w:proofErr w:type="spellStart"/>
-      <w:r>
-        <w:rPr>
-          <w:rFonts w:cs="Times New Roman"/>
-        </w:rPr>
-        <w:t>PlantVillage</w:t>
-      </w:r>
-      <w:proofErr w:type="spellEnd"/>
-      <w:r>
-        <w:rPr>
-          <w:rFonts w:cs="Times New Roman"/>
-        </w:rPr>
-        <w:t xml:space="preserve"> classes, giving a final model of approximately 2.27 million trainable parameters.</w:t>
+        <w:t xml:space="preserve"> was selected as backbone, pretrained on ImageNet and fine-tuned on PlantVillage, with the 1000-class output layer replaced by a linear layer for the 38 PlantVillage classes, giving a final model of approximately 2.27 million trainable parameters.</w:t>
       </w:r>
       <w:r>
         <w:rPr>
@@ -5248,41 +5056,19 @@
         <w:rPr>
           <w:rFonts w:cs="Times New Roman"/>
         </w:rPr>
-        <w:t xml:space="preserve">MobileNetV2’s </w:t>
-      </w:r>
-      <w:r>
-        <w:rPr>
-          <w:rFonts w:cs="Times New Roman"/>
-        </w:rPr>
-        <w:t xml:space="preserve">defining feature is the inverted residual block with linear bottlenecks, using </w:t>
-      </w:r>
-      <w:proofErr w:type="spellStart"/>
-      <w:r>
-        <w:rPr>
-          <w:rFonts w:cs="Times New Roman"/>
-        </w:rPr>
-        <w:t>depthwise</w:t>
-      </w:r>
-      <w:proofErr w:type="spellEnd"/>
-      <w:r>
-        <w:rPr>
-          <w:rFonts w:cs="Times New Roman"/>
-        </w:rPr>
-        <w:t xml:space="preserve"> separable convolutions to reduce parameter count relative to standard architectures of comparable depth (Sandler et al., 2018), suiting a drone's tight compute, memory and power constraints. Figure 3 summarises this structure, showing the pretrained backbone feeding the replaced classification head. Pal et al. (2025) and Kumar et al. (2025) similarly report </w:t>
-      </w:r>
-      <w:proofErr w:type="spellStart"/>
-      <w:r>
-        <w:rPr>
-          <w:rFonts w:cs="Times New Roman"/>
-        </w:rPr>
-        <w:t>MobileNet</w:t>
-      </w:r>
-      <w:proofErr w:type="spellEnd"/>
-      <w:r>
-        <w:rPr>
-          <w:rFonts w:cs="Times New Roman"/>
-        </w:rPr>
-        <w:t>-family accuracy above 99% while remaining edge deployable, supporting the choice made here.</w:t>
+        <w:t>MobileNetV2's key feature is the inverted residual block with linear bottlenecks. It relies on depthwise separable convolutions to cut parameter count relative to standard architectures of comparable depth (Sandler et al., 2018), a good fit for a drone's tight compute, memory and power budget.</w:t>
+      </w:r>
+      <w:r>
+        <w:rPr>
+          <w:rFonts w:cs="Times New Roman"/>
+        </w:rPr>
+        <w:t xml:space="preserve"> </w:t>
+      </w:r>
+      <w:r>
+        <w:rPr>
+          <w:rFonts w:cs="Times New Roman"/>
+        </w:rPr>
+        <w:t>Figure 3 summarises this structure, showing the pretrained backbone feeding the replaced classification head. Pal et al. (2025) and Kumar et al. (2025) similarly report MobileNet-family accuracy above 99% while remaining edge deployable, supporting the choice made here.</w:t>
       </w:r>
     </w:p>
     <w:p>
@@ -5459,21 +5245,7 @@
         <w:rPr>
           <w:rFonts w:ascii="Times New Roman" w:hAnsi="Times New Roman" w:cs="Times New Roman"/>
         </w:rPr>
-        <w:t xml:space="preserve"> on a machine with a single CUDA GPU visible to </w:t>
-      </w:r>
-      <w:proofErr w:type="spellStart"/>
-      <w:r>
-        <w:rPr>
-          <w:rFonts w:ascii="Times New Roman" w:hAnsi="Times New Roman" w:cs="Times New Roman"/>
-        </w:rPr>
-        <w:t>PyTorch</w:t>
-      </w:r>
-      <w:proofErr w:type="spellEnd"/>
-      <w:r>
-        <w:rPr>
-          <w:rFonts w:ascii="Times New Roman" w:hAnsi="Times New Roman" w:cs="Times New Roman"/>
-        </w:rPr>
-        <w:t xml:space="preserve">, for eight epochs with a batch size of 32 and a learning rate of 3e-4. The notebook is publicly available at </w:t>
+        <w:t xml:space="preserve"> on a machine with a single CUDA GPU visible to PyTorch, for eight epochs with a batch size of 32 and a learning rate of 3e-4. The notebook is publicly available at </w:t>
       </w:r>
       <w:hyperlink r:id="rId17">
         <w:r>
@@ -6351,19 +6123,13 @@
         <w:rPr>
           <w:rFonts w:cs="Times New Roman"/>
         </w:rPr>
-        <w:t xml:space="preserve">Following training, the model was evaluated on the </w:t>
-      </w:r>
-      <w:r>
-        <w:rPr>
-          <w:rFonts w:cs="Times New Roman"/>
-        </w:rPr>
-        <w:t>held-out</w:t>
-      </w:r>
-      <w:r>
-        <w:rPr>
-          <w:rFonts w:cs="Times New Roman"/>
-        </w:rPr>
-        <w:t xml:space="preserve"> validation set, and a grid of randomly sampled predictions with true label, predicted label and confidence was generated to inspect qualitative behaviour.</w:t>
+        <w:t>Once training finished, the model was evaluated on the held-out validation set. A grid of randomly sampled predictions, each showing the true label, predicted label and confidence score, gave a quick qualitative check on its behaviour</w:t>
+      </w:r>
+      <w:r>
+        <w:rPr>
+          <w:rFonts w:cs="Times New Roman"/>
+        </w:rPr>
+        <w:t>.</w:t>
       </w:r>
     </w:p>
     <w:p>
@@ -6381,9 +6147,9 @@
           <w:noProof/>
         </w:rPr>
         <w:drawing>
-          <wp:inline distT="0" distB="0" distL="0" distR="0" wp14:anchorId="6B4B4FD4" wp14:editId="1F1171C7">
-            <wp:extent cx="5334000" cy="2748847"/>
-            <wp:effectExtent l="0" t="0" r="0" b="0"/>
+          <wp:inline distT="0" distB="0" distL="0" distR="0" wp14:anchorId="6B4B4FD4" wp14:editId="288A4CEB">
+            <wp:extent cx="5305425" cy="2800350"/>
+            <wp:effectExtent l="0" t="0" r="9525" b="0"/>
             <wp:docPr id="35" name="Picture" descr="Figure 4"/>
             <wp:cNvGraphicFramePr/>
             <a:graphic xmlns:a="http://schemas.openxmlformats.org/drawingml/2006/main">
@@ -6404,7 +6170,7 @@
                   <pic:spPr bwMode="auto">
                     <a:xfrm>
                       <a:off x="0" y="0"/>
-                      <a:ext cx="5334000" cy="2748847"/>
+                      <a:ext cx="5306520" cy="2800928"/>
                     </a:xfrm>
                     <a:prstGeom prst="rect">
                       <a:avLst/>
@@ -6957,19 +6723,26 @@
         <w:spacing w:before="240" w:after="0" w:line="360" w:lineRule="auto"/>
         <w:rPr>
           <w:rFonts w:cs="Times New Roman"/>
-        </w:rPr>
-      </w:pPr>
-      <w:r>
-        <w:rPr>
-          <w:rFonts w:cs="Times New Roman"/>
-        </w:rPr>
-        <w:t xml:space="preserve">The </w:t>
-      </w:r>
-      <w:r>
-        <w:rPr>
-          <w:rFonts w:cs="Times New Roman"/>
-        </w:rPr>
-        <w:t>relationship between training and validation loss, visible in Figure 4, does not indicate overfitting; validation loss tracked training loss closely and reached its lowest point at the final epoch alongside the best validation accuracy, consistent with the regularising effect of augmentation.</w:t>
+          <w:lang w:val="en-US"/>
+        </w:rPr>
+      </w:pPr>
+      <w:r>
+        <w:rPr>
+          <w:rFonts w:cs="Times New Roman"/>
+        </w:rPr>
+        <w:t>Figure 4 shows no sign of overfitting. Validation loss tracked training loss closely, and both reached their best point together at the final epoch.</w:t>
+      </w:r>
+      <w:r>
+        <w:rPr>
+          <w:rFonts w:cs="Times New Roman"/>
+        </w:rPr>
+        <w:t xml:space="preserve"> This pattern fits with the regularising effect of the augmentation applied during training</w:t>
+      </w:r>
+      <w:r>
+        <w:rPr>
+          <w:rFonts w:cs="Times New Roman"/>
+        </w:rPr>
+        <w:t>.</w:t>
       </w:r>
     </w:p>
     <w:p>
@@ -7073,7 +6846,19 @@
         <w:rPr>
           <w:rFonts w:cs="Times New Roman"/>
         </w:rPr>
-        <w:t>The confusion matrix indicates that remaining misclassifications concentrate among visually similar classes rather than spreading randomly across the label set. The most frequent confusions were Tomato Yellow Leaf Curl Virus predicted as Tomato Bacterial spot (14 instances), Tomato Two-spotted spider mite predicted as Tomato Target Spot (12), and Tomato Late blight predicted as Tomato Early blight (11). Every confused pair belongs to the same crop species and shares a similar lesion pattern, a plausible source of difficulty for a classifier relying on colour and texture cues alone.</w:t>
+        <w:t>The confusion matrix indicates that remaining misclassifications concentrate among visually similar classes rather than spreading randomly across the label set. The most frequent confusions were Tomato Yellow Leaf Curl Virus predicted as Tomato Bacterial spot (14 instances), Tomato Two-spotted spider mite predicted as Tomato Target Spot (12), and Tomato Late blight predicted as Tomato Early blight (11).</w:t>
+      </w:r>
+      <w:r>
+        <w:rPr>
+          <w:rFonts w:cs="Times New Roman"/>
+        </w:rPr>
+        <w:t xml:space="preserve"> </w:t>
+      </w:r>
+      <w:r>
+        <w:rPr>
+          <w:rFonts w:cs="Times New Roman"/>
+        </w:rPr>
+        <w:t>Every confused pair belongs to the same crop species and shares a similar lesion pattern, which is understandably hard for a classifier working from colour and texture alone.</w:t>
       </w:r>
     </w:p>
     <w:p>
@@ -7110,21 +6895,13 @@
         <w:rPr>
           <w:rFonts w:cs="Times New Roman"/>
         </w:rPr>
-        <w:t>Independently of these results, two design level limitations are identified. First, the aerial imaging conditions targeted here are simulated through augmentation of ground level, close range photographs rather than genuine drone imagery. This is a reasonable proxy where aerial training data is unavailable, but it does not reproduce every characteristic of true UAV imagery, such as the relationship between altitude and object scale; UAV specific datasets referenced in reviews of AI enabled UAV systems (</w:t>
-      </w:r>
-      <w:proofErr w:type="spellStart"/>
-      <w:r>
-        <w:rPr>
-          <w:rFonts w:cs="Times New Roman"/>
-        </w:rPr>
-        <w:t>arXiv</w:t>
-      </w:r>
-      <w:proofErr w:type="spellEnd"/>
-      <w:r>
-        <w:rPr>
-          <w:rFonts w:cs="Times New Roman"/>
-        </w:rPr>
-        <w:t>, 2023) and recent drone-based work (Manoj et al., 2025) offer a more direct path to closing this gap.</w:t>
+        <w:t>Two limitations sit apart from these results, however</w:t>
+      </w:r>
+      <w:r>
+        <w:rPr>
+          <w:rFonts w:cs="Times New Roman"/>
+        </w:rPr>
+        <w:t>. First, the aerial imaging conditions targeted here are simulated through augmentation of ground level, close range photographs rather than genuine drone imagery. This is a reasonable proxy where aerial training data is unavailable, but it does not reproduce every characteristic of true UAV imagery, such as the relationship between altitude and object scale; UAV specific datasets referenced in reviews of AI enabled UAV systems (arXiv, 2023) and recent drone-based work (Manoj et al., 2025) offer a more direct path to closing this gap.</w:t>
       </w:r>
     </w:p>
     <w:p>
@@ -7140,21 +6917,7 @@
         <w:rPr>
           <w:rFonts w:cs="Times New Roman"/>
         </w:rPr>
-        <w:t xml:space="preserve">Second, class imbalance in </w:t>
-      </w:r>
-      <w:proofErr w:type="spellStart"/>
-      <w:r>
-        <w:rPr>
-          <w:rFonts w:cs="Times New Roman"/>
-        </w:rPr>
-        <w:t>PlantVillage</w:t>
-      </w:r>
-      <w:proofErr w:type="spellEnd"/>
-      <w:r>
-        <w:rPr>
-          <w:rFonts w:cs="Times New Roman"/>
-        </w:rPr>
-        <w:t xml:space="preserve"> means that, without intervention such as class weighted loss, the classifier risks weaker performance on rarer disease categories, where correct detection matters most. The parameter count achieved supports the goal of onboard, low power inference. A realistic path to field deployment would require converting the model to a runtime format such as TensorFlow Lite or ONNX, integrating GPS metadata to map detections onto the field, and validating against genuine UAV imagery.</w:t>
+        <w:t>Second, class imbalance in PlantVillage means that, without intervention such as class weighted loss, the classifier risks weaker performance on rarer disease categories, where correct detection matters most. The parameter count achieved supports the goal of onboard, low power inference. A realistic path to field deployment would require converting the model to a runtime format such as TensorFlow Lite or ONNX, integrating GPS metadata to map detections onto the field, and validating against genuine UAV imagery.</w:t>
       </w:r>
     </w:p>
     <w:bookmarkEnd w:id="16"/>
@@ -7225,21 +6988,7 @@
         <w:rPr>
           <w:rFonts w:ascii="Times New Roman" w:hAnsi="Times New Roman" w:cs="Times New Roman"/>
         </w:rPr>
-        <w:t xml:space="preserve">Task 2 addresses vision guided navigation for a simulated TurtleBot3 mobile robot, run within </w:t>
-      </w:r>
-      <w:proofErr w:type="spellStart"/>
-      <w:r>
-        <w:rPr>
-          <w:rFonts w:ascii="Times New Roman" w:hAnsi="Times New Roman" w:cs="Times New Roman"/>
-        </w:rPr>
-        <w:t>TheConstruct.ai's</w:t>
-      </w:r>
-      <w:proofErr w:type="spellEnd"/>
-      <w:r>
-        <w:rPr>
-          <w:rFonts w:ascii="Times New Roman" w:hAnsi="Times New Roman" w:cs="Times New Roman"/>
-        </w:rPr>
-        <w:t xml:space="preserve"> ROS 2 Gazebo environment (TheConstruct.ai, 2024). The objective is for the robot to detect a coloured marker using its onboard RGB camera and navigate toward it using simple, interpretable vision-based rules rather than a learned control policy.</w:t>
+        <w:t>Task 2 addresses vision guided navigation for a simulated TurtleBot3 mobile robot, run within TheConstruct.ai's ROS 2 Gazebo environment (TheConstruct.ai, 2024). The objective is for the robot to detect a coloured marker using its onboard RGB camera and navigate toward it using simple, interpretable vision-based rules rather than a learned control policy.</w:t>
       </w:r>
     </w:p>
     <w:p>
@@ -7254,49 +7003,7 @@
         <w:rPr>
           <w:rFonts w:cs="Times New Roman"/>
         </w:rPr>
-        <w:t xml:space="preserve">Development and testing were carried out on </w:t>
-      </w:r>
-      <w:proofErr w:type="spellStart"/>
-      <w:r>
-        <w:rPr>
-          <w:rFonts w:cs="Times New Roman"/>
-        </w:rPr>
-        <w:t>TheConstruct.ai's</w:t>
-      </w:r>
-      <w:proofErr w:type="spellEnd"/>
-      <w:r>
-        <w:rPr>
-          <w:rFonts w:cs="Times New Roman"/>
-        </w:rPr>
-        <w:t xml:space="preserve"> browser based </w:t>
-      </w:r>
-      <w:proofErr w:type="spellStart"/>
-      <w:r>
-        <w:rPr>
-          <w:rFonts w:cs="Times New Roman"/>
-        </w:rPr>
-        <w:t>ROSject</w:t>
-      </w:r>
-      <w:proofErr w:type="spellEnd"/>
-      <w:r>
-        <w:rPr>
-          <w:rFonts w:cs="Times New Roman"/>
-        </w:rPr>
-        <w:t xml:space="preserve"> platform, inside </w:t>
-      </w:r>
-      <w:proofErr w:type="spellStart"/>
-      <w:r>
-        <w:rPr>
-          <w:rFonts w:cs="Times New Roman"/>
-        </w:rPr>
-        <w:t>ROSject</w:t>
-      </w:r>
-      <w:proofErr w:type="spellEnd"/>
-      <w:r>
-        <w:rPr>
-          <w:rFonts w:cs="Times New Roman"/>
-        </w:rPr>
-        <w:t xml:space="preserve"> vVGb1L3fxD (URL identifier 1049584), workspace ros2_ws. The free tier does not issue a permanent shareable URL; the project was instead made public under its title, vVGb1L3fxD, in the platform's public index, satisfying the brief's accessibility requirement. Figure 7 shows this workspace, including the turtlebot3_vision_nav package structure and a terminal session used to query the running nodes.</w:t>
+        <w:t>Development and testing were carried out on TheConstruct.ai's browser based ROSject platform, inside ROSject vVGb1L3fxD (URL identifier 1049584), workspace ros2_ws. The free tier does not issue a permanent shareable URL; the project was instead made public under its title, vVGb1L3fxD, in the platform's public index, satisfying the brief's accessibility requirement. Figure 7 shows this workspace, including the turtlebot3_vision_nav package structure and a terminal session used to query the running nodes.</w:t>
       </w:r>
     </w:p>
     <w:p>
@@ -7383,47 +7090,7 @@
         <w:fldChar w:fldCharType="end"/>
       </w:r>
       <w:r>
-        <w:t xml:space="preserve">: TheConstruct.ai </w:t>
-      </w:r>
-      <w:proofErr w:type="spellStart"/>
-      <w:r>
-        <w:t>ROSject</w:t>
-      </w:r>
-      <w:proofErr w:type="spellEnd"/>
-      <w:r>
-        <w:t xml:space="preserve"> workspace (</w:t>
-      </w:r>
-      <w:proofErr w:type="spellStart"/>
-      <w:r>
-        <w:t>rosject</w:t>
-      </w:r>
-      <w:proofErr w:type="spellEnd"/>
-      <w:r>
-        <w:t xml:space="preserve"> 1049584), showing the turtlebot3_vision_nav package files and a terminal session used to inspect /</w:t>
-      </w:r>
-      <w:proofErr w:type="spellStart"/>
-      <w:r>
-        <w:t>cmd_vel</w:t>
-      </w:r>
-      <w:proofErr w:type="spellEnd"/>
-      <w:r>
-        <w:t>, /</w:t>
-      </w:r>
-      <w:proofErr w:type="spellStart"/>
-      <w:r>
-        <w:t>target_offset</w:t>
-      </w:r>
-      <w:proofErr w:type="spellEnd"/>
-      <w:r>
-        <w:t xml:space="preserve"> and /</w:t>
-      </w:r>
-      <w:proofErr w:type="spellStart"/>
-      <w:r>
-        <w:t>target_visible</w:t>
-      </w:r>
-      <w:proofErr w:type="spellEnd"/>
-      <w:r>
-        <w:t xml:space="preserve"> directly with ros2 topic echo.</w:t>
+        <w:t>: TheConstruct.ai ROSject workspace (rosject 1049584), showing the turtlebot3_vision_nav package files and a terminal session used to inspect /cmd_vel, /target_offset and /target_visible directly with ros2 topic echo.</w:t>
       </w:r>
       <w:bookmarkEnd w:id="22"/>
     </w:p>
@@ -7464,7 +7131,6 @@
         </w:rPr>
         <w:t xml:space="preserve"> provided with the TurtleBot3 packages, run in Gazebo Sim with the </w:t>
       </w:r>
-      <w:proofErr w:type="spellStart"/>
       <w:r>
         <w:rPr>
           <w:rStyle w:val="VerbatimChar"/>
@@ -7472,7 +7138,6 @@
         </w:rPr>
         <w:t>waffle_pi</w:t>
       </w:r>
-      <w:proofErr w:type="spellEnd"/>
       <w:r>
         <w:rPr>
           <w:rFonts w:cs="Times New Roman"/>
@@ -7564,15 +7229,7 @@
         <w:fldChar w:fldCharType="end"/>
       </w:r>
       <w:r>
-        <w:t xml:space="preserve">: The </w:t>
-      </w:r>
-      <w:proofErr w:type="spellStart"/>
-      <w:r>
-        <w:t>waffle_pi</w:t>
-      </w:r>
-      <w:proofErr w:type="spellEnd"/>
-      <w:r>
-        <w:t xml:space="preserve"> TurtleBot3 spawned in turtlebot3_world, showing the entity tree and simulation configuration.</w:t>
+        <w:t>: The waffle_pi TurtleBot3 spawned in turtlebot3_world, showing the entity tree and simulation configuration.</w:t>
       </w:r>
       <w:bookmarkEnd w:id="23"/>
     </w:p>
@@ -7697,7 +7354,7 @@
         <w:rPr>
           <w:rFonts w:ascii="Times New Roman" w:hAnsi="Times New Roman" w:cs="Times New Roman"/>
         </w:rPr>
-        <w:t>The system is structured as two ROS 2 nodes connected by two lightweight topics, following the standard principle of separating perception from control so each stage can be tested independently (Quigley et al., 2009). Both nodes are thin wrappers around plain Python modules, vision_core.py and control_core.py, with no ROS dependency, so detection and control algorithms could be developed and verified outside a running simulation.</w:t>
+        <w:t>The system comprises two ROS 2 nodes linked by two lightweight topics, following the standard practice of separating perception from control so each stage can be tested independently (Quigley et al., 2009). Both nodes wrap plain Python modules, vision_core.py and control_core.py, with no ROS dependency, allowing detection and control to be verified outside the simulation.</w:t>
       </w:r>
     </w:p>
     <w:p>
@@ -7811,35 +7468,7 @@
         <w:rPr>
           <w:rFonts w:cs="Times New Roman"/>
         </w:rPr>
-        <w:t xml:space="preserve">The perception logic, in the node </w:t>
-      </w:r>
-      <w:proofErr w:type="spellStart"/>
-      <w:r>
-        <w:rPr>
-          <w:rFonts w:cs="Times New Roman"/>
-        </w:rPr>
-        <w:t>vision_detector</w:t>
-      </w:r>
-      <w:proofErr w:type="spellEnd"/>
-      <w:r>
-        <w:rPr>
-          <w:rFonts w:cs="Times New Roman"/>
-        </w:rPr>
-        <w:t xml:space="preserve">, converts each camera frame to HSV colour space, since HSV separates colour from brightness and is more robust to lighting variation than RGB thresholding. A binary mask isolating the target colour range is cleaned using morphological opening and closing, and the largest resulting contour, above a minimum area threshold, is taken as the detected marker. Its centroid's horizontal offset from the frame's vertical centre is normalised to minus one to one and published with a </w:t>
-      </w:r>
-      <w:proofErr w:type="spellStart"/>
-      <w:r>
-        <w:rPr>
-          <w:rFonts w:cs="Times New Roman"/>
-        </w:rPr>
-        <w:t>boolean</w:t>
-      </w:r>
-      <w:proofErr w:type="spellEnd"/>
-      <w:r>
-        <w:rPr>
-          <w:rFonts w:cs="Times New Roman"/>
-        </w:rPr>
-        <w:t xml:space="preserve"> visibility flag.</w:t>
+        <w:t>In vision_detector, each frame is converted to HSV colour space, chosen over RGB for its robustness to lighting variation. A binary mask of the target colour range is cleaned via morphological opening and closing, and the largest contour above a minimum area threshold is taken as the marker. Its centroid offset is normalised to minus one to one and published with a visibility flag.</w:t>
       </w:r>
     </w:p>
     <w:p>
@@ -7854,21 +7483,13 @@
         <w:rPr>
           <w:rFonts w:cs="Times New Roman"/>
         </w:rPr>
-        <w:t xml:space="preserve">The navigation logic, in the node </w:t>
-      </w:r>
-      <w:proofErr w:type="spellStart"/>
-      <w:r>
-        <w:rPr>
-          <w:rFonts w:cs="Times New Roman"/>
-        </w:rPr>
-        <w:t>navigation_controller</w:t>
-      </w:r>
-      <w:proofErr w:type="spellEnd"/>
-      <w:r>
-        <w:rPr>
-          <w:rFonts w:cs="Times New Roman"/>
-        </w:rPr>
-        <w:t>, subscribes to both signals and implements the rule-based control. If no marker is visible, the robot rotates slowly to search. If visible and its offset exceeds a centring threshold, it rotates toward the marker, turn rate scaled to the offset and clamped to a maximum angular velocity. If visible and centred, it drives forward at a fixed, capped speed. Velocity commands publish at roughly ten hertz.</w:t>
+        <w:t xml:space="preserve">The </w:t>
+      </w:r>
+      <w:r>
+        <w:rPr>
+          <w:rFonts w:cs="Times New Roman"/>
+        </w:rPr>
+        <w:t>navigation_controller node subscribes to both signals and runs the rule-based controller. With no marker visible, the robot rotates slowly to search. Once visible, it turns toward the marker if the offset exceeds a centring threshold, scaling turn rate to offset and capping angular velocity, then drives forward at a fixed speed once centred, publishing commands at roughly ten hertz.</w:t>
       </w:r>
     </w:p>
     <w:p>
@@ -7902,21 +7523,7 @@
         <w:rPr>
           <w:rFonts w:ascii="Times New Roman" w:hAnsi="Times New Roman" w:cs="Times New Roman"/>
         </w:rPr>
-        <w:t xml:space="preserve">Testing proceeded in two stages: perception and control logic was first verified offline against seven synthetic test frames covering the scenarios the brief recommends, shown in Figure 11, then the same nodes were launched inside the </w:t>
-      </w:r>
-      <w:proofErr w:type="spellStart"/>
-      <w:r>
-        <w:rPr>
-          <w:rFonts w:ascii="Times New Roman" w:hAnsi="Times New Roman" w:cs="Times New Roman"/>
-        </w:rPr>
-        <w:t>ROSject</w:t>
-      </w:r>
-      <w:proofErr w:type="spellEnd"/>
-      <w:r>
-        <w:rPr>
-          <w:rFonts w:ascii="Times New Roman" w:hAnsi="Times New Roman" w:cs="Times New Roman"/>
-        </w:rPr>
-        <w:t xml:space="preserve"> and queried directly against the live simulation using ros2 topic echo.</w:t>
+        <w:t>Testing proceeded in two stages: perception and control logic was first verified offline against seven synthetic test frames covering the scenarios the brief recommends, shown in Figure 11, then the same nodes were launched inside the ROSject and queried directly against the live simulation using ros2 topic echo.</w:t>
       </w:r>
     </w:p>
     <w:p>
@@ -8165,19 +7772,11 @@
                 <w:rFonts w:ascii="Times New Roman" w:hAnsi="Times New Roman" w:cs="Times New Roman"/>
               </w:rPr>
             </w:pPr>
-            <w:proofErr w:type="spellStart"/>
-            <w:r>
-              <w:rPr>
-                <w:rFonts w:ascii="Times New Roman" w:hAnsi="Times New Roman" w:cs="Times New Roman"/>
-              </w:rPr>
-              <w:t>lin_x</w:t>
-            </w:r>
-            <w:proofErr w:type="spellEnd"/>
-            <w:r>
-              <w:rPr>
-                <w:rFonts w:ascii="Times New Roman" w:hAnsi="Times New Roman" w:cs="Times New Roman"/>
-              </w:rPr>
-              <w:t xml:space="preserve"> (m/s)</w:t>
+            <w:r>
+              <w:rPr>
+                <w:rFonts w:ascii="Times New Roman" w:hAnsi="Times New Roman" w:cs="Times New Roman"/>
+              </w:rPr>
+              <w:t>lin_x (m/s)</w:t>
             </w:r>
           </w:p>
         </w:tc>
@@ -8200,19 +7799,11 @@
                 <w:rFonts w:ascii="Times New Roman" w:hAnsi="Times New Roman" w:cs="Times New Roman"/>
               </w:rPr>
             </w:pPr>
-            <w:proofErr w:type="spellStart"/>
-            <w:r>
-              <w:rPr>
-                <w:rFonts w:ascii="Times New Roman" w:hAnsi="Times New Roman" w:cs="Times New Roman"/>
-              </w:rPr>
-              <w:t>ang_z</w:t>
-            </w:r>
-            <w:proofErr w:type="spellEnd"/>
-            <w:r>
-              <w:rPr>
-                <w:rFonts w:ascii="Times New Roman" w:hAnsi="Times New Roman" w:cs="Times New Roman"/>
-              </w:rPr>
-              <w:t xml:space="preserve"> (rad/s)</w:t>
+            <w:r>
+              <w:rPr>
+                <w:rFonts w:ascii="Times New Roman" w:hAnsi="Times New Roman" w:cs="Times New Roman"/>
+              </w:rPr>
+              <w:t>ang_z (rad/s)</w:t>
             </w:r>
           </w:p>
         </w:tc>
@@ -9388,21 +8979,13 @@
           <w:rFonts w:cs="Times New Roman"/>
         </w:rPr>
         <w:lastRenderedPageBreak/>
-        <w:t xml:space="preserve">Following this offline verification, the same nodes were launched inside the </w:t>
-      </w:r>
-      <w:proofErr w:type="spellStart"/>
-      <w:r>
-        <w:rPr>
-          <w:rFonts w:cs="Times New Roman"/>
-        </w:rPr>
-        <w:t>ROSject</w:t>
-      </w:r>
-      <w:proofErr w:type="spellEnd"/>
-      <w:r>
-        <w:rPr>
-          <w:rFonts w:cs="Times New Roman"/>
-        </w:rPr>
-        <w:t xml:space="preserve"> and queried directly while a marker was visible to the simulated camera, giving a genuine closed loop result rather than a synthetic prediction. Table 4 reports the values obtained.</w:t>
+        <w:t>After this offline check, the same nodes were launched inside the ROSject and queried while a marker sat in view of the simulated camera. This time the result was a genuine closed-loop outcome rather than a synthetic prediction</w:t>
+      </w:r>
+      <w:r>
+        <w:rPr>
+          <w:rFonts w:cs="Times New Roman"/>
+        </w:rPr>
+        <w:t>.</w:t>
       </w:r>
     </w:p>
     <w:p>
@@ -9433,15 +9016,7 @@
         <w:fldChar w:fldCharType="end"/>
       </w:r>
       <w:r>
-        <w:t xml:space="preserve">: Live </w:t>
-      </w:r>
-      <w:proofErr w:type="spellStart"/>
-      <w:r>
-        <w:t>ROSject</w:t>
-      </w:r>
-      <w:proofErr w:type="spellEnd"/>
-      <w:r>
-        <w:t xml:space="preserve"> verification (ros2 topic echo, single query each, shown in Figure </w:t>
+        <w:t xml:space="preserve">: Live ROSject verification (ros2 topic echo, single query each, shown in Figure </w:t>
       </w:r>
       <w:r>
         <w:t>7</w:t>
@@ -9550,17 +9125,8 @@
                 <w:rStyle w:val="VerbatimChar"/>
                 <w:rFonts w:ascii="Times New Roman" w:hAnsi="Times New Roman" w:cs="Times New Roman"/>
               </w:rPr>
-              <w:t>/</w:t>
-            </w:r>
-            <w:proofErr w:type="spellStart"/>
-            <w:r>
-              <w:rPr>
-                <w:rStyle w:val="VerbatimChar"/>
-                <w:rFonts w:ascii="Times New Roman" w:hAnsi="Times New Roman" w:cs="Times New Roman"/>
-              </w:rPr>
-              <w:t>target_visible</w:t>
-            </w:r>
-            <w:proofErr w:type="spellEnd"/>
+              <w:t>/target_visible</w:t>
+            </w:r>
           </w:p>
         </w:tc>
         <w:tc>
@@ -9617,17 +9183,8 @@
                 <w:rStyle w:val="VerbatimChar"/>
                 <w:rFonts w:ascii="Times New Roman" w:hAnsi="Times New Roman" w:cs="Times New Roman"/>
               </w:rPr>
-              <w:t>/</w:t>
-            </w:r>
-            <w:proofErr w:type="spellStart"/>
-            <w:r>
-              <w:rPr>
-                <w:rStyle w:val="VerbatimChar"/>
-                <w:rFonts w:ascii="Times New Roman" w:hAnsi="Times New Roman" w:cs="Times New Roman"/>
-              </w:rPr>
-              <w:t>target_offset</w:t>
-            </w:r>
-            <w:proofErr w:type="spellEnd"/>
+              <w:t>/target_offset</w:t>
+            </w:r>
           </w:p>
         </w:tc>
         <w:tc>
@@ -9683,31 +9240,14 @@
                 <w:rStyle w:val="VerbatimChar"/>
                 <w:rFonts w:ascii="Times New Roman" w:hAnsi="Times New Roman" w:cs="Times New Roman"/>
               </w:rPr>
-              <w:t>/</w:t>
-            </w:r>
-            <w:proofErr w:type="spellStart"/>
-            <w:r>
-              <w:rPr>
-                <w:rStyle w:val="VerbatimChar"/>
-                <w:rFonts w:ascii="Times New Roman" w:hAnsi="Times New Roman" w:cs="Times New Roman"/>
-              </w:rPr>
-              <w:t>cmd_vel</w:t>
-            </w:r>
-            <w:proofErr w:type="spellEnd"/>
-            <w:r>
-              <w:rPr>
-                <w:rFonts w:ascii="Times New Roman" w:hAnsi="Times New Roman" w:cs="Times New Roman"/>
-              </w:rPr>
-              <w:t xml:space="preserve"> </w:t>
-            </w:r>
-            <w:proofErr w:type="spellStart"/>
-            <w:r>
-              <w:rPr>
-                <w:rFonts w:ascii="Times New Roman" w:hAnsi="Times New Roman" w:cs="Times New Roman"/>
-              </w:rPr>
-              <w:t>linear.x</w:t>
-            </w:r>
-            <w:proofErr w:type="spellEnd"/>
+              <w:t>/cmd_vel</w:t>
+            </w:r>
+            <w:r>
+              <w:rPr>
+                <w:rFonts w:ascii="Times New Roman" w:hAnsi="Times New Roman" w:cs="Times New Roman"/>
+              </w:rPr>
+              <w:t xml:space="preserve"> linear.x</w:t>
+            </w:r>
           </w:p>
         </w:tc>
         <w:tc>
@@ -9764,31 +9304,14 @@
                 <w:rStyle w:val="VerbatimChar"/>
                 <w:rFonts w:ascii="Times New Roman" w:hAnsi="Times New Roman" w:cs="Times New Roman"/>
               </w:rPr>
-              <w:t>/</w:t>
-            </w:r>
-            <w:proofErr w:type="spellStart"/>
-            <w:r>
-              <w:rPr>
-                <w:rStyle w:val="VerbatimChar"/>
-                <w:rFonts w:ascii="Times New Roman" w:hAnsi="Times New Roman" w:cs="Times New Roman"/>
-              </w:rPr>
-              <w:t>cmd_vel</w:t>
-            </w:r>
-            <w:proofErr w:type="spellEnd"/>
-            <w:r>
-              <w:rPr>
-                <w:rFonts w:ascii="Times New Roman" w:hAnsi="Times New Roman" w:cs="Times New Roman"/>
-              </w:rPr>
-              <w:t xml:space="preserve"> </w:t>
-            </w:r>
-            <w:proofErr w:type="spellStart"/>
-            <w:r>
-              <w:rPr>
-                <w:rFonts w:ascii="Times New Roman" w:hAnsi="Times New Roman" w:cs="Times New Roman"/>
-              </w:rPr>
-              <w:t>angular.z</w:t>
-            </w:r>
-            <w:proofErr w:type="spellEnd"/>
+              <w:t>/cmd_vel</w:t>
+            </w:r>
+            <w:r>
+              <w:rPr>
+                <w:rFonts w:ascii="Times New Roman" w:hAnsi="Times New Roman" w:cs="Times New Roman"/>
+              </w:rPr>
+              <w:t xml:space="preserve"> angular.z</w:t>
+            </w:r>
           </w:p>
         </w:tc>
         <w:tc>
@@ -9833,63 +9356,19 @@
         <w:rPr>
           <w:rFonts w:cs="Times New Roman"/>
         </w:rPr>
-        <w:t>This is consistent with the proportional law verified offline: the maximum angular velocity, 0.60 rad/s, is reached at the maximum test offset, 0.75, giving a gain of 0.8 rad/s per unit offset. Applying this to the live offset of -0.4618 gives 0.3694 rad/s, matching the live /</w:t>
-      </w:r>
-      <w:proofErr w:type="spellStart"/>
-      <w:r>
-        <w:rPr>
-          <w:rFonts w:cs="Times New Roman"/>
-        </w:rPr>
-        <w:t>cmd_vel</w:t>
-      </w:r>
-      <w:proofErr w:type="spellEnd"/>
-      <w:r>
-        <w:rPr>
-          <w:rFonts w:cs="Times New Roman"/>
-        </w:rPr>
-        <w:t xml:space="preserve"> value of 0.36944 rad/s to five decimal places. The negative offset correctly produced a positive </w:t>
-      </w:r>
-      <w:proofErr w:type="spellStart"/>
-      <w:r>
-        <w:rPr>
-          <w:rFonts w:cs="Times New Roman"/>
-        </w:rPr>
-        <w:t>angular.z</w:t>
-      </w:r>
-      <w:proofErr w:type="spellEnd"/>
-      <w:r>
-        <w:rPr>
-          <w:rFonts w:cs="Times New Roman"/>
-        </w:rPr>
-        <w:t xml:space="preserve"> (a left turn), and </w:t>
-      </w:r>
-      <w:proofErr w:type="spellStart"/>
-      <w:r>
-        <w:rPr>
-          <w:rFonts w:cs="Times New Roman"/>
-        </w:rPr>
-        <w:t>linear.x</w:t>
-      </w:r>
-      <w:proofErr w:type="spellEnd"/>
-      <w:r>
-        <w:rPr>
-          <w:rFonts w:cs="Times New Roman"/>
-        </w:rPr>
-        <w:t xml:space="preserve"> remained zero since the offset exceeded the centring threshold, closing the loop between offline verification and genuine </w:t>
-      </w:r>
-      <w:proofErr w:type="spellStart"/>
-      <w:r>
-        <w:rPr>
-          <w:rFonts w:cs="Times New Roman"/>
-        </w:rPr>
-        <w:t>ROSject</w:t>
-      </w:r>
-      <w:proofErr w:type="spellEnd"/>
-      <w:r>
-        <w:rPr>
-          <w:rFonts w:cs="Times New Roman"/>
-        </w:rPr>
-        <w:t xml:space="preserve"> behaviour.</w:t>
+        <w:t>This matches the proportional law confirmed offline: the maximum angular velocity of 0.60 rad/s occurs at the maximum test offset of 0.75, giving a gain of 0.8 rad/s per unit offset</w:t>
+      </w:r>
+      <w:r>
+        <w:rPr>
+          <w:rFonts w:cs="Times New Roman"/>
+        </w:rPr>
+        <w:t xml:space="preserve">. </w:t>
+      </w:r>
+      <w:r>
+        <w:rPr>
+          <w:rFonts w:cs="Times New Roman"/>
+        </w:rPr>
+        <w:t>Applying this to the live offset of -0.4618 gives 0.3694 rad/s, matching the live /cmd_vel value of 0.36944 rad/s to five decimal places. The negative offset correctly produced a positive angular.z (a left turn), and linear.x remained zero since the offset exceeded the centring threshold, closing the loop between offline verification and genuine ROSject behaviour.</w:t>
       </w:r>
     </w:p>
     <w:p>
@@ -9923,7 +9402,37 @@
         <w:rPr>
           <w:rFonts w:ascii="Times New Roman" w:hAnsi="Times New Roman" w:cs="Times New Roman"/>
         </w:rPr>
-        <w:t>The principal limitation of a pure HSV colour thresholding approach is its dependence on a manually tuned colour range, which makes the system sensitive to lighting changes not captured during tuning and unable to distinguish the marker from another object of similar colour. This is a reasonable trade-off for a task scoped to elementary perception and navigation, but would not scale to multiple similar objects or unpredictable lighting.</w:t>
+        <w:t>The principal limitation of a pure HSV colour thresholding approach is its dependence on a manually tuned colour range, which makes the system sensitive to lighting changes not captured during tuning and unable to distinguish the marker from another object of similar colour</w:t>
+      </w:r>
+      <w:r>
+        <w:rPr>
+          <w:rFonts w:ascii="Times New Roman" w:hAnsi="Times New Roman" w:cs="Times New Roman"/>
+        </w:rPr>
+        <w:t xml:space="preserve">. </w:t>
+      </w:r>
+      <w:r>
+        <w:rPr>
+          <w:rFonts w:ascii="Times New Roman" w:hAnsi="Times New Roman" w:cs="Times New Roman"/>
+        </w:rPr>
+        <w:t xml:space="preserve">That trade-off is acceptable for a task scoped to </w:t>
+      </w:r>
+      <w:r>
+        <w:rPr>
+          <w:rFonts w:ascii="Times New Roman" w:hAnsi="Times New Roman" w:cs="Times New Roman"/>
+        </w:rPr>
+        <w:t xml:space="preserve">basic </w:t>
+      </w:r>
+      <w:r>
+        <w:rPr>
+          <w:rFonts w:ascii="Times New Roman" w:hAnsi="Times New Roman" w:cs="Times New Roman"/>
+        </w:rPr>
+        <w:t>perception and navigation, but the approach wouldn't hold up with multiple similar objects or unpredictable lighting</w:t>
+      </w:r>
+      <w:r>
+        <w:rPr>
+          <w:rFonts w:ascii="Times New Roman" w:hAnsi="Times New Roman" w:cs="Times New Roman"/>
+        </w:rPr>
+        <w:t>.</w:t>
       </w:r>
     </w:p>
     <w:p>
@@ -9955,16 +9464,32 @@
         <w:rPr>
           <w:rFonts w:cs="Times New Roman"/>
         </w:rPr>
-        <w:t xml:space="preserve">Together, the offline and live verification confirm that the perception and control algorithms behave correctly both in isolation and once deployed, including correctly rejecting the distractor and matching the controller's exact proportional gain. A full live sweep of every offline scenario remains a direction for a longer testing </w:t>
-      </w:r>
-      <w:proofErr w:type="spellStart"/>
-      <w:r>
-        <w:rPr>
-          <w:rFonts w:cs="Times New Roman"/>
-        </w:rPr>
-        <w:t>session.</w:t>
-      </w:r>
-      <w:proofErr w:type="spellEnd"/>
+        <w:t>The offline and live results, taken as a whole, confirm the perception and control algorithms behave correctly both in isolation and once deployed</w:t>
+      </w:r>
+      <w:r>
+        <w:rPr>
+          <w:rFonts w:cs="Times New Roman"/>
+        </w:rPr>
+        <w:t>,</w:t>
+      </w:r>
+      <w:r>
+        <w:rPr>
+          <w:rFonts w:cs="Times New Roman"/>
+        </w:rPr>
+        <w:t xml:space="preserve"> including correctly rejecting the distractor and matching the controller's exact proportional gain</w:t>
+      </w:r>
+      <w:r>
+        <w:rPr>
+          <w:rFonts w:cs="Times New Roman"/>
+        </w:rPr>
+        <w:t>.</w:t>
+      </w:r>
+      <w:r>
+        <w:rPr>
+          <w:rFonts w:cs="Times New Roman"/>
+        </w:rPr>
+        <w:t xml:space="preserve"> A full live sweep of every offline scenario remains a direction for a longer testing session.</w:t>
+      </w:r>
     </w:p>
     <w:p>
       <w:pPr>
@@ -9979,7 +9504,19 @@
           <w:rFonts w:cs="Times New Roman"/>
         </w:rPr>
         <w:lastRenderedPageBreak/>
-        <w:t>Mapping this design to real world mobile robotics, colour based marker following is a reasonable starting point for constrained indoor navigation where markers can be deliberately placed and coloured, but production systems for less controlled environments increasingly combine this kind of lightweight visual cue with learned object detection and SLAM, for navigation that does not depend on a target remaining continuously visible.</w:t>
+        <w:t>Mapping this design to real world mobile robotics, colour</w:t>
+      </w:r>
+      <w:r>
+        <w:rPr>
+          <w:rFonts w:cs="Times New Roman"/>
+        </w:rPr>
+        <w:t>-</w:t>
+      </w:r>
+      <w:r>
+        <w:rPr>
+          <w:rFonts w:cs="Times New Roman"/>
+        </w:rPr>
+        <w:t>based marker following is a reasonable starting point for constrained indoor navigation where markers can be deliberately placed and coloured, but production systems for less controlled environments increasingly combine this kind of lightweight visual cue with learned object detection and SLAM, for navigation that does not depend on a target remaining continuously visible.</w:t>
       </w:r>
     </w:p>
     <w:p>
@@ -10045,7 +9582,25 @@
         <w:rPr>
           <w:rFonts w:cs="Times New Roman"/>
         </w:rPr>
-        <w:t>This follows from the tasks differing requirements rather than inconsistency. A drone survey can tolerate a per-image delay of a fraction of a second, whereas real-time navigation must produce a control decision on every frame with minimal latency, favouring cheap colour thresholding over a neural network pass for this task. Together, the two tasks show robotic vision is not one technique applied uniformly, but complementary approaches chosen by computational budget, latency and available training data.</w:t>
+        <w:t>That difference comes from what each task demands, not from any inconsistency in approach</w:t>
+      </w:r>
+      <w:r>
+        <w:rPr>
+          <w:rFonts w:cs="Times New Roman"/>
+        </w:rPr>
+        <w:t>.</w:t>
+      </w:r>
+      <w:r>
+        <w:rPr>
+          <w:rFonts w:cs="Times New Roman"/>
+        </w:rPr>
+        <w:t xml:space="preserve"> A drone survey can tolerate a per-image delay of a fraction of a second, whereas real-time navigation must produce a control decision on every frame with minimal latency, favouring cheap colour thresholding over a neural network pass for this task. </w:t>
+      </w:r>
+      <w:r>
+        <w:rPr>
+          <w:rFonts w:cs="Times New Roman"/>
+        </w:rPr>
+        <w:t>Put side by side, the two tasks make a simple point: robotic vision isn't one technique applied everywhere. It's a set of complementary approaches, each chosen for its computational budget, latency and available training data.</w:t>
       </w:r>
     </w:p>
     <w:p>
@@ -10078,35 +9633,7 @@
         <w:rPr>
           <w:rFonts w:ascii="Times New Roman" w:hAnsi="Times New Roman" w:cs="Times New Roman"/>
         </w:rPr>
-        <w:t xml:space="preserve">This report has presented two robotic vision systems for the module Advanced Robotics Automation and Computer Vision. Task 1 produced a MobileNetV2 based plant disease classifier trained on </w:t>
-      </w:r>
-      <w:proofErr w:type="spellStart"/>
-      <w:r>
-        <w:rPr>
-          <w:rFonts w:ascii="Times New Roman" w:hAnsi="Times New Roman" w:cs="Times New Roman"/>
-        </w:rPr>
-        <w:t>PlantVillage</w:t>
-      </w:r>
-      <w:proofErr w:type="spellEnd"/>
-      <w:r>
-        <w:rPr>
-          <w:rFonts w:ascii="Times New Roman" w:hAnsi="Times New Roman" w:cs="Times New Roman"/>
-        </w:rPr>
-        <w:t xml:space="preserve">, reaching the accuracy and F1 performance reported in the Executive Summary while remaining light enough for embedded deployment. Task 2 produced a ROS 2 perception and navigation design for a simulated TurtleBot3 using HSV colour thresholding and a rule-based controller, verified offline across seven scenarios and confirmed on the live </w:t>
-      </w:r>
-      <w:proofErr w:type="spellStart"/>
-      <w:r>
-        <w:rPr>
-          <w:rFonts w:ascii="Times New Roman" w:hAnsi="Times New Roman" w:cs="Times New Roman"/>
-        </w:rPr>
-        <w:t>ROSject</w:t>
-      </w:r>
-      <w:proofErr w:type="spellEnd"/>
-      <w:r>
-        <w:rPr>
-          <w:rFonts w:ascii="Times New Roman" w:hAnsi="Times New Roman" w:cs="Times New Roman"/>
-        </w:rPr>
-        <w:t>, matching the controller's proportional gain to five decimal places.</w:t>
+        <w:t>This report has presented two robotic vision systems for the module Advanced Robotics Automation and Computer Vision. Task 1 produced a MobileNetV2 based plant disease classifier trained on PlantVillage, reaching the accuracy and F1 performance reported in the Executive Summary while remaining light enough for embedded deployment. Task 2 produced a ROS 2 perception and navigation design for a simulated TurtleBot3 using HSV colour thresholding and a rule-based controller, verified offline across seven scenarios and confirmed on the live ROSject, matching the controller's proportional gain to five decimal places.</w:t>
       </w:r>
     </w:p>
     <w:p>
@@ -10121,7 +9648,13 @@
         <w:rPr>
           <w:rFonts w:cs="Times New Roman"/>
         </w:rPr>
-        <w:t>Limitations were identified honestly rather than overstated: Task 1’s reliance on augmentation as a proxy for genuine aerial imagery, and Task 2’s dependence on manually tuned colour thresholds. Addressing these, through genuine UAV training data and fuller in-simulation testing respectively, is a clear direction for further work.</w:t>
+        <w:t>The limitations were stated plainly rather than downplayed</w:t>
+      </w:r>
+      <w:r>
+        <w:rPr>
+          <w:rFonts w:cs="Times New Roman"/>
+        </w:rPr>
+        <w:t>: Task 1’s reliance on augmentation as a proxy for genuine aerial imagery, and Task 2’s dependence on manually tuned colour thresholds. Addressing these, through genuine UAV training data and fuller in-simulation testing respectively, is a clear direction for further work.</w:t>
       </w:r>
     </w:p>
     <w:p>
@@ -10171,7 +9704,19 @@
         <w:rPr>
           <w:rFonts w:cs="Times New Roman"/>
         </w:rPr>
-        <w:t>Perplexity AI was used in the preparation of this report to support literature searching, identify potentially relevant academic sources, and assist with grammar correction and word-limit reduction during editing. All sources included in the reference list were checked by the author and cited as the original academic works rather than citing Perplexity AI as a source. The analysis, interpretation, discussion, and final written content submitted in this report are the author’s own work and responsibility.</w:t>
+        <w:t>Perplexity AI (2026)</w:t>
+      </w:r>
+      <w:r>
+        <w:rPr>
+          <w:rFonts w:cs="Times New Roman"/>
+        </w:rPr>
+        <w:t xml:space="preserve"> </w:t>
+      </w:r>
+      <w:r>
+        <w:rPr>
+          <w:rFonts w:cs="Times New Roman"/>
+        </w:rPr>
+        <w:t>was used in the preparation of this report to support literature searching, identify potentially relevant academic sources, and assist with grammar correction and word-limit reduction during editing. All sources included in the reference list were checked by the author and cited as the original academic works rather than citing Perplexity AI as a source. The analysis, interpretation, discussion, and final written content submitted in this report are the author’s own work and responsibility.</w:t>
       </w:r>
     </w:p>
     <w:p>
@@ -10233,21 +9778,7 @@
         <w:rPr>
           <w:rFonts w:cs="Times New Roman"/>
         </w:rPr>
-        <w:t xml:space="preserve">Jlassi, A., </w:t>
-      </w:r>
-      <w:proofErr w:type="spellStart"/>
-      <w:r>
-        <w:rPr>
-          <w:rFonts w:cs="Times New Roman"/>
-        </w:rPr>
-        <w:t>Elaoud</w:t>
-      </w:r>
-      <w:proofErr w:type="spellEnd"/>
-      <w:r>
-        <w:rPr>
-          <w:rFonts w:cs="Times New Roman"/>
-        </w:rPr>
-        <w:t xml:space="preserve">, A., Ghazouani, H., and Barhoumi, W. (2024) 'Potato Leaf Disease Classification Using Transfer Learning and Reweighting-Based Training with Imbalanced Data.' SN Computer Science 5, 987. [online] Available from </w:t>
+        <w:t xml:space="preserve">Jlassi, A., Elaoud, A., Ghazouani, H., and Barhoumi, W. (2024) 'Potato Leaf Disease Classification Using Transfer Learning and Reweighting-Based Training with Imbalanced Data.' SN Computer Science 5, 987. [online] Available from </w:t>
       </w:r>
       <w:hyperlink r:id="rId26" w:history="1">
         <w:r>
@@ -10263,6 +9794,12 @@
           <w:rFonts w:cs="Times New Roman"/>
         </w:rPr>
         <w:t xml:space="preserve"> [Accessed 16 September 2026]</w:t>
+      </w:r>
+      <w:r>
+        <w:rPr>
+          <w:rFonts w:cs="Times New Roman"/>
+        </w:rPr>
+        <w:t>.</w:t>
       </w:r>
     </w:p>
     <w:p>
@@ -10333,33 +9870,11 @@
           <w:rFonts w:cs="Times New Roman"/>
         </w:rPr>
       </w:pPr>
-      <w:proofErr w:type="spellStart"/>
-      <w:r>
-        <w:rPr>
-          <w:rFonts w:cs="Times New Roman"/>
-        </w:rPr>
-        <w:t>mohanty</w:t>
-      </w:r>
-      <w:proofErr w:type="spellEnd"/>
-      <w:r>
-        <w:rPr>
-          <w:rFonts w:cs="Times New Roman"/>
-        </w:rPr>
-        <w:t>/</w:t>
-      </w:r>
-      <w:proofErr w:type="spellStart"/>
-      <w:r>
-        <w:rPr>
-          <w:rFonts w:cs="Times New Roman"/>
-        </w:rPr>
-        <w:t>PlantVillage</w:t>
-      </w:r>
-      <w:proofErr w:type="spellEnd"/>
-      <w:r>
-        <w:rPr>
-          <w:rFonts w:cs="Times New Roman"/>
-        </w:rPr>
-        <w:t xml:space="preserve"> (2016) [online] Available from </w:t>
+      <w:r>
+        <w:rPr>
+          <w:rFonts w:cs="Times New Roman"/>
+        </w:rPr>
+        <w:t xml:space="preserve">mohanty/PlantVillage (2016) [online] Available from </w:t>
       </w:r>
       <w:hyperlink r:id="rId29">
         <w:r>
@@ -10461,25 +9976,33 @@
     </w:p>
     <w:p>
       <w:pPr>
+        <w:pStyle w:val="FirstParagraph"/>
+        <w:spacing w:after="0" w:line="360" w:lineRule="auto"/>
+        <w:jc w:val="both"/>
+        <w:rPr>
+          <w:rFonts w:ascii="Times New Roman" w:hAnsi="Times New Roman" w:cs="Times New Roman"/>
+        </w:rPr>
+      </w:pPr>
+      <w:r>
+        <w:rPr>
+          <w:rFonts w:ascii="Times New Roman" w:hAnsi="Times New Roman" w:cs="Times New Roman"/>
+        </w:rPr>
+        <w:t>Perplexity AI (2026) Response to queries on plant disease classification literature and report editing. Perplexity AI response to Amaan Mohammed Khalander. [online] Available from https://www.perplexity.ai [Accessed 16 September 2026].</w:t>
+      </w:r>
+    </w:p>
+    <w:p>
+      <w:pPr>
         <w:pStyle w:val="BodyText"/>
         <w:spacing w:before="180" w:after="0" w:line="360" w:lineRule="auto"/>
         <w:rPr>
           <w:rFonts w:cs="Times New Roman"/>
         </w:rPr>
       </w:pPr>
-      <w:proofErr w:type="spellStart"/>
-      <w:r>
-        <w:rPr>
-          <w:rFonts w:cs="Times New Roman"/>
-        </w:rPr>
-        <w:t>PlantVillage</w:t>
-      </w:r>
-      <w:proofErr w:type="spellEnd"/>
-      <w:r>
-        <w:rPr>
-          <w:rFonts w:cs="Times New Roman"/>
-        </w:rPr>
-        <w:t xml:space="preserve">-Dataset (2016) [online] Available from </w:t>
+      <w:r>
+        <w:rPr>
+          <w:rFonts w:cs="Times New Roman"/>
+        </w:rPr>
+        <w:t xml:space="preserve">PlantVillage-Dataset (2016) [online] Available from </w:t>
       </w:r>
       <w:hyperlink r:id="rId32">
         <w:r>
@@ -10509,6 +10032,7 @@
         <w:rPr>
           <w:rFonts w:cs="Times New Roman"/>
         </w:rPr>
+        <w:lastRenderedPageBreak/>
         <w:t>Quigley, M., Conley, K., Gerkey, B., Faust, J., Foote, T., Leibs, J., Wheeler, R., and Ng, A.Y. (2009) ‘ROS: an open-source Robot Operating System.’ In: ICRA Workshop on Open Source Software. Kobe: IEEE.</w:t>
       </w:r>
     </w:p>
@@ -10524,7 +10048,6 @@
         <w:rPr>
           <w:rFonts w:cs="Times New Roman"/>
         </w:rPr>
-        <w:lastRenderedPageBreak/>
         <w:t xml:space="preserve">ROBOTIS (2024) TurtleBot3 e-Manual [online] Available from </w:t>
       </w:r>
       <w:hyperlink r:id="rId33">

</xml_diff>

<commit_message>
Update report document with revised formatting and content improvements
</commit_message>
<xml_diff>
--- a/Sem2/Advanced Robotics Automation and Computer Vision/Report.docx
+++ b/Sem2/Advanced Robotics Automation and Computer Vision/Report.docx
@@ -532,7 +532,25 @@
           <w:sz w:val="28"/>
           <w:szCs w:val="28"/>
         </w:rPr>
-        <w:t>Dr Fahmid Al Farid</w:t>
+        <w:t xml:space="preserve">Dr </w:t>
+      </w:r>
+      <w:proofErr w:type="spellStart"/>
+      <w:r>
+        <w:rPr>
+          <w:rFonts w:cs="Times New Roman"/>
+          <w:sz w:val="28"/>
+          <w:szCs w:val="28"/>
+        </w:rPr>
+        <w:t>Fahmid</w:t>
+      </w:r>
+      <w:proofErr w:type="spellEnd"/>
+      <w:r>
+        <w:rPr>
+          <w:rFonts w:cs="Times New Roman"/>
+          <w:sz w:val="28"/>
+          <w:szCs w:val="28"/>
+        </w:rPr>
+        <w:t xml:space="preserve"> Al Farid</w:t>
       </w:r>
     </w:p>
     <w:p>
@@ -4334,7 +4352,21 @@
         <w:rPr>
           <w:rFonts w:ascii="Times New Roman" w:hAnsi="Times New Roman" w:cs="Times New Roman"/>
         </w:rPr>
-        <w:t>This report covers two related projects for the module Advanced Robotics Automation and Computer Vision. The first is a deep learning vision system for crop health monitoring, trained on PlantVillage and adapted through augmentation to approximate low-altitude drone imagery, covering viewpoint change, motion blur and variable lighting. A MobileNetV2 backbone, pretrained on ImageNet, was fine-tuned on 54,305 leaf images across 38 classes using an 80/20 split, reaching 99.11% validation accuracy, 98.64% macro precision, 99.06% macro recall and 98.83% macro F1 over eight epochs. The classifier has around 2.27 million parameters, suited to onboard drone inference.</w:t>
+        <w:t xml:space="preserve">This report covers two related projects for the module Advanced Robotics Automation and Computer Vision. The first is a deep learning vision system for crop health monitoring, trained on </w:t>
+      </w:r>
+      <w:proofErr w:type="spellStart"/>
+      <w:r>
+        <w:rPr>
+          <w:rFonts w:ascii="Times New Roman" w:hAnsi="Times New Roman" w:cs="Times New Roman"/>
+        </w:rPr>
+        <w:t>PlantVillage</w:t>
+      </w:r>
+      <w:proofErr w:type="spellEnd"/>
+      <w:r>
+        <w:rPr>
+          <w:rFonts w:ascii="Times New Roman" w:hAnsi="Times New Roman" w:cs="Times New Roman"/>
+        </w:rPr>
+        <w:t xml:space="preserve"> and adapted through augmentation to approximate low-altitude drone imagery, covering viewpoint change, motion blur and variable lighting. A MobileNetV2 backbone, pretrained on ImageNet, was fine-tuned on 54,305 leaf images across 38 classes using an 80/20 split, reaching 99.11% validation accuracy, 98.64% macro precision, 99.06% macro recall and 98.83% macro F1 over eight epochs. The classifier has around 2.27 million parameters, suited to onboard drone inference.</w:t>
       </w:r>
     </w:p>
     <w:p>
@@ -4359,7 +4391,21 @@
         <w:rPr>
           <w:rFonts w:ascii="Times New Roman" w:hAnsi="Times New Roman" w:cs="Times New Roman"/>
         </w:rPr>
-        <w:t xml:space="preserve">second project implements vision guided navigation for a simulated TurtleBot3 in a ROS 2 Gazebo environment, using OpenCV colour thresholding to detect a marker and a rule-based controller to search, turn and approach it. Perception and control were verified offline against seven synthetic test frames covering centred, off-centre, near, far, absent and distractor scenarios, and a live query of the deployed ROSject reproduced the same proportional turning behaviour to five decimal places. </w:t>
+        <w:t xml:space="preserve">second project implements vision guided navigation for a simulated TurtleBot3 in a ROS 2 Gazebo environment, using OpenCV colour thresholding to detect a marker and a rule-based controller to search, turn and approach it. Perception and control were verified offline against seven synthetic test frames covering centred, off-centre, near, far, absent and distractor scenarios, and a live query of the deployed </w:t>
+      </w:r>
+      <w:proofErr w:type="spellStart"/>
+      <w:r>
+        <w:rPr>
+          <w:rFonts w:ascii="Times New Roman" w:hAnsi="Times New Roman" w:cs="Times New Roman"/>
+        </w:rPr>
+        <w:t>ROSject</w:t>
+      </w:r>
+      <w:proofErr w:type="spellEnd"/>
+      <w:r>
+        <w:rPr>
+          <w:rFonts w:ascii="Times New Roman" w:hAnsi="Times New Roman" w:cs="Times New Roman"/>
+        </w:rPr>
+        <w:t xml:space="preserve"> reproduced the same proportional turning behaviour to five decimal places. </w:t>
       </w:r>
       <w:r>
         <w:rPr>
@@ -4622,7 +4668,35 @@
         <w:rPr>
           <w:rFonts w:cs="Times New Roman"/>
         </w:rPr>
-        <w:t>Hughes and Salathe (2016) were among the first to show deep CNNs trained on PlantVillage could exceed 99% accuracy, though using the dataset's original close range, controlled photographs. Pal et al. (2025) built on this with a lightweight, explainable CNN reaching 99.47% on PlantVillage and 97.73% on a larger 58 class dataset, suggesting smaller models need not sacrifice accuracy for efficiency.</w:t>
+        <w:t xml:space="preserve">Hughes and Salathe (2016) were among the first to show deep CNNs trained on </w:t>
+      </w:r>
+      <w:proofErr w:type="spellStart"/>
+      <w:r>
+        <w:rPr>
+          <w:rFonts w:cs="Times New Roman"/>
+        </w:rPr>
+        <w:t>PlantVillage</w:t>
+      </w:r>
+      <w:proofErr w:type="spellEnd"/>
+      <w:r>
+        <w:rPr>
+          <w:rFonts w:cs="Times New Roman"/>
+        </w:rPr>
+        <w:t xml:space="preserve"> could exceed 99% accuracy, though using the dataset's original close range, controlled photographs. Pal et al. (2025) built on this with a lightweight, explainable CNN reaching 99.47% on </w:t>
+      </w:r>
+      <w:proofErr w:type="spellStart"/>
+      <w:r>
+        <w:rPr>
+          <w:rFonts w:cs="Times New Roman"/>
+        </w:rPr>
+        <w:t>PlantVillage</w:t>
+      </w:r>
+      <w:proofErr w:type="spellEnd"/>
+      <w:r>
+        <w:rPr>
+          <w:rFonts w:cs="Times New Roman"/>
+        </w:rPr>
+        <w:t xml:space="preserve"> and 97.73% on a larger 58 class dataset, suggesting smaller models need not sacrifice accuracy for efficiency.</w:t>
       </w:r>
     </w:p>
     <w:p>
@@ -4655,7 +4729,21 @@
         <w:rPr>
           <w:rFonts w:cs="Times New Roman"/>
         </w:rPr>
-        <w:t>Manoj et al. (2025) applied disease detection directly to drone imagery over large fields, and a review of AI enabled UAV systems (arXiv, 2023) outlines the sensing and onboard processing limits of aerial platforms. Both point to a gap this project could not fully replicate: real UAV imagery differs from ground level photography in scale, viewpoint and motion blur, approximated here through augmentation rather than genuine aerial data.</w:t>
+        <w:t>Manoj et al. (2025) applied disease detection directly to drone imagery over large fields, and a review of AI enabled UAV systems (</w:t>
+      </w:r>
+      <w:proofErr w:type="spellStart"/>
+      <w:r>
+        <w:rPr>
+          <w:rFonts w:cs="Times New Roman"/>
+        </w:rPr>
+        <w:t>arXiv</w:t>
+      </w:r>
+      <w:proofErr w:type="spellEnd"/>
+      <w:r>
+        <w:rPr>
+          <w:rFonts w:cs="Times New Roman"/>
+        </w:rPr>
+        <w:t>, 2023) outlines the sensing and onboard processing limits of aerial platforms. Both point to a gap this project could not fully replicate: real UAV imagery differs from ground level photography in scale, viewpoint and motion blur, approximated here through augmentation rather than genuine aerial data.</w:t>
       </w:r>
     </w:p>
     <w:p>
@@ -4695,7 +4783,21 @@
           <w:rFonts w:cs="Times New Roman"/>
         </w:rPr>
         <w:lastRenderedPageBreak/>
-        <w:t>scale. Jlassi et al. (2024) applied MobileNetV2 transfer learning with reweighting to potato leaf disease classification for imbalanced data, with strong results on underrepresented classes, relevant since PlantVillage is also imbalanced.</w:t>
+        <w:t xml:space="preserve">scale. Jlassi et al. (2024) applied MobileNetV2 transfer learning with reweighting to potato leaf disease classification for imbalanced data, with strong results on underrepresented classes, relevant since </w:t>
+      </w:r>
+      <w:proofErr w:type="spellStart"/>
+      <w:r>
+        <w:rPr>
+          <w:rFonts w:cs="Times New Roman"/>
+        </w:rPr>
+        <w:t>PlantVillage</w:t>
+      </w:r>
+      <w:proofErr w:type="spellEnd"/>
+      <w:r>
+        <w:rPr>
+          <w:rFonts w:cs="Times New Roman"/>
+        </w:rPr>
+        <w:t xml:space="preserve"> is also imbalanced.</w:t>
       </w:r>
     </w:p>
     <w:p>
@@ -4756,11 +4858,89 @@
         </w:rPr>
         <w:t xml:space="preserve">The </w:t>
       </w:r>
+      <w:proofErr w:type="spellStart"/>
       <w:r>
         <w:rPr>
           <w:rFonts w:ascii="Times New Roman" w:hAnsi="Times New Roman" w:cs="Times New Roman"/>
         </w:rPr>
-        <w:t>PlantVillage dataset was used via the Hugging Face datasets library (mohanty/PlantVillage), using the colour configuration, mirroring the original repository (mohanty/PlantVillage, 2016; PlantVillage-Dataset, 2016), comprising 54,305 labelled leaf images across 38 classes, a widely used baseline in plant pathology research (Mohanty, Hughes and Salathe, 2016).</w:t>
+        <w:t>PlantVillage</w:t>
+      </w:r>
+      <w:proofErr w:type="spellEnd"/>
+      <w:r>
+        <w:rPr>
+          <w:rFonts w:ascii="Times New Roman" w:hAnsi="Times New Roman" w:cs="Times New Roman"/>
+        </w:rPr>
+        <w:t xml:space="preserve"> dataset was used via the Hugging Face datasets library (</w:t>
+      </w:r>
+      <w:proofErr w:type="spellStart"/>
+      <w:r>
+        <w:rPr>
+          <w:rFonts w:ascii="Times New Roman" w:hAnsi="Times New Roman" w:cs="Times New Roman"/>
+        </w:rPr>
+        <w:t>mohanty</w:t>
+      </w:r>
+      <w:proofErr w:type="spellEnd"/>
+      <w:r>
+        <w:rPr>
+          <w:rFonts w:ascii="Times New Roman" w:hAnsi="Times New Roman" w:cs="Times New Roman"/>
+        </w:rPr>
+        <w:t>/</w:t>
+      </w:r>
+      <w:proofErr w:type="spellStart"/>
+      <w:r>
+        <w:rPr>
+          <w:rFonts w:ascii="Times New Roman" w:hAnsi="Times New Roman" w:cs="Times New Roman"/>
+        </w:rPr>
+        <w:t>PlantVillage</w:t>
+      </w:r>
+      <w:proofErr w:type="spellEnd"/>
+      <w:r>
+        <w:rPr>
+          <w:rFonts w:ascii="Times New Roman" w:hAnsi="Times New Roman" w:cs="Times New Roman"/>
+        </w:rPr>
+        <w:t>), using the colour configuration, mirroring the original repository (</w:t>
+      </w:r>
+      <w:proofErr w:type="spellStart"/>
+      <w:r>
+        <w:rPr>
+          <w:rFonts w:ascii="Times New Roman" w:hAnsi="Times New Roman" w:cs="Times New Roman"/>
+        </w:rPr>
+        <w:t>mohanty</w:t>
+      </w:r>
+      <w:proofErr w:type="spellEnd"/>
+      <w:r>
+        <w:rPr>
+          <w:rFonts w:ascii="Times New Roman" w:hAnsi="Times New Roman" w:cs="Times New Roman"/>
+        </w:rPr>
+        <w:t>/</w:t>
+      </w:r>
+      <w:proofErr w:type="spellStart"/>
+      <w:r>
+        <w:rPr>
+          <w:rFonts w:ascii="Times New Roman" w:hAnsi="Times New Roman" w:cs="Times New Roman"/>
+        </w:rPr>
+        <w:t>PlantVillage</w:t>
+      </w:r>
+      <w:proofErr w:type="spellEnd"/>
+      <w:r>
+        <w:rPr>
+          <w:rFonts w:ascii="Times New Roman" w:hAnsi="Times New Roman" w:cs="Times New Roman"/>
+        </w:rPr>
+        <w:t xml:space="preserve">, 2016; </w:t>
+      </w:r>
+      <w:proofErr w:type="spellStart"/>
+      <w:r>
+        <w:rPr>
+          <w:rFonts w:ascii="Times New Roman" w:hAnsi="Times New Roman" w:cs="Times New Roman"/>
+        </w:rPr>
+        <w:t>PlantVillage</w:t>
+      </w:r>
+      <w:proofErr w:type="spellEnd"/>
+      <w:r>
+        <w:rPr>
+          <w:rFonts w:ascii="Times New Roman" w:hAnsi="Times New Roman" w:cs="Times New Roman"/>
+        </w:rPr>
+        <w:t>-Dataset, 2016), comprising 54,305 labelled leaf images across 38 classes, a widely used baseline in plant pathology research (Mohanty, Hughes and Salathe, 2016).</w:t>
       </w:r>
     </w:p>
     <w:p>
@@ -4775,7 +4955,21 @@
         <w:rPr>
           <w:rFonts w:cs="Times New Roman"/>
         </w:rPr>
-        <w:t>Class counts were inspected prior to splitting, since PlantVillage is not perfectly balanced; some disease categories are represented by substantially fewer images than the most common classes.</w:t>
+        <w:t xml:space="preserve">Class counts were inspected prior to splitting, since </w:t>
+      </w:r>
+      <w:proofErr w:type="spellStart"/>
+      <w:r>
+        <w:rPr>
+          <w:rFonts w:cs="Times New Roman"/>
+        </w:rPr>
+        <w:t>PlantVillage</w:t>
+      </w:r>
+      <w:proofErr w:type="spellEnd"/>
+      <w:r>
+        <w:rPr>
+          <w:rFonts w:cs="Times New Roman"/>
+        </w:rPr>
+        <w:t xml:space="preserve"> is not perfectly balanced; some disease categories are represented by substantially fewer images than the most common classes.</w:t>
       </w:r>
     </w:p>
     <w:p>
@@ -4862,7 +5056,15 @@
         <w:fldChar w:fldCharType="end"/>
       </w:r>
       <w:r>
-        <w:t>: Distribution of images across the 38 PlantVillage classes, illustrating the class imbalance referred to above.</w:t>
+        <w:t xml:space="preserve">: Distribution of images across the 38 </w:t>
+      </w:r>
+      <w:proofErr w:type="spellStart"/>
+      <w:r>
+        <w:t>PlantVillage</w:t>
+      </w:r>
+      <w:proofErr w:type="spellEnd"/>
+      <w:r>
+        <w:t xml:space="preserve"> classes, illustrating the class imbalance referred to above.</w:t>
       </w:r>
       <w:bookmarkEnd w:id="7"/>
     </w:p>
@@ -5035,7 +5237,35 @@
         <w:rPr>
           <w:rFonts w:cs="Times New Roman"/>
         </w:rPr>
-        <w:t xml:space="preserve"> was selected as backbone, pretrained on ImageNet and fine-tuned on PlantVillage, with the 1000-class output layer replaced by a linear layer for the 38 PlantVillage classes, giving a final model of approximately 2.27 million trainable parameters.</w:t>
+        <w:t xml:space="preserve"> was selected as backbone, pretrained on ImageNet and fine-tuned on </w:t>
+      </w:r>
+      <w:proofErr w:type="spellStart"/>
+      <w:r>
+        <w:rPr>
+          <w:rFonts w:cs="Times New Roman"/>
+        </w:rPr>
+        <w:t>PlantVillage</w:t>
+      </w:r>
+      <w:proofErr w:type="spellEnd"/>
+      <w:r>
+        <w:rPr>
+          <w:rFonts w:cs="Times New Roman"/>
+        </w:rPr>
+        <w:t xml:space="preserve">, with the 1000-class output layer replaced by a linear layer for the 38 </w:t>
+      </w:r>
+      <w:proofErr w:type="spellStart"/>
+      <w:r>
+        <w:rPr>
+          <w:rFonts w:cs="Times New Roman"/>
+        </w:rPr>
+        <w:t>PlantVillage</w:t>
+      </w:r>
+      <w:proofErr w:type="spellEnd"/>
+      <w:r>
+        <w:rPr>
+          <w:rFonts w:cs="Times New Roman"/>
+        </w:rPr>
+        <w:t xml:space="preserve"> classes, giving a final model of approximately 2.27 million trainable parameters.</w:t>
       </w:r>
       <w:r>
         <w:rPr>
@@ -5056,7 +5286,21 @@
         <w:rPr>
           <w:rFonts w:cs="Times New Roman"/>
         </w:rPr>
-        <w:t>MobileNetV2's key feature is the inverted residual block with linear bottlenecks. It relies on depthwise separable convolutions to cut parameter count relative to standard architectures of comparable depth (Sandler et al., 2018), a good fit for a drone's tight compute, memory and power budget.</w:t>
+        <w:t xml:space="preserve">MobileNetV2's key feature is the inverted residual block with linear bottlenecks. It relies on </w:t>
+      </w:r>
+      <w:proofErr w:type="spellStart"/>
+      <w:r>
+        <w:rPr>
+          <w:rFonts w:cs="Times New Roman"/>
+        </w:rPr>
+        <w:t>depthwise</w:t>
+      </w:r>
+      <w:proofErr w:type="spellEnd"/>
+      <w:r>
+        <w:rPr>
+          <w:rFonts w:cs="Times New Roman"/>
+        </w:rPr>
+        <w:t xml:space="preserve"> separable convolutions to cut parameter count relative to standard architectures of comparable depth (Sandler et al., 2018), a good fit for a drone's tight compute, memory and power budget.</w:t>
       </w:r>
       <w:r>
         <w:rPr>
@@ -5068,7 +5312,21 @@
         <w:rPr>
           <w:rFonts w:cs="Times New Roman"/>
         </w:rPr>
-        <w:t>Figure 3 summarises this structure, showing the pretrained backbone feeding the replaced classification head. Pal et al. (2025) and Kumar et al. (2025) similarly report MobileNet-family accuracy above 99% while remaining edge deployable, supporting the choice made here.</w:t>
+        <w:t xml:space="preserve">Figure 3 summarises this structure, showing the pretrained backbone feeding the replaced classification head. Pal et al. (2025) and Kumar et al. (2025) similarly report </w:t>
+      </w:r>
+      <w:proofErr w:type="spellStart"/>
+      <w:r>
+        <w:rPr>
+          <w:rFonts w:cs="Times New Roman"/>
+        </w:rPr>
+        <w:t>MobileNet</w:t>
+      </w:r>
+      <w:proofErr w:type="spellEnd"/>
+      <w:r>
+        <w:rPr>
+          <w:rFonts w:cs="Times New Roman"/>
+        </w:rPr>
+        <w:t>-family accuracy above 99% while remaining edge deployable, supporting the choice made here.</w:t>
       </w:r>
     </w:p>
     <w:p>
@@ -5245,7 +5503,21 @@
         <w:rPr>
           <w:rFonts w:ascii="Times New Roman" w:hAnsi="Times New Roman" w:cs="Times New Roman"/>
         </w:rPr>
-        <w:t xml:space="preserve"> on a machine with a single CUDA GPU visible to PyTorch, for eight epochs with a batch size of 32 and a learning rate of 3e-4. The notebook is publicly available at </w:t>
+        <w:t xml:space="preserve"> on a machine with a single CUDA GPU visible to </w:t>
+      </w:r>
+      <w:proofErr w:type="spellStart"/>
+      <w:r>
+        <w:rPr>
+          <w:rFonts w:ascii="Times New Roman" w:hAnsi="Times New Roman" w:cs="Times New Roman"/>
+        </w:rPr>
+        <w:t>PyTorch</w:t>
+      </w:r>
+      <w:proofErr w:type="spellEnd"/>
+      <w:r>
+        <w:rPr>
+          <w:rFonts w:ascii="Times New Roman" w:hAnsi="Times New Roman" w:cs="Times New Roman"/>
+        </w:rPr>
+        <w:t xml:space="preserve">, for eight epochs with a batch size of 32 and a learning rate of 3e-4. The notebook is publicly available at </w:t>
       </w:r>
       <w:hyperlink r:id="rId17">
         <w:r>
@@ -6901,7 +7173,21 @@
         <w:rPr>
           <w:rFonts w:cs="Times New Roman"/>
         </w:rPr>
-        <w:t>. First, the aerial imaging conditions targeted here are simulated through augmentation of ground level, close range photographs rather than genuine drone imagery. This is a reasonable proxy where aerial training data is unavailable, but it does not reproduce every characteristic of true UAV imagery, such as the relationship between altitude and object scale; UAV specific datasets referenced in reviews of AI enabled UAV systems (arXiv, 2023) and recent drone-based work (Manoj et al., 2025) offer a more direct path to closing this gap.</w:t>
+        <w:t>. First, the aerial imaging conditions targeted here are simulated through augmentation of ground level, close range photographs rather than genuine drone imagery. This is a reasonable proxy where aerial training data is unavailable, but it does not reproduce every characteristic of true UAV imagery, such as the relationship between altitude and object scale; UAV specific datasets referenced in reviews of AI enabled UAV systems (</w:t>
+      </w:r>
+      <w:proofErr w:type="spellStart"/>
+      <w:r>
+        <w:rPr>
+          <w:rFonts w:cs="Times New Roman"/>
+        </w:rPr>
+        <w:t>arXiv</w:t>
+      </w:r>
+      <w:proofErr w:type="spellEnd"/>
+      <w:r>
+        <w:rPr>
+          <w:rFonts w:cs="Times New Roman"/>
+        </w:rPr>
+        <w:t>, 2023) and recent drone-based work (Manoj et al., 2025) offer a more direct path to closing this gap.</w:t>
       </w:r>
     </w:p>
     <w:p>
@@ -6917,7 +7203,21 @@
         <w:rPr>
           <w:rFonts w:cs="Times New Roman"/>
         </w:rPr>
-        <w:t>Second, class imbalance in PlantVillage means that, without intervention such as class weighted loss, the classifier risks weaker performance on rarer disease categories, where correct detection matters most. The parameter count achieved supports the goal of onboard, low power inference. A realistic path to field deployment would require converting the model to a runtime format such as TensorFlow Lite or ONNX, integrating GPS metadata to map detections onto the field, and validating against genuine UAV imagery.</w:t>
+        <w:t xml:space="preserve">Second, class imbalance in </w:t>
+      </w:r>
+      <w:proofErr w:type="spellStart"/>
+      <w:r>
+        <w:rPr>
+          <w:rFonts w:cs="Times New Roman"/>
+        </w:rPr>
+        <w:t>PlantVillage</w:t>
+      </w:r>
+      <w:proofErr w:type="spellEnd"/>
+      <w:r>
+        <w:rPr>
+          <w:rFonts w:cs="Times New Roman"/>
+        </w:rPr>
+        <w:t xml:space="preserve"> means that, without intervention such as class weighted loss, the classifier risks weaker performance on rarer disease categories, where correct detection matters most. The parameter count achieved supports the goal of onboard, low power inference. A realistic path to field deployment would require converting the model to a runtime format such as TensorFlow Lite or ONNX, integrating GPS metadata to map detections onto the field, and validating against genuine UAV imagery.</w:t>
       </w:r>
     </w:p>
     <w:bookmarkEnd w:id="16"/>
@@ -6988,7 +7288,21 @@
         <w:rPr>
           <w:rFonts w:ascii="Times New Roman" w:hAnsi="Times New Roman" w:cs="Times New Roman"/>
         </w:rPr>
-        <w:t>Task 2 addresses vision guided navigation for a simulated TurtleBot3 mobile robot, run within TheConstruct.ai's ROS 2 Gazebo environment (TheConstruct.ai, 2024). The objective is for the robot to detect a coloured marker using its onboard RGB camera and navigate toward it using simple, interpretable vision-based rules rather than a learned control policy.</w:t>
+        <w:t xml:space="preserve">Task 2 addresses vision guided navigation for a simulated TurtleBot3 mobile robot, run within </w:t>
+      </w:r>
+      <w:proofErr w:type="spellStart"/>
+      <w:r>
+        <w:rPr>
+          <w:rFonts w:ascii="Times New Roman" w:hAnsi="Times New Roman" w:cs="Times New Roman"/>
+        </w:rPr>
+        <w:t>TheConstruct.ai's</w:t>
+      </w:r>
+      <w:proofErr w:type="spellEnd"/>
+      <w:r>
+        <w:rPr>
+          <w:rFonts w:ascii="Times New Roman" w:hAnsi="Times New Roman" w:cs="Times New Roman"/>
+        </w:rPr>
+        <w:t xml:space="preserve"> ROS 2 Gazebo environment (TheConstruct.ai, 2024). The objective is for the robot to detect a coloured marker using its onboard RGB camera and navigate toward it using simple, interpretable vision-based rules rather than a learned control policy.</w:t>
       </w:r>
     </w:p>
     <w:p>
@@ -7003,7 +7317,49 @@
         <w:rPr>
           <w:rFonts w:cs="Times New Roman"/>
         </w:rPr>
-        <w:t>Development and testing were carried out on TheConstruct.ai's browser based ROSject platform, inside ROSject vVGb1L3fxD (URL identifier 1049584), workspace ros2_ws. The free tier does not issue a permanent shareable URL; the project was instead made public under its title, vVGb1L3fxD, in the platform's public index, satisfying the brief's accessibility requirement. Figure 7 shows this workspace, including the turtlebot3_vision_nav package structure and a terminal session used to query the running nodes.</w:t>
+        <w:t xml:space="preserve">Development and testing were carried out on </w:t>
+      </w:r>
+      <w:proofErr w:type="spellStart"/>
+      <w:r>
+        <w:rPr>
+          <w:rFonts w:cs="Times New Roman"/>
+        </w:rPr>
+        <w:t>TheConstruct.ai's</w:t>
+      </w:r>
+      <w:proofErr w:type="spellEnd"/>
+      <w:r>
+        <w:rPr>
+          <w:rFonts w:cs="Times New Roman"/>
+        </w:rPr>
+        <w:t xml:space="preserve"> browser based </w:t>
+      </w:r>
+      <w:proofErr w:type="spellStart"/>
+      <w:r>
+        <w:rPr>
+          <w:rFonts w:cs="Times New Roman"/>
+        </w:rPr>
+        <w:t>ROSject</w:t>
+      </w:r>
+      <w:proofErr w:type="spellEnd"/>
+      <w:r>
+        <w:rPr>
+          <w:rFonts w:cs="Times New Roman"/>
+        </w:rPr>
+        <w:t xml:space="preserve"> platform, inside </w:t>
+      </w:r>
+      <w:proofErr w:type="spellStart"/>
+      <w:r>
+        <w:rPr>
+          <w:rFonts w:cs="Times New Roman"/>
+        </w:rPr>
+        <w:t>ROSject</w:t>
+      </w:r>
+      <w:proofErr w:type="spellEnd"/>
+      <w:r>
+        <w:rPr>
+          <w:rFonts w:cs="Times New Roman"/>
+        </w:rPr>
+        <w:t xml:space="preserve"> vVGb1L3fxD (URL identifier 1049584), workspace ros2_ws. The free tier does not issue a permanent shareable URL; the project was instead made public under its title, vVGb1L3fxD, in the platform's public index, satisfying the brief's accessibility requirement. Figure 7 shows this workspace, including the turtlebot3_vision_nav package structure and a terminal session used to query the running nodes.</w:t>
       </w:r>
     </w:p>
     <w:p>
@@ -7090,7 +7446,47 @@
         <w:fldChar w:fldCharType="end"/>
       </w:r>
       <w:r>
-        <w:t>: TheConstruct.ai ROSject workspace (rosject 1049584), showing the turtlebot3_vision_nav package files and a terminal session used to inspect /cmd_vel, /target_offset and /target_visible directly with ros2 topic echo.</w:t>
+        <w:t xml:space="preserve">: TheConstruct.ai </w:t>
+      </w:r>
+      <w:proofErr w:type="spellStart"/>
+      <w:r>
+        <w:t>ROSject</w:t>
+      </w:r>
+      <w:proofErr w:type="spellEnd"/>
+      <w:r>
+        <w:t xml:space="preserve"> workspace (</w:t>
+      </w:r>
+      <w:proofErr w:type="spellStart"/>
+      <w:r>
+        <w:t>rosject</w:t>
+      </w:r>
+      <w:proofErr w:type="spellEnd"/>
+      <w:r>
+        <w:t xml:space="preserve"> 1049584), showing the turtlebot3_vision_nav package files and a terminal session used to inspect /</w:t>
+      </w:r>
+      <w:proofErr w:type="spellStart"/>
+      <w:r>
+        <w:t>cmd_vel</w:t>
+      </w:r>
+      <w:proofErr w:type="spellEnd"/>
+      <w:r>
+        <w:t>, /</w:t>
+      </w:r>
+      <w:proofErr w:type="spellStart"/>
+      <w:r>
+        <w:t>target_offset</w:t>
+      </w:r>
+      <w:proofErr w:type="spellEnd"/>
+      <w:r>
+        <w:t xml:space="preserve"> and /</w:t>
+      </w:r>
+      <w:proofErr w:type="spellStart"/>
+      <w:r>
+        <w:t>target_visible</w:t>
+      </w:r>
+      <w:proofErr w:type="spellEnd"/>
+      <w:r>
+        <w:t xml:space="preserve"> directly with ros2 topic echo.</w:t>
       </w:r>
       <w:bookmarkEnd w:id="22"/>
     </w:p>
@@ -7131,6 +7527,7 @@
         </w:rPr>
         <w:t xml:space="preserve"> provided with the TurtleBot3 packages, run in Gazebo Sim with the </w:t>
       </w:r>
+      <w:proofErr w:type="spellStart"/>
       <w:r>
         <w:rPr>
           <w:rStyle w:val="VerbatimChar"/>
@@ -7138,6 +7535,7 @@
         </w:rPr>
         <w:t>waffle_pi</w:t>
       </w:r>
+      <w:proofErr w:type="spellEnd"/>
       <w:r>
         <w:rPr>
           <w:rFonts w:cs="Times New Roman"/>
@@ -7160,22 +7558,28 @@
           <w:noProof/>
         </w:rPr>
         <w:drawing>
-          <wp:inline distT="0" distB="0" distL="0" distR="0" wp14:anchorId="1E68EB6C" wp14:editId="3A1C53B2">
-            <wp:extent cx="5334000" cy="4642555"/>
-            <wp:effectExtent l="0" t="0" r="0" b="0"/>
-            <wp:docPr id="47" name="Picture" descr="Figure 7"/>
+          <wp:inline distT="0" distB="0" distL="0" distR="0" wp14:anchorId="1E68EB6C" wp14:editId="6EA59B4C">
+            <wp:extent cx="5262006" cy="4642555"/>
+            <wp:effectExtent l="0" t="0" r="0" b="5715"/>
+            <wp:docPr id="47" name="Picture"/>
             <wp:cNvGraphicFramePr/>
             <a:graphic xmlns:a="http://schemas.openxmlformats.org/drawingml/2006/main">
               <a:graphicData uri="http://schemas.openxmlformats.org/drawingml/2006/picture">
                 <pic:pic xmlns:pic="http://schemas.openxmlformats.org/drawingml/2006/picture">
                   <pic:nvPicPr>
-                    <pic:cNvPr id="48" name="Picture" descr="/home/claude/work/task2-output/task2-output/gazebo_waffle_pi_spawn.png"/>
+                    <pic:cNvPr id="47" name="Picture"/>
                     <pic:cNvPicPr>
                       <a:picLocks noChangeAspect="1" noChangeArrowheads="1"/>
                     </pic:cNvPicPr>
                   </pic:nvPicPr>
                   <pic:blipFill>
-                    <a:blip r:embed="rId22"/>
+                    <a:blip r:embed="rId22">
+                      <a:extLst>
+                        <a:ext uri="{28A0092B-C50C-407E-A947-70E740481C1C}">
+                          <a14:useLocalDpi xmlns:a14="http://schemas.microsoft.com/office/drawing/2010/main" val="0"/>
+                        </a:ext>
+                      </a:extLst>
+                    </a:blip>
                     <a:stretch>
                       <a:fillRect/>
                     </a:stretch>
@@ -7183,7 +7587,7 @@
                   <pic:spPr bwMode="auto">
                     <a:xfrm>
                       <a:off x="0" y="0"/>
-                      <a:ext cx="5334000" cy="4642555"/>
+                      <a:ext cx="5262006" cy="4642555"/>
                     </a:xfrm>
                     <a:prstGeom prst="rect">
                       <a:avLst/>
@@ -7229,7 +7633,15 @@
         <w:fldChar w:fldCharType="end"/>
       </w:r>
       <w:r>
-        <w:t>: The waffle_pi TurtleBot3 spawned in turtlebot3_world, showing the entity tree and simulation configuration.</w:t>
+        <w:t xml:space="preserve">: The </w:t>
+      </w:r>
+      <w:proofErr w:type="spellStart"/>
+      <w:r>
+        <w:t>waffle_pi</w:t>
+      </w:r>
+      <w:proofErr w:type="spellEnd"/>
+      <w:r>
+        <w:t xml:space="preserve"> TurtleBot3 spawned in turtlebot3_world, showing the entity tree and simulation configuration.</w:t>
       </w:r>
       <w:bookmarkEnd w:id="23"/>
     </w:p>
@@ -7249,22 +7661,28 @@
         </w:rPr>
         <w:lastRenderedPageBreak/>
         <w:drawing>
-          <wp:inline distT="0" distB="0" distL="0" distR="0" wp14:anchorId="6BC395C0" wp14:editId="4954C888">
-            <wp:extent cx="5334000" cy="4651513"/>
-            <wp:effectExtent l="0" t="0" r="0" b="0"/>
-            <wp:docPr id="50" name="Picture" descr="Figure 8"/>
+          <wp:inline distT="0" distB="0" distL="0" distR="0" wp14:anchorId="6BC395C0" wp14:editId="27D43DEF">
+            <wp:extent cx="5311301" cy="4651513"/>
+            <wp:effectExtent l="0" t="0" r="3810" b="0"/>
+            <wp:docPr id="50" name="Picture"/>
             <wp:cNvGraphicFramePr/>
             <a:graphic xmlns:a="http://schemas.openxmlformats.org/drawingml/2006/main">
               <a:graphicData uri="http://schemas.openxmlformats.org/drawingml/2006/picture">
                 <pic:pic xmlns:pic="http://schemas.openxmlformats.org/drawingml/2006/picture">
                   <pic:nvPicPr>
-                    <pic:cNvPr id="51" name="Picture" descr="/home/claude/work/task2-output/task2-output/gazebo_marker_scene.png"/>
+                    <pic:cNvPr id="50" name="Picture"/>
                     <pic:cNvPicPr>
                       <a:picLocks noChangeAspect="1" noChangeArrowheads="1"/>
                     </pic:cNvPicPr>
                   </pic:nvPicPr>
                   <pic:blipFill>
-                    <a:blip r:embed="rId23"/>
+                    <a:blip r:embed="rId23">
+                      <a:extLst>
+                        <a:ext uri="{28A0092B-C50C-407E-A947-70E740481C1C}">
+                          <a14:useLocalDpi xmlns:a14="http://schemas.microsoft.com/office/drawing/2010/main" val="0"/>
+                        </a:ext>
+                      </a:extLst>
+                    </a:blip>
                     <a:stretch>
                       <a:fillRect/>
                     </a:stretch>
@@ -7272,7 +7690,7 @@
                   <pic:spPr bwMode="auto">
                     <a:xfrm>
                       <a:off x="0" y="0"/>
-                      <a:ext cx="5334000" cy="4651513"/>
+                      <a:ext cx="5311301" cy="4651513"/>
                     </a:xfrm>
                     <a:prstGeom prst="rect">
                       <a:avLst/>
@@ -7468,7 +7886,21 @@
         <w:rPr>
           <w:rFonts w:cs="Times New Roman"/>
         </w:rPr>
-        <w:t>In vision_detector, each frame is converted to HSV colour space, chosen over RGB for its robustness to lighting variation. A binary mask of the target colour range is cleaned via morphological opening and closing, and the largest contour above a minimum area threshold is taken as the marker. Its centroid offset is normalised to minus one to one and published with a visibility flag.</w:t>
+        <w:t xml:space="preserve">In </w:t>
+      </w:r>
+      <w:proofErr w:type="spellStart"/>
+      <w:r>
+        <w:rPr>
+          <w:rFonts w:cs="Times New Roman"/>
+        </w:rPr>
+        <w:t>vision_detector</w:t>
+      </w:r>
+      <w:proofErr w:type="spellEnd"/>
+      <w:r>
+        <w:rPr>
+          <w:rFonts w:cs="Times New Roman"/>
+        </w:rPr>
+        <w:t>, each frame is converted to HSV colour space, chosen over RGB for its robustness to lighting variation. A binary mask of the target colour range is cleaned via morphological opening and closing, and the largest contour above a minimum area threshold is taken as the marker. Its centroid offset is normalised to minus one to one and published with a visibility flag.</w:t>
       </w:r>
     </w:p>
     <w:p>
@@ -7485,11 +7917,19 @@
         </w:rPr>
         <w:t xml:space="preserve">The </w:t>
       </w:r>
-      <w:r>
-        <w:rPr>
-          <w:rFonts w:cs="Times New Roman"/>
-        </w:rPr>
-        <w:t>navigation_controller node subscribes to both signals and runs the rule-based controller. With no marker visible, the robot rotates slowly to search. Once visible, it turns toward the marker if the offset exceeds a centring threshold, scaling turn rate to offset and capping angular velocity, then drives forward at a fixed speed once centred, publishing commands at roughly ten hertz.</w:t>
+      <w:proofErr w:type="spellStart"/>
+      <w:r>
+        <w:rPr>
+          <w:rFonts w:cs="Times New Roman"/>
+        </w:rPr>
+        <w:t>navigation_controller</w:t>
+      </w:r>
+      <w:proofErr w:type="spellEnd"/>
+      <w:r>
+        <w:rPr>
+          <w:rFonts w:cs="Times New Roman"/>
+        </w:rPr>
+        <w:t xml:space="preserve"> node subscribes to both signals and runs the rule-based controller. With no marker visible, the robot rotates slowly to search. Once visible, it turns toward the marker if the offset exceeds a centring threshold, scaling turn rate to offset and capping angular velocity, then drives forward at a fixed speed once centred, publishing commands at roughly ten hertz.</w:t>
       </w:r>
     </w:p>
     <w:p>
@@ -7523,7 +7963,21 @@
         <w:rPr>
           <w:rFonts w:ascii="Times New Roman" w:hAnsi="Times New Roman" w:cs="Times New Roman"/>
         </w:rPr>
-        <w:t>Testing proceeded in two stages: perception and control logic was first verified offline against seven synthetic test frames covering the scenarios the brief recommends, shown in Figure 11, then the same nodes were launched inside the ROSject and queried directly against the live simulation using ros2 topic echo.</w:t>
+        <w:t xml:space="preserve">Testing proceeded in two stages: perception and control logic was first verified offline against seven synthetic test frames covering the scenarios the brief recommends, shown in Figure 11, then the same nodes were launched inside the </w:t>
+      </w:r>
+      <w:proofErr w:type="spellStart"/>
+      <w:r>
+        <w:rPr>
+          <w:rFonts w:ascii="Times New Roman" w:hAnsi="Times New Roman" w:cs="Times New Roman"/>
+        </w:rPr>
+        <w:t>ROSject</w:t>
+      </w:r>
+      <w:proofErr w:type="spellEnd"/>
+      <w:r>
+        <w:rPr>
+          <w:rFonts w:ascii="Times New Roman" w:hAnsi="Times New Roman" w:cs="Times New Roman"/>
+        </w:rPr>
+        <w:t xml:space="preserve"> and queried directly against the live simulation using ros2 topic echo.</w:t>
       </w:r>
     </w:p>
     <w:p>
@@ -7772,11 +8226,19 @@
                 <w:rFonts w:ascii="Times New Roman" w:hAnsi="Times New Roman" w:cs="Times New Roman"/>
               </w:rPr>
             </w:pPr>
-            <w:r>
-              <w:rPr>
-                <w:rFonts w:ascii="Times New Roman" w:hAnsi="Times New Roman" w:cs="Times New Roman"/>
-              </w:rPr>
-              <w:t>lin_x (m/s)</w:t>
+            <w:proofErr w:type="spellStart"/>
+            <w:r>
+              <w:rPr>
+                <w:rFonts w:ascii="Times New Roman" w:hAnsi="Times New Roman" w:cs="Times New Roman"/>
+              </w:rPr>
+              <w:t>lin_x</w:t>
+            </w:r>
+            <w:proofErr w:type="spellEnd"/>
+            <w:r>
+              <w:rPr>
+                <w:rFonts w:ascii="Times New Roman" w:hAnsi="Times New Roman" w:cs="Times New Roman"/>
+              </w:rPr>
+              <w:t xml:space="preserve"> (m/s)</w:t>
             </w:r>
           </w:p>
         </w:tc>
@@ -7799,11 +8261,19 @@
                 <w:rFonts w:ascii="Times New Roman" w:hAnsi="Times New Roman" w:cs="Times New Roman"/>
               </w:rPr>
             </w:pPr>
-            <w:r>
-              <w:rPr>
-                <w:rFonts w:ascii="Times New Roman" w:hAnsi="Times New Roman" w:cs="Times New Roman"/>
-              </w:rPr>
-              <w:t>ang_z (rad/s)</w:t>
+            <w:proofErr w:type="spellStart"/>
+            <w:r>
+              <w:rPr>
+                <w:rFonts w:ascii="Times New Roman" w:hAnsi="Times New Roman" w:cs="Times New Roman"/>
+              </w:rPr>
+              <w:t>ang_z</w:t>
+            </w:r>
+            <w:proofErr w:type="spellEnd"/>
+            <w:r>
+              <w:rPr>
+                <w:rFonts w:ascii="Times New Roman" w:hAnsi="Times New Roman" w:cs="Times New Roman"/>
+              </w:rPr>
+              <w:t xml:space="preserve"> (rad/s)</w:t>
             </w:r>
           </w:p>
         </w:tc>
@@ -8979,7 +9449,21 @@
           <w:rFonts w:cs="Times New Roman"/>
         </w:rPr>
         <w:lastRenderedPageBreak/>
-        <w:t>After this offline check, the same nodes were launched inside the ROSject and queried while a marker sat in view of the simulated camera. This time the result was a genuine closed-loop outcome rather than a synthetic prediction</w:t>
+        <w:t xml:space="preserve">After this offline check, the same nodes were launched inside the </w:t>
+      </w:r>
+      <w:proofErr w:type="spellStart"/>
+      <w:r>
+        <w:rPr>
+          <w:rFonts w:cs="Times New Roman"/>
+        </w:rPr>
+        <w:t>ROSject</w:t>
+      </w:r>
+      <w:proofErr w:type="spellEnd"/>
+      <w:r>
+        <w:rPr>
+          <w:rFonts w:cs="Times New Roman"/>
+        </w:rPr>
+        <w:t xml:space="preserve"> and queried while a marker sat in view of the simulated camera. This time the result was a genuine closed-loop outcome rather than a synthetic prediction</w:t>
       </w:r>
       <w:r>
         <w:rPr>
@@ -9016,7 +9500,15 @@
         <w:fldChar w:fldCharType="end"/>
       </w:r>
       <w:r>
-        <w:t xml:space="preserve">: Live ROSject verification (ros2 topic echo, single query each, shown in Figure </w:t>
+        <w:t xml:space="preserve">: Live </w:t>
+      </w:r>
+      <w:proofErr w:type="spellStart"/>
+      <w:r>
+        <w:t>ROSject</w:t>
+      </w:r>
+      <w:proofErr w:type="spellEnd"/>
+      <w:r>
+        <w:t xml:space="preserve"> verification (ros2 topic echo, single query each, shown in Figure </w:t>
       </w:r>
       <w:r>
         <w:t>7</w:t>
@@ -9125,8 +9617,26 @@
                 <w:rStyle w:val="VerbatimChar"/>
                 <w:rFonts w:ascii="Times New Roman" w:hAnsi="Times New Roman" w:cs="Times New Roman"/>
               </w:rPr>
-              <w:t>/target_visible</w:t>
-            </w:r>
+              <w:t>/</w:t>
+            </w:r>
+            <w:proofErr w:type="spellStart"/>
+            <w:proofErr w:type="gramStart"/>
+            <w:r>
+              <w:rPr>
+                <w:rStyle w:val="VerbatimChar"/>
+                <w:rFonts w:ascii="Times New Roman" w:hAnsi="Times New Roman" w:cs="Times New Roman"/>
+              </w:rPr>
+              <w:t>target</w:t>
+            </w:r>
+            <w:proofErr w:type="gramEnd"/>
+            <w:r>
+              <w:rPr>
+                <w:rStyle w:val="VerbatimChar"/>
+                <w:rFonts w:ascii="Times New Roman" w:hAnsi="Times New Roman" w:cs="Times New Roman"/>
+              </w:rPr>
+              <w:t>_visible</w:t>
+            </w:r>
+            <w:proofErr w:type="spellEnd"/>
           </w:p>
         </w:tc>
         <w:tc>
@@ -9183,8 +9693,26 @@
                 <w:rStyle w:val="VerbatimChar"/>
                 <w:rFonts w:ascii="Times New Roman" w:hAnsi="Times New Roman" w:cs="Times New Roman"/>
               </w:rPr>
-              <w:t>/target_offset</w:t>
-            </w:r>
+              <w:t>/</w:t>
+            </w:r>
+            <w:proofErr w:type="spellStart"/>
+            <w:proofErr w:type="gramStart"/>
+            <w:r>
+              <w:rPr>
+                <w:rStyle w:val="VerbatimChar"/>
+                <w:rFonts w:ascii="Times New Roman" w:hAnsi="Times New Roman" w:cs="Times New Roman"/>
+              </w:rPr>
+              <w:t>target</w:t>
+            </w:r>
+            <w:proofErr w:type="gramEnd"/>
+            <w:r>
+              <w:rPr>
+                <w:rStyle w:val="VerbatimChar"/>
+                <w:rFonts w:ascii="Times New Roman" w:hAnsi="Times New Roman" w:cs="Times New Roman"/>
+              </w:rPr>
+              <w:t>_offset</w:t>
+            </w:r>
+            <w:proofErr w:type="spellEnd"/>
           </w:p>
         </w:tc>
         <w:tc>
@@ -9240,14 +9768,40 @@
                 <w:rStyle w:val="VerbatimChar"/>
                 <w:rFonts w:ascii="Times New Roman" w:hAnsi="Times New Roman" w:cs="Times New Roman"/>
               </w:rPr>
-              <w:t>/cmd_vel</w:t>
-            </w:r>
-            <w:r>
-              <w:rPr>
-                <w:rFonts w:ascii="Times New Roman" w:hAnsi="Times New Roman" w:cs="Times New Roman"/>
-              </w:rPr>
-              <w:t xml:space="preserve"> linear.x</w:t>
-            </w:r>
+              <w:t>/</w:t>
+            </w:r>
+            <w:proofErr w:type="spellStart"/>
+            <w:proofErr w:type="gramStart"/>
+            <w:r>
+              <w:rPr>
+                <w:rStyle w:val="VerbatimChar"/>
+                <w:rFonts w:ascii="Times New Roman" w:hAnsi="Times New Roman" w:cs="Times New Roman"/>
+              </w:rPr>
+              <w:t>cmd</w:t>
+            </w:r>
+            <w:proofErr w:type="gramEnd"/>
+            <w:r>
+              <w:rPr>
+                <w:rStyle w:val="VerbatimChar"/>
+                <w:rFonts w:ascii="Times New Roman" w:hAnsi="Times New Roman" w:cs="Times New Roman"/>
+              </w:rPr>
+              <w:t>_vel</w:t>
+            </w:r>
+            <w:proofErr w:type="spellEnd"/>
+            <w:r>
+              <w:rPr>
+                <w:rFonts w:ascii="Times New Roman" w:hAnsi="Times New Roman" w:cs="Times New Roman"/>
+              </w:rPr>
+              <w:t xml:space="preserve"> </w:t>
+            </w:r>
+            <w:proofErr w:type="spellStart"/>
+            <w:r>
+              <w:rPr>
+                <w:rFonts w:ascii="Times New Roman" w:hAnsi="Times New Roman" w:cs="Times New Roman"/>
+              </w:rPr>
+              <w:t>linear.x</w:t>
+            </w:r>
+            <w:proofErr w:type="spellEnd"/>
           </w:p>
         </w:tc>
         <w:tc>
@@ -9304,14 +9858,42 @@
                 <w:rStyle w:val="VerbatimChar"/>
                 <w:rFonts w:ascii="Times New Roman" w:hAnsi="Times New Roman" w:cs="Times New Roman"/>
               </w:rPr>
-              <w:t>/cmd_vel</w:t>
-            </w:r>
-            <w:r>
-              <w:rPr>
-                <w:rFonts w:ascii="Times New Roman" w:hAnsi="Times New Roman" w:cs="Times New Roman"/>
-              </w:rPr>
-              <w:t xml:space="preserve"> angular.z</w:t>
-            </w:r>
+              <w:t>/</w:t>
+            </w:r>
+            <w:proofErr w:type="spellStart"/>
+            <w:proofErr w:type="gramStart"/>
+            <w:r>
+              <w:rPr>
+                <w:rStyle w:val="VerbatimChar"/>
+                <w:rFonts w:ascii="Times New Roman" w:hAnsi="Times New Roman" w:cs="Times New Roman"/>
+              </w:rPr>
+              <w:t>cmd</w:t>
+            </w:r>
+            <w:proofErr w:type="gramEnd"/>
+            <w:r>
+              <w:rPr>
+                <w:rStyle w:val="VerbatimChar"/>
+                <w:rFonts w:ascii="Times New Roman" w:hAnsi="Times New Roman" w:cs="Times New Roman"/>
+              </w:rPr>
+              <w:t>_vel</w:t>
+            </w:r>
+            <w:proofErr w:type="spellEnd"/>
+            <w:r>
+              <w:rPr>
+                <w:rFonts w:ascii="Times New Roman" w:hAnsi="Times New Roman" w:cs="Times New Roman"/>
+              </w:rPr>
+              <w:t xml:space="preserve"> </w:t>
+            </w:r>
+            <w:proofErr w:type="spellStart"/>
+            <w:proofErr w:type="gramStart"/>
+            <w:r>
+              <w:rPr>
+                <w:rFonts w:ascii="Times New Roman" w:hAnsi="Times New Roman" w:cs="Times New Roman"/>
+              </w:rPr>
+              <w:t>angular.z</w:t>
+            </w:r>
+            <w:proofErr w:type="spellEnd"/>
+            <w:proofErr w:type="gramEnd"/>
           </w:p>
         </w:tc>
         <w:tc>
@@ -9368,7 +9950,65 @@
         <w:rPr>
           <w:rFonts w:cs="Times New Roman"/>
         </w:rPr>
-        <w:t>Applying this to the live offset of -0.4618 gives 0.3694 rad/s, matching the live /cmd_vel value of 0.36944 rad/s to five decimal places. The negative offset correctly produced a positive angular.z (a left turn), and linear.x remained zero since the offset exceeded the centring threshold, closing the loop between offline verification and genuine ROSject behaviour.</w:t>
+        <w:t>Applying this to the live offset of -0.4618 gives 0.3694 rad/s, matching the live /</w:t>
+      </w:r>
+      <w:proofErr w:type="spellStart"/>
+      <w:r>
+        <w:rPr>
+          <w:rFonts w:cs="Times New Roman"/>
+        </w:rPr>
+        <w:t>cmd_vel</w:t>
+      </w:r>
+      <w:proofErr w:type="spellEnd"/>
+      <w:r>
+        <w:rPr>
+          <w:rFonts w:cs="Times New Roman"/>
+        </w:rPr>
+        <w:t xml:space="preserve"> value of 0.36944 rad/s to five decimal places. The negative offset correctly produced a positive </w:t>
+      </w:r>
+      <w:proofErr w:type="spellStart"/>
+      <w:proofErr w:type="gramStart"/>
+      <w:r>
+        <w:rPr>
+          <w:rFonts w:cs="Times New Roman"/>
+        </w:rPr>
+        <w:t>angular.z</w:t>
+      </w:r>
+      <w:proofErr w:type="spellEnd"/>
+      <w:proofErr w:type="gramEnd"/>
+      <w:r>
+        <w:rPr>
+          <w:rFonts w:cs="Times New Roman"/>
+        </w:rPr>
+        <w:t xml:space="preserve"> (a left turn), and </w:t>
+      </w:r>
+      <w:proofErr w:type="spellStart"/>
+      <w:r>
+        <w:rPr>
+          <w:rFonts w:cs="Times New Roman"/>
+        </w:rPr>
+        <w:t>linear.x</w:t>
+      </w:r>
+      <w:proofErr w:type="spellEnd"/>
+      <w:r>
+        <w:rPr>
+          <w:rFonts w:cs="Times New Roman"/>
+        </w:rPr>
+        <w:t xml:space="preserve"> remained zero since the offset exceeded the centring threshold, closing the loop between offline verification and genuine </w:t>
+      </w:r>
+      <w:proofErr w:type="spellStart"/>
+      <w:r>
+        <w:rPr>
+          <w:rFonts w:cs="Times New Roman"/>
+        </w:rPr>
+        <w:t>ROSject</w:t>
+      </w:r>
+      <w:proofErr w:type="spellEnd"/>
+      <w:r>
+        <w:rPr>
+          <w:rFonts w:cs="Times New Roman"/>
+        </w:rPr>
+        <w:t xml:space="preserve"> behaviour.</w:t>
       </w:r>
     </w:p>
     <w:p>
@@ -9633,7 +10273,35 @@
         <w:rPr>
           <w:rFonts w:ascii="Times New Roman" w:hAnsi="Times New Roman" w:cs="Times New Roman"/>
         </w:rPr>
-        <w:t>This report has presented two robotic vision systems for the module Advanced Robotics Automation and Computer Vision. Task 1 produced a MobileNetV2 based plant disease classifier trained on PlantVillage, reaching the accuracy and F1 performance reported in the Executive Summary while remaining light enough for embedded deployment. Task 2 produced a ROS 2 perception and navigation design for a simulated TurtleBot3 using HSV colour thresholding and a rule-based controller, verified offline across seven scenarios and confirmed on the live ROSject, matching the controller's proportional gain to five decimal places.</w:t>
+        <w:t xml:space="preserve">This report has presented two robotic vision systems for the module Advanced Robotics Automation and Computer Vision. Task 1 produced a MobileNetV2 based plant disease classifier trained on </w:t>
+      </w:r>
+      <w:proofErr w:type="spellStart"/>
+      <w:r>
+        <w:rPr>
+          <w:rFonts w:ascii="Times New Roman" w:hAnsi="Times New Roman" w:cs="Times New Roman"/>
+        </w:rPr>
+        <w:t>PlantVillage</w:t>
+      </w:r>
+      <w:proofErr w:type="spellEnd"/>
+      <w:r>
+        <w:rPr>
+          <w:rFonts w:ascii="Times New Roman" w:hAnsi="Times New Roman" w:cs="Times New Roman"/>
+        </w:rPr>
+        <w:t xml:space="preserve">, reaching the accuracy and F1 performance reported in the Executive Summary while remaining light enough for embedded deployment. Task 2 produced a ROS 2 perception and navigation design for a simulated TurtleBot3 using HSV colour thresholding and a rule-based controller, verified offline across seven scenarios and confirmed on the live </w:t>
+      </w:r>
+      <w:proofErr w:type="spellStart"/>
+      <w:r>
+        <w:rPr>
+          <w:rFonts w:ascii="Times New Roman" w:hAnsi="Times New Roman" w:cs="Times New Roman"/>
+        </w:rPr>
+        <w:t>ROSject</w:t>
+      </w:r>
+      <w:proofErr w:type="spellEnd"/>
+      <w:r>
+        <w:rPr>
+          <w:rFonts w:ascii="Times New Roman" w:hAnsi="Times New Roman" w:cs="Times New Roman"/>
+        </w:rPr>
+        <w:t>, matching the controller's proportional gain to five decimal places.</w:t>
       </w:r>
     </w:p>
     <w:p>
@@ -9778,7 +10446,21 @@
         <w:rPr>
           <w:rFonts w:cs="Times New Roman"/>
         </w:rPr>
-        <w:t xml:space="preserve">Jlassi, A., Elaoud, A., Ghazouani, H., and Barhoumi, W. (2024) 'Potato Leaf Disease Classification Using Transfer Learning and Reweighting-Based Training with Imbalanced Data.' SN Computer Science 5, 987. [online] Available from </w:t>
+        <w:t xml:space="preserve">Jlassi, A., </w:t>
+      </w:r>
+      <w:proofErr w:type="spellStart"/>
+      <w:r>
+        <w:rPr>
+          <w:rFonts w:cs="Times New Roman"/>
+        </w:rPr>
+        <w:t>Elaoud</w:t>
+      </w:r>
+      <w:proofErr w:type="spellEnd"/>
+      <w:r>
+        <w:rPr>
+          <w:rFonts w:cs="Times New Roman"/>
+        </w:rPr>
+        <w:t xml:space="preserve">, A., Ghazouani, H., and Barhoumi, W. (2024) 'Potato Leaf Disease Classification Using Transfer Learning and Reweighting-Based Training with Imbalanced Data.' SN Computer Science 5, 987. [online] Available from </w:t>
       </w:r>
       <w:hyperlink r:id="rId26" w:history="1">
         <w:r>
@@ -9870,11 +10552,33 @@
           <w:rFonts w:cs="Times New Roman"/>
         </w:rPr>
       </w:pPr>
-      <w:r>
-        <w:rPr>
-          <w:rFonts w:cs="Times New Roman"/>
-        </w:rPr>
-        <w:t xml:space="preserve">mohanty/PlantVillage (2016) [online] Available from </w:t>
+      <w:proofErr w:type="spellStart"/>
+      <w:r>
+        <w:rPr>
+          <w:rFonts w:cs="Times New Roman"/>
+        </w:rPr>
+        <w:t>mohanty</w:t>
+      </w:r>
+      <w:proofErr w:type="spellEnd"/>
+      <w:r>
+        <w:rPr>
+          <w:rFonts w:cs="Times New Roman"/>
+        </w:rPr>
+        <w:t>/</w:t>
+      </w:r>
+      <w:proofErr w:type="spellStart"/>
+      <w:r>
+        <w:rPr>
+          <w:rFonts w:cs="Times New Roman"/>
+        </w:rPr>
+        <w:t>PlantVillage</w:t>
+      </w:r>
+      <w:proofErr w:type="spellEnd"/>
+      <w:r>
+        <w:rPr>
+          <w:rFonts w:cs="Times New Roman"/>
+        </w:rPr>
+        <w:t xml:space="preserve"> (2016) [online] Available from </w:t>
       </w:r>
       <w:hyperlink r:id="rId29">
         <w:r>
@@ -9998,11 +10702,19 @@
           <w:rFonts w:cs="Times New Roman"/>
         </w:rPr>
       </w:pPr>
-      <w:r>
-        <w:rPr>
-          <w:rFonts w:cs="Times New Roman"/>
-        </w:rPr>
-        <w:t xml:space="preserve">PlantVillage-Dataset (2016) [online] Available from </w:t>
+      <w:proofErr w:type="spellStart"/>
+      <w:r>
+        <w:rPr>
+          <w:rFonts w:cs="Times New Roman"/>
+        </w:rPr>
+        <w:t>PlantVillage</w:t>
+      </w:r>
+      <w:proofErr w:type="spellEnd"/>
+      <w:r>
+        <w:rPr>
+          <w:rFonts w:cs="Times New Roman"/>
+        </w:rPr>
+        <w:t xml:space="preserve">-Dataset (2016) [online] Available from </w:t>
       </w:r>
       <w:hyperlink r:id="rId32">
         <w:r>
@@ -10033,7 +10745,21 @@
           <w:rFonts w:cs="Times New Roman"/>
         </w:rPr>
         <w:lastRenderedPageBreak/>
-        <w:t>Quigley, M., Conley, K., Gerkey, B., Faust, J., Foote, T., Leibs, J., Wheeler, R., and Ng, A.Y. (2009) ‘ROS: an open-source Robot Operating System.’ In: ICRA Workshop on Open Source Software. Kobe: IEEE.</w:t>
+        <w:t xml:space="preserve">Quigley, M., Conley, K., Gerkey, B., Faust, J., Foote, T., Leibs, J., Wheeler, R., and Ng, A.Y. (2009) ‘ROS: an open-source Robot Operating System.’ In: ICRA Workshop on </w:t>
+      </w:r>
+      <w:proofErr w:type="gramStart"/>
+      <w:r>
+        <w:rPr>
+          <w:rFonts w:cs="Times New Roman"/>
+        </w:rPr>
+        <w:t>Open Source</w:t>
+      </w:r>
+      <w:proofErr w:type="gramEnd"/>
+      <w:r>
+        <w:rPr>
+          <w:rFonts w:cs="Times New Roman"/>
+        </w:rPr>
+        <w:t xml:space="preserve"> Software. Kobe: IEEE.</w:t>
       </w:r>
     </w:p>
     <w:p>
@@ -11069,6 +11795,7 @@
   <w:style w:type="character" w:default="1" w:styleId="DefaultParagraphFont">
     <w:name w:val="Default Paragraph Font"/>
     <w:uiPriority w:val="1"/>
+    <w:semiHidden/>
     <w:unhideWhenUsed/>
   </w:style>
   <w:style w:type="table" w:default="1" w:styleId="TableNormal">

</xml_diff>

<commit_message>
Update report document figures and adjust launch file to set TurtleBot3 model environment variable
</commit_message>
<xml_diff>
--- a/Sem2/Advanced Robotics Automation and Computer Vision/Report.docx
+++ b/Sem2/Advanced Robotics Automation and Computer Vision/Report.docx
@@ -2901,9 +2901,11 @@
         <w:tabs>
           <w:tab w:val="right" w:leader="dot" w:pos="9016"/>
         </w:tabs>
-        <w:spacing w:before="240" w:line="276" w:lineRule="auto"/>
-        <w:rPr>
-          <w:rFonts w:eastAsiaTheme="minorEastAsia" w:cs="Times New Roman"/>
+        <w:spacing w:before="240" w:after="240" w:line="360" w:lineRule="auto"/>
+        <w:rPr>
+          <w:rFonts w:asciiTheme="minorHAnsi" w:eastAsiaTheme="minorEastAsia" w:hAnsiTheme="minorHAnsi"/>
+          <w:noProof/>
+          <w:lang w:val="en-US"/>
         </w:rPr>
       </w:pPr>
       <w:r>
@@ -2924,59 +2926,58 @@
         </w:rPr>
         <w:fldChar w:fldCharType="separate"/>
       </w:r>
-      <w:hyperlink w:anchor="_Toc240473340" w:history="1">
+      <w:hyperlink w:anchor="_Toc240551036" w:history="1">
         <w:r>
           <w:rPr>
             <w:rStyle w:val="Hyperlink"/>
-            <w:rFonts w:cs="Times New Roman"/>
+            <w:noProof/>
           </w:rPr>
           <w:t>Figure 1: Distribution of images across the 38 PlantVillage classes, illustrating the class imbalance referred to above.</w:t>
         </w:r>
         <w:r>
           <w:rPr>
-            <w:rFonts w:cs="Times New Roman"/>
-            <w:webHidden/>
-          </w:rPr>
-          <w:tab/>
-        </w:r>
-        <w:r>
-          <w:rPr>
-            <w:rFonts w:cs="Times New Roman"/>
-            <w:webHidden/>
-          </w:rPr>
-          <w:fldChar w:fldCharType="begin"/>
-        </w:r>
-        <w:r>
-          <w:rPr>
-            <w:rFonts w:cs="Times New Roman"/>
-            <w:webHidden/>
-          </w:rPr>
-          <w:instrText xml:space="preserve"> PAGEREF _Toc240473340 \h </w:instrText>
-        </w:r>
-        <w:r>
-          <w:rPr>
-            <w:rFonts w:cs="Times New Roman"/>
-            <w:webHidden/>
-          </w:rPr>
-        </w:r>
-        <w:r>
-          <w:rPr>
-            <w:rFonts w:cs="Times New Roman"/>
-            <w:webHidden/>
-          </w:rPr>
-          <w:fldChar w:fldCharType="separate"/>
-        </w:r>
-        <w:r>
-          <w:rPr>
-            <w:rFonts w:cs="Times New Roman"/>
             <w:noProof/>
             <w:webHidden/>
           </w:rPr>
-          <w:t>9</w:t>
-        </w:r>
-        <w:r>
-          <w:rPr>
-            <w:rFonts w:cs="Times New Roman"/>
+          <w:tab/>
+        </w:r>
+        <w:r>
+          <w:rPr>
+            <w:noProof/>
+            <w:webHidden/>
+          </w:rPr>
+          <w:fldChar w:fldCharType="begin"/>
+        </w:r>
+        <w:r>
+          <w:rPr>
+            <w:noProof/>
+            <w:webHidden/>
+          </w:rPr>
+          <w:instrText xml:space="preserve"> PAGEREF _Toc240551036 \h </w:instrText>
+        </w:r>
+        <w:r>
+          <w:rPr>
+            <w:noProof/>
+            <w:webHidden/>
+          </w:rPr>
+        </w:r>
+        <w:r>
+          <w:rPr>
+            <w:noProof/>
+            <w:webHidden/>
+          </w:rPr>
+          <w:fldChar w:fldCharType="separate"/>
+        </w:r>
+        <w:r>
+          <w:rPr>
+            <w:noProof/>
+            <w:webHidden/>
+          </w:rPr>
+          <w:t>10</w:t>
+        </w:r>
+        <w:r>
+          <w:rPr>
+            <w:noProof/>
             <w:webHidden/>
           </w:rPr>
           <w:fldChar w:fldCharType="end"/>
@@ -2989,64 +2990,65 @@
         <w:tabs>
           <w:tab w:val="right" w:leader="dot" w:pos="9016"/>
         </w:tabs>
-        <w:spacing w:before="240" w:line="276" w:lineRule="auto"/>
-        <w:rPr>
-          <w:rFonts w:eastAsiaTheme="minorEastAsia" w:cs="Times New Roman"/>
-        </w:rPr>
-      </w:pPr>
-      <w:hyperlink w:anchor="_Toc240473341" w:history="1">
+        <w:spacing w:after="240"/>
+        <w:rPr>
+          <w:rFonts w:asciiTheme="minorHAnsi" w:eastAsiaTheme="minorEastAsia" w:hAnsiTheme="minorHAnsi"/>
+          <w:noProof/>
+          <w:lang w:val="en-US"/>
+        </w:rPr>
+      </w:pPr>
+      <w:hyperlink w:anchor="_Toc240551037" w:history="1">
         <w:r>
           <w:rPr>
             <w:rStyle w:val="Hyperlink"/>
-            <w:rFonts w:cs="Times New Roman"/>
+            <w:noProof/>
           </w:rPr>
           <w:t>Figure 2: Grid of augmented training images with labels, illustrating the transformations described above.</w:t>
         </w:r>
         <w:r>
           <w:rPr>
-            <w:rFonts w:cs="Times New Roman"/>
-            <w:webHidden/>
-          </w:rPr>
-          <w:tab/>
-        </w:r>
-        <w:r>
-          <w:rPr>
-            <w:rFonts w:cs="Times New Roman"/>
-            <w:webHidden/>
-          </w:rPr>
-          <w:fldChar w:fldCharType="begin"/>
-        </w:r>
-        <w:r>
-          <w:rPr>
-            <w:rFonts w:cs="Times New Roman"/>
-            <w:webHidden/>
-          </w:rPr>
-          <w:instrText xml:space="preserve"> PAGEREF _Toc240473341 \h </w:instrText>
-        </w:r>
-        <w:r>
-          <w:rPr>
-            <w:rFonts w:cs="Times New Roman"/>
-            <w:webHidden/>
-          </w:rPr>
-        </w:r>
-        <w:r>
-          <w:rPr>
-            <w:rFonts w:cs="Times New Roman"/>
-            <w:webHidden/>
-          </w:rPr>
-          <w:fldChar w:fldCharType="separate"/>
-        </w:r>
-        <w:r>
-          <w:rPr>
-            <w:rFonts w:cs="Times New Roman"/>
             <w:noProof/>
             <w:webHidden/>
           </w:rPr>
-          <w:t>10</w:t>
-        </w:r>
-        <w:r>
-          <w:rPr>
-            <w:rFonts w:cs="Times New Roman"/>
+          <w:tab/>
+        </w:r>
+        <w:r>
+          <w:rPr>
+            <w:noProof/>
+            <w:webHidden/>
+          </w:rPr>
+          <w:fldChar w:fldCharType="begin"/>
+        </w:r>
+        <w:r>
+          <w:rPr>
+            <w:noProof/>
+            <w:webHidden/>
+          </w:rPr>
+          <w:instrText xml:space="preserve"> PAGEREF _Toc240551037 \h </w:instrText>
+        </w:r>
+        <w:r>
+          <w:rPr>
+            <w:noProof/>
+            <w:webHidden/>
+          </w:rPr>
+        </w:r>
+        <w:r>
+          <w:rPr>
+            <w:noProof/>
+            <w:webHidden/>
+          </w:rPr>
+          <w:fldChar w:fldCharType="separate"/>
+        </w:r>
+        <w:r>
+          <w:rPr>
+            <w:noProof/>
+            <w:webHidden/>
+          </w:rPr>
+          <w:t>11</w:t>
+        </w:r>
+        <w:r>
+          <w:rPr>
+            <w:noProof/>
             <w:webHidden/>
           </w:rPr>
           <w:fldChar w:fldCharType="end"/>
@@ -3059,64 +3061,65 @@
         <w:tabs>
           <w:tab w:val="right" w:leader="dot" w:pos="9016"/>
         </w:tabs>
-        <w:spacing w:before="240" w:line="276" w:lineRule="auto"/>
-        <w:rPr>
-          <w:rFonts w:eastAsiaTheme="minorEastAsia" w:cs="Times New Roman"/>
-        </w:rPr>
-      </w:pPr>
-      <w:hyperlink w:anchor="_Toc240473342" w:history="1">
+        <w:spacing w:after="240"/>
+        <w:rPr>
+          <w:rFonts w:asciiTheme="minorHAnsi" w:eastAsiaTheme="minorEastAsia" w:hAnsiTheme="minorHAnsi"/>
+          <w:noProof/>
+          <w:lang w:val="en-US"/>
+        </w:rPr>
+      </w:pPr>
+      <w:hyperlink w:anchor="_Toc240551038" w:history="1">
         <w:r>
           <w:rPr>
             <w:rStyle w:val="Hyperlink"/>
-            <w:rFonts w:cs="Times New Roman"/>
+            <w:noProof/>
           </w:rPr>
           <w:t>Figure 3: MobileNetV2 architecture overview, showing the pretrained backbone with the original 1000-class head replaced by a 38-class linear layer.</w:t>
         </w:r>
         <w:r>
           <w:rPr>
-            <w:rFonts w:cs="Times New Roman"/>
-            <w:webHidden/>
-          </w:rPr>
-          <w:tab/>
-        </w:r>
-        <w:r>
-          <w:rPr>
-            <w:rFonts w:cs="Times New Roman"/>
-            <w:webHidden/>
-          </w:rPr>
-          <w:fldChar w:fldCharType="begin"/>
-        </w:r>
-        <w:r>
-          <w:rPr>
-            <w:rFonts w:cs="Times New Roman"/>
-            <w:webHidden/>
-          </w:rPr>
-          <w:instrText xml:space="preserve"> PAGEREF _Toc240473342 \h </w:instrText>
-        </w:r>
-        <w:r>
-          <w:rPr>
-            <w:rFonts w:cs="Times New Roman"/>
-            <w:webHidden/>
-          </w:rPr>
-        </w:r>
-        <w:r>
-          <w:rPr>
-            <w:rFonts w:cs="Times New Roman"/>
-            <w:webHidden/>
-          </w:rPr>
-          <w:fldChar w:fldCharType="separate"/>
-        </w:r>
-        <w:r>
-          <w:rPr>
-            <w:rFonts w:cs="Times New Roman"/>
             <w:noProof/>
             <w:webHidden/>
           </w:rPr>
-          <w:t>11</w:t>
-        </w:r>
-        <w:r>
-          <w:rPr>
-            <w:rFonts w:cs="Times New Roman"/>
+          <w:tab/>
+        </w:r>
+        <w:r>
+          <w:rPr>
+            <w:noProof/>
+            <w:webHidden/>
+          </w:rPr>
+          <w:fldChar w:fldCharType="begin"/>
+        </w:r>
+        <w:r>
+          <w:rPr>
+            <w:noProof/>
+            <w:webHidden/>
+          </w:rPr>
+          <w:instrText xml:space="preserve"> PAGEREF _Toc240551038 \h </w:instrText>
+        </w:r>
+        <w:r>
+          <w:rPr>
+            <w:noProof/>
+            <w:webHidden/>
+          </w:rPr>
+        </w:r>
+        <w:r>
+          <w:rPr>
+            <w:noProof/>
+            <w:webHidden/>
+          </w:rPr>
+          <w:fldChar w:fldCharType="separate"/>
+        </w:r>
+        <w:r>
+          <w:rPr>
+            <w:noProof/>
+            <w:webHidden/>
+          </w:rPr>
+          <w:t>12</w:t>
+        </w:r>
+        <w:r>
+          <w:rPr>
+            <w:noProof/>
             <w:webHidden/>
           </w:rPr>
           <w:fldChar w:fldCharType="end"/>
@@ -3129,64 +3132,65 @@
         <w:tabs>
           <w:tab w:val="right" w:leader="dot" w:pos="9016"/>
         </w:tabs>
-        <w:spacing w:before="240" w:line="276" w:lineRule="auto"/>
-        <w:rPr>
-          <w:rFonts w:eastAsiaTheme="minorEastAsia" w:cs="Times New Roman"/>
-        </w:rPr>
-      </w:pPr>
-      <w:hyperlink w:anchor="_Toc240473343" w:history="1">
+        <w:spacing w:after="240"/>
+        <w:rPr>
+          <w:rFonts w:asciiTheme="minorHAnsi" w:eastAsiaTheme="minorEastAsia" w:hAnsiTheme="minorHAnsi"/>
+          <w:noProof/>
+          <w:lang w:val="en-US"/>
+        </w:rPr>
+      </w:pPr>
+      <w:hyperlink w:anchor="_Toc240551039" w:history="1">
         <w:r>
           <w:rPr>
             <w:rStyle w:val="Hyperlink"/>
-            <w:rFonts w:cs="Times New Roman"/>
+            <w:noProof/>
           </w:rPr>
           <w:t>Figure 4: Training and validation loss and accuracy across all eight epochs.</w:t>
         </w:r>
         <w:r>
           <w:rPr>
-            <w:rFonts w:cs="Times New Roman"/>
-            <w:webHidden/>
-          </w:rPr>
-          <w:tab/>
-        </w:r>
-        <w:r>
-          <w:rPr>
-            <w:rFonts w:cs="Times New Roman"/>
-            <w:webHidden/>
-          </w:rPr>
-          <w:fldChar w:fldCharType="begin"/>
-        </w:r>
-        <w:r>
-          <w:rPr>
-            <w:rFonts w:cs="Times New Roman"/>
-            <w:webHidden/>
-          </w:rPr>
-          <w:instrText xml:space="preserve"> PAGEREF _Toc240473343 \h </w:instrText>
-        </w:r>
-        <w:r>
-          <w:rPr>
-            <w:rFonts w:cs="Times New Roman"/>
-            <w:webHidden/>
-          </w:rPr>
-        </w:r>
-        <w:r>
-          <w:rPr>
-            <w:rFonts w:cs="Times New Roman"/>
-            <w:webHidden/>
-          </w:rPr>
-          <w:fldChar w:fldCharType="separate"/>
-        </w:r>
-        <w:r>
-          <w:rPr>
-            <w:rFonts w:cs="Times New Roman"/>
             <w:noProof/>
             <w:webHidden/>
           </w:rPr>
-          <w:t>12</w:t>
-        </w:r>
-        <w:r>
-          <w:rPr>
-            <w:rFonts w:cs="Times New Roman"/>
+          <w:tab/>
+        </w:r>
+        <w:r>
+          <w:rPr>
+            <w:noProof/>
+            <w:webHidden/>
+          </w:rPr>
+          <w:fldChar w:fldCharType="begin"/>
+        </w:r>
+        <w:r>
+          <w:rPr>
+            <w:noProof/>
+            <w:webHidden/>
+          </w:rPr>
+          <w:instrText xml:space="preserve"> PAGEREF _Toc240551039 \h </w:instrText>
+        </w:r>
+        <w:r>
+          <w:rPr>
+            <w:noProof/>
+            <w:webHidden/>
+          </w:rPr>
+        </w:r>
+        <w:r>
+          <w:rPr>
+            <w:noProof/>
+            <w:webHidden/>
+          </w:rPr>
+          <w:fldChar w:fldCharType="separate"/>
+        </w:r>
+        <w:r>
+          <w:rPr>
+            <w:noProof/>
+            <w:webHidden/>
+          </w:rPr>
+          <w:t>13</w:t>
+        </w:r>
+        <w:r>
+          <w:rPr>
+            <w:noProof/>
             <w:webHidden/>
           </w:rPr>
           <w:fldChar w:fldCharType="end"/>
@@ -3199,64 +3203,65 @@
         <w:tabs>
           <w:tab w:val="right" w:leader="dot" w:pos="9016"/>
         </w:tabs>
-        <w:spacing w:before="240" w:line="276" w:lineRule="auto"/>
-        <w:rPr>
-          <w:rFonts w:eastAsiaTheme="minorEastAsia" w:cs="Times New Roman"/>
-        </w:rPr>
-      </w:pPr>
-      <w:hyperlink w:anchor="_Toc240473344" w:history="1">
+        <w:spacing w:after="240"/>
+        <w:rPr>
+          <w:rFonts w:asciiTheme="minorHAnsi" w:eastAsiaTheme="minorEastAsia" w:hAnsiTheme="minorHAnsi"/>
+          <w:noProof/>
+          <w:lang w:val="en-US"/>
+        </w:rPr>
+      </w:pPr>
+      <w:hyperlink w:anchor="_Toc240551040" w:history="1">
         <w:r>
           <w:rPr>
             <w:rStyle w:val="Hyperlink"/>
-            <w:rFonts w:cs="Times New Roman"/>
+            <w:noProof/>
           </w:rPr>
           <w:t>Figure 5: Sample predictions on validation images, showing predicted label, true label and model confidence.</w:t>
         </w:r>
         <w:r>
           <w:rPr>
-            <w:rFonts w:cs="Times New Roman"/>
-            <w:webHidden/>
-          </w:rPr>
-          <w:tab/>
-        </w:r>
-        <w:r>
-          <w:rPr>
-            <w:rFonts w:cs="Times New Roman"/>
-            <w:webHidden/>
-          </w:rPr>
-          <w:fldChar w:fldCharType="begin"/>
-        </w:r>
-        <w:r>
-          <w:rPr>
-            <w:rFonts w:cs="Times New Roman"/>
-            <w:webHidden/>
-          </w:rPr>
-          <w:instrText xml:space="preserve"> PAGEREF _Toc240473344 \h </w:instrText>
-        </w:r>
-        <w:r>
-          <w:rPr>
-            <w:rFonts w:cs="Times New Roman"/>
-            <w:webHidden/>
-          </w:rPr>
-        </w:r>
-        <w:r>
-          <w:rPr>
-            <w:rFonts w:cs="Times New Roman"/>
-            <w:webHidden/>
-          </w:rPr>
-          <w:fldChar w:fldCharType="separate"/>
-        </w:r>
-        <w:r>
-          <w:rPr>
-            <w:rFonts w:cs="Times New Roman"/>
             <w:noProof/>
             <w:webHidden/>
           </w:rPr>
+          <w:tab/>
+        </w:r>
+        <w:r>
+          <w:rPr>
+            <w:noProof/>
+            <w:webHidden/>
+          </w:rPr>
+          <w:fldChar w:fldCharType="begin"/>
+        </w:r>
+        <w:r>
+          <w:rPr>
+            <w:noProof/>
+            <w:webHidden/>
+          </w:rPr>
+          <w:instrText xml:space="preserve"> PAGEREF _Toc240551040 \h </w:instrText>
+        </w:r>
+        <w:r>
+          <w:rPr>
+            <w:noProof/>
+            <w:webHidden/>
+          </w:rPr>
+        </w:r>
+        <w:r>
+          <w:rPr>
+            <w:noProof/>
+            <w:webHidden/>
+          </w:rPr>
+          <w:fldChar w:fldCharType="separate"/>
+        </w:r>
+        <w:r>
+          <w:rPr>
+            <w:noProof/>
+            <w:webHidden/>
+          </w:rPr>
           <w:t>13</w:t>
         </w:r>
         <w:r>
           <w:rPr>
-            <w:rFonts w:cs="Times New Roman"/>
+            <w:noProof/>
             <w:webHidden/>
           </w:rPr>
           <w:fldChar w:fldCharType="end"/>
@@ -3269,64 +3274,65 @@
         <w:tabs>
           <w:tab w:val="right" w:leader="dot" w:pos="9016"/>
         </w:tabs>
-        <w:spacing w:before="240" w:line="276" w:lineRule="auto"/>
-        <w:rPr>
-          <w:rFonts w:eastAsiaTheme="minorEastAsia" w:cs="Times New Roman"/>
-        </w:rPr>
-      </w:pPr>
-      <w:hyperlink w:anchor="_Toc240473345" w:history="1">
+        <w:spacing w:after="240"/>
+        <w:rPr>
+          <w:rFonts w:asciiTheme="minorHAnsi" w:eastAsiaTheme="minorEastAsia" w:hAnsiTheme="minorHAnsi"/>
+          <w:noProof/>
+          <w:lang w:val="en-US"/>
+        </w:rPr>
+      </w:pPr>
+      <w:hyperlink w:anchor="_Toc240551041" w:history="1">
         <w:r>
           <w:rPr>
             <w:rStyle w:val="Hyperlink"/>
-            <w:rFonts w:cs="Times New Roman"/>
+            <w:noProof/>
           </w:rPr>
           <w:t>Figure 6: Full 38-class confusion matrix on the validation set.</w:t>
         </w:r>
         <w:r>
           <w:rPr>
-            <w:rFonts w:cs="Times New Roman"/>
-            <w:webHidden/>
-          </w:rPr>
-          <w:tab/>
-        </w:r>
-        <w:r>
-          <w:rPr>
-            <w:rFonts w:cs="Times New Roman"/>
-            <w:webHidden/>
-          </w:rPr>
-          <w:fldChar w:fldCharType="begin"/>
-        </w:r>
-        <w:r>
-          <w:rPr>
-            <w:rFonts w:cs="Times New Roman"/>
-            <w:webHidden/>
-          </w:rPr>
-          <w:instrText xml:space="preserve"> PAGEREF _Toc240473345 \h </w:instrText>
-        </w:r>
-        <w:r>
-          <w:rPr>
-            <w:rFonts w:cs="Times New Roman"/>
-            <w:webHidden/>
-          </w:rPr>
-        </w:r>
-        <w:r>
-          <w:rPr>
-            <w:rFonts w:cs="Times New Roman"/>
-            <w:webHidden/>
-          </w:rPr>
-          <w:fldChar w:fldCharType="separate"/>
-        </w:r>
-        <w:r>
-          <w:rPr>
-            <w:rFonts w:cs="Times New Roman"/>
             <w:noProof/>
             <w:webHidden/>
           </w:rPr>
-          <w:t>14</w:t>
-        </w:r>
-        <w:r>
-          <w:rPr>
-            <w:rFonts w:cs="Times New Roman"/>
+          <w:tab/>
+        </w:r>
+        <w:r>
+          <w:rPr>
+            <w:noProof/>
+            <w:webHidden/>
+          </w:rPr>
+          <w:fldChar w:fldCharType="begin"/>
+        </w:r>
+        <w:r>
+          <w:rPr>
+            <w:noProof/>
+            <w:webHidden/>
+          </w:rPr>
+          <w:instrText xml:space="preserve"> PAGEREF _Toc240551041 \h </w:instrText>
+        </w:r>
+        <w:r>
+          <w:rPr>
+            <w:noProof/>
+            <w:webHidden/>
+          </w:rPr>
+        </w:r>
+        <w:r>
+          <w:rPr>
+            <w:noProof/>
+            <w:webHidden/>
+          </w:rPr>
+          <w:fldChar w:fldCharType="separate"/>
+        </w:r>
+        <w:r>
+          <w:rPr>
+            <w:noProof/>
+            <w:webHidden/>
+          </w:rPr>
+          <w:t>15</w:t>
+        </w:r>
+        <w:r>
+          <w:rPr>
+            <w:noProof/>
             <w:webHidden/>
           </w:rPr>
           <w:fldChar w:fldCharType="end"/>
@@ -3339,64 +3345,65 @@
         <w:tabs>
           <w:tab w:val="right" w:leader="dot" w:pos="9016"/>
         </w:tabs>
-        <w:spacing w:before="240" w:line="276" w:lineRule="auto"/>
-        <w:rPr>
-          <w:rFonts w:eastAsiaTheme="minorEastAsia" w:cs="Times New Roman"/>
-        </w:rPr>
-      </w:pPr>
-      <w:hyperlink w:anchor="_Toc240473346" w:history="1">
+        <w:spacing w:after="240"/>
+        <w:rPr>
+          <w:rFonts w:asciiTheme="minorHAnsi" w:eastAsiaTheme="minorEastAsia" w:hAnsiTheme="minorHAnsi"/>
+          <w:noProof/>
+          <w:lang w:val="en-US"/>
+        </w:rPr>
+      </w:pPr>
+      <w:hyperlink w:anchor="_Toc240551042" w:history="1">
         <w:r>
           <w:rPr>
             <w:rStyle w:val="Hyperlink"/>
-            <w:rFonts w:cs="Times New Roman"/>
+            <w:noProof/>
           </w:rPr>
           <w:t>Figure 7: TheConstruct.ai ROSject workspace (rosject 1049584), showing the turtlebot3_vision_nav package files and a terminal session used to inspect /cmd_vel, /target_offset and /target_visible directly with ros2 topic echo.</w:t>
         </w:r>
         <w:r>
           <w:rPr>
-            <w:rFonts w:cs="Times New Roman"/>
-            <w:webHidden/>
-          </w:rPr>
-          <w:tab/>
-        </w:r>
-        <w:r>
-          <w:rPr>
-            <w:rFonts w:cs="Times New Roman"/>
-            <w:webHidden/>
-          </w:rPr>
-          <w:fldChar w:fldCharType="begin"/>
-        </w:r>
-        <w:r>
-          <w:rPr>
-            <w:rFonts w:cs="Times New Roman"/>
-            <w:webHidden/>
-          </w:rPr>
-          <w:instrText xml:space="preserve"> PAGEREF _Toc240473346 \h </w:instrText>
-        </w:r>
-        <w:r>
-          <w:rPr>
-            <w:rFonts w:cs="Times New Roman"/>
-            <w:webHidden/>
-          </w:rPr>
-        </w:r>
-        <w:r>
-          <w:rPr>
-            <w:rFonts w:cs="Times New Roman"/>
-            <w:webHidden/>
-          </w:rPr>
-          <w:fldChar w:fldCharType="separate"/>
-        </w:r>
-        <w:r>
-          <w:rPr>
-            <w:rFonts w:cs="Times New Roman"/>
             <w:noProof/>
             <w:webHidden/>
           </w:rPr>
-          <w:t>16</w:t>
-        </w:r>
-        <w:r>
-          <w:rPr>
-            <w:rFonts w:cs="Times New Roman"/>
+          <w:tab/>
+        </w:r>
+        <w:r>
+          <w:rPr>
+            <w:noProof/>
+            <w:webHidden/>
+          </w:rPr>
+          <w:fldChar w:fldCharType="begin"/>
+        </w:r>
+        <w:r>
+          <w:rPr>
+            <w:noProof/>
+            <w:webHidden/>
+          </w:rPr>
+          <w:instrText xml:space="preserve"> PAGEREF _Toc240551042 \h </w:instrText>
+        </w:r>
+        <w:r>
+          <w:rPr>
+            <w:noProof/>
+            <w:webHidden/>
+          </w:rPr>
+        </w:r>
+        <w:r>
+          <w:rPr>
+            <w:noProof/>
+            <w:webHidden/>
+          </w:rPr>
+          <w:fldChar w:fldCharType="separate"/>
+        </w:r>
+        <w:r>
+          <w:rPr>
+            <w:noProof/>
+            <w:webHidden/>
+          </w:rPr>
+          <w:t>17</w:t>
+        </w:r>
+        <w:r>
+          <w:rPr>
+            <w:noProof/>
             <w:webHidden/>
           </w:rPr>
           <w:fldChar w:fldCharType="end"/>
@@ -3409,64 +3416,65 @@
         <w:tabs>
           <w:tab w:val="right" w:leader="dot" w:pos="9016"/>
         </w:tabs>
-        <w:spacing w:before="240" w:line="276" w:lineRule="auto"/>
-        <w:rPr>
-          <w:rFonts w:eastAsiaTheme="minorEastAsia" w:cs="Times New Roman"/>
-        </w:rPr>
-      </w:pPr>
-      <w:hyperlink w:anchor="_Toc240473347" w:history="1">
+        <w:spacing w:after="240"/>
+        <w:rPr>
+          <w:rFonts w:asciiTheme="minorHAnsi" w:eastAsiaTheme="minorEastAsia" w:hAnsiTheme="minorHAnsi"/>
+          <w:noProof/>
+          <w:lang w:val="en-US"/>
+        </w:rPr>
+      </w:pPr>
+      <w:hyperlink w:anchor="_Toc240551043" w:history="1">
         <w:r>
           <w:rPr>
             <w:rStyle w:val="Hyperlink"/>
-            <w:rFonts w:cs="Times New Roman"/>
+            <w:noProof/>
           </w:rPr>
           <w:t>Figure 8: The waffle_pi TurtleBot3 spawned in turtlebot3_world, showing the entity tree and simulation configuration.</w:t>
         </w:r>
         <w:r>
           <w:rPr>
-            <w:rFonts w:cs="Times New Roman"/>
-            <w:webHidden/>
-          </w:rPr>
-          <w:tab/>
-        </w:r>
-        <w:r>
-          <w:rPr>
-            <w:rFonts w:cs="Times New Roman"/>
-            <w:webHidden/>
-          </w:rPr>
-          <w:fldChar w:fldCharType="begin"/>
-        </w:r>
-        <w:r>
-          <w:rPr>
-            <w:rFonts w:cs="Times New Roman"/>
-            <w:webHidden/>
-          </w:rPr>
-          <w:instrText xml:space="preserve"> PAGEREF _Toc240473347 \h </w:instrText>
-        </w:r>
-        <w:r>
-          <w:rPr>
-            <w:rFonts w:cs="Times New Roman"/>
-            <w:webHidden/>
-          </w:rPr>
-        </w:r>
-        <w:r>
-          <w:rPr>
-            <w:rFonts w:cs="Times New Roman"/>
-            <w:webHidden/>
-          </w:rPr>
-          <w:fldChar w:fldCharType="separate"/>
-        </w:r>
-        <w:r>
-          <w:rPr>
-            <w:rFonts w:cs="Times New Roman"/>
             <w:noProof/>
             <w:webHidden/>
           </w:rPr>
-          <w:t>17</w:t>
-        </w:r>
-        <w:r>
-          <w:rPr>
-            <w:rFonts w:cs="Times New Roman"/>
+          <w:tab/>
+        </w:r>
+        <w:r>
+          <w:rPr>
+            <w:noProof/>
+            <w:webHidden/>
+          </w:rPr>
+          <w:fldChar w:fldCharType="begin"/>
+        </w:r>
+        <w:r>
+          <w:rPr>
+            <w:noProof/>
+            <w:webHidden/>
+          </w:rPr>
+          <w:instrText xml:space="preserve"> PAGEREF _Toc240551043 \h </w:instrText>
+        </w:r>
+        <w:r>
+          <w:rPr>
+            <w:noProof/>
+            <w:webHidden/>
+          </w:rPr>
+        </w:r>
+        <w:r>
+          <w:rPr>
+            <w:noProof/>
+            <w:webHidden/>
+          </w:rPr>
+          <w:fldChar w:fldCharType="separate"/>
+        </w:r>
+        <w:r>
+          <w:rPr>
+            <w:noProof/>
+            <w:webHidden/>
+          </w:rPr>
+          <w:t>18</w:t>
+        </w:r>
+        <w:r>
+          <w:rPr>
+            <w:noProof/>
             <w:webHidden/>
           </w:rPr>
           <w:fldChar w:fldCharType="end"/>
@@ -3479,64 +3487,65 @@
         <w:tabs>
           <w:tab w:val="right" w:leader="dot" w:pos="9016"/>
         </w:tabs>
-        <w:spacing w:before="240" w:line="276" w:lineRule="auto"/>
-        <w:rPr>
-          <w:rFonts w:eastAsiaTheme="minorEastAsia" w:cs="Times New Roman"/>
-        </w:rPr>
-      </w:pPr>
-      <w:hyperlink w:anchor="_Toc240473348" w:history="1">
+        <w:spacing w:after="240"/>
+        <w:rPr>
+          <w:rFonts w:asciiTheme="minorHAnsi" w:eastAsiaTheme="minorEastAsia" w:hAnsiTheme="minorHAnsi"/>
+          <w:noProof/>
+          <w:lang w:val="en-US"/>
+        </w:rPr>
+      </w:pPr>
+      <w:hyperlink w:anchor="_Toc240551044" w:history="1">
         <w:r>
           <w:rPr>
             <w:rStyle w:val="Hyperlink"/>
-            <w:rFonts w:cs="Times New Roman"/>
-          </w:rPr>
-          <w:t>Figure 9: The simulated scene during placement of a target marker and lighting within the world.</w:t>
-        </w:r>
-        <w:r>
-          <w:rPr>
-            <w:rFonts w:cs="Times New Roman"/>
-            <w:webHidden/>
-          </w:rPr>
-          <w:tab/>
-        </w:r>
-        <w:r>
-          <w:rPr>
-            <w:rFonts w:cs="Times New Roman"/>
-            <w:webHidden/>
-          </w:rPr>
-          <w:fldChar w:fldCharType="begin"/>
-        </w:r>
-        <w:r>
-          <w:rPr>
-            <w:rFonts w:cs="Times New Roman"/>
-            <w:webHidden/>
-          </w:rPr>
-          <w:instrText xml:space="preserve"> PAGEREF _Toc240473348 \h </w:instrText>
-        </w:r>
-        <w:r>
-          <w:rPr>
-            <w:rFonts w:cs="Times New Roman"/>
-            <w:webHidden/>
-          </w:rPr>
-        </w:r>
-        <w:r>
-          <w:rPr>
-            <w:rFonts w:cs="Times New Roman"/>
-            <w:webHidden/>
-          </w:rPr>
-          <w:fldChar w:fldCharType="separate"/>
-        </w:r>
-        <w:r>
-          <w:rPr>
-            <w:rFonts w:cs="Times New Roman"/>
+            <w:noProof/>
+          </w:rPr>
+          <w:t>Figure 9: The simulated scene during placement of a target marker within the world.</w:t>
+        </w:r>
+        <w:r>
+          <w:rPr>
             <w:noProof/>
             <w:webHidden/>
           </w:rPr>
-          <w:t>18</w:t>
-        </w:r>
-        <w:r>
-          <w:rPr>
-            <w:rFonts w:cs="Times New Roman"/>
+          <w:tab/>
+        </w:r>
+        <w:r>
+          <w:rPr>
+            <w:noProof/>
+            <w:webHidden/>
+          </w:rPr>
+          <w:fldChar w:fldCharType="begin"/>
+        </w:r>
+        <w:r>
+          <w:rPr>
+            <w:noProof/>
+            <w:webHidden/>
+          </w:rPr>
+          <w:instrText xml:space="preserve"> PAGEREF _Toc240551044 \h </w:instrText>
+        </w:r>
+        <w:r>
+          <w:rPr>
+            <w:noProof/>
+            <w:webHidden/>
+          </w:rPr>
+        </w:r>
+        <w:r>
+          <w:rPr>
+            <w:noProof/>
+            <w:webHidden/>
+          </w:rPr>
+          <w:fldChar w:fldCharType="separate"/>
+        </w:r>
+        <w:r>
+          <w:rPr>
+            <w:noProof/>
+            <w:webHidden/>
+          </w:rPr>
+          <w:t>19</w:t>
+        </w:r>
+        <w:r>
+          <w:rPr>
+            <w:noProof/>
             <w:webHidden/>
           </w:rPr>
           <w:fldChar w:fldCharType="end"/>
@@ -3549,64 +3558,65 @@
         <w:tabs>
           <w:tab w:val="right" w:leader="dot" w:pos="9016"/>
         </w:tabs>
-        <w:spacing w:before="240" w:line="276" w:lineRule="auto"/>
-        <w:rPr>
-          <w:rFonts w:eastAsiaTheme="minorEastAsia" w:cs="Times New Roman"/>
-        </w:rPr>
-      </w:pPr>
-      <w:hyperlink w:anchor="_Toc240473349" w:history="1">
+        <w:spacing w:after="240"/>
+        <w:rPr>
+          <w:rFonts w:asciiTheme="minorHAnsi" w:eastAsiaTheme="minorEastAsia" w:hAnsiTheme="minorHAnsi"/>
+          <w:noProof/>
+          <w:lang w:val="en-US"/>
+        </w:rPr>
+      </w:pPr>
+      <w:hyperlink w:anchor="_Toc240551045" w:history="1">
         <w:r>
           <w:rPr>
             <w:rStyle w:val="Hyperlink"/>
-            <w:rFonts w:cs="Times New Roman"/>
+            <w:noProof/>
           </w:rPr>
           <w:t>Figure 10: The perception-control pipeline, showing the two nodes, the topics connecting them, and the debug image branch.</w:t>
         </w:r>
         <w:r>
           <w:rPr>
-            <w:rFonts w:cs="Times New Roman"/>
-            <w:webHidden/>
-          </w:rPr>
-          <w:tab/>
-        </w:r>
-        <w:r>
-          <w:rPr>
-            <w:rFonts w:cs="Times New Roman"/>
-            <w:webHidden/>
-          </w:rPr>
-          <w:fldChar w:fldCharType="begin"/>
-        </w:r>
-        <w:r>
-          <w:rPr>
-            <w:rFonts w:cs="Times New Roman"/>
-            <w:webHidden/>
-          </w:rPr>
-          <w:instrText xml:space="preserve"> PAGEREF _Toc240473349 \h </w:instrText>
-        </w:r>
-        <w:r>
-          <w:rPr>
-            <w:rFonts w:cs="Times New Roman"/>
-            <w:webHidden/>
-          </w:rPr>
-        </w:r>
-        <w:r>
-          <w:rPr>
-            <w:rFonts w:cs="Times New Roman"/>
-            <w:webHidden/>
-          </w:rPr>
-          <w:fldChar w:fldCharType="separate"/>
-        </w:r>
-        <w:r>
-          <w:rPr>
-            <w:rFonts w:cs="Times New Roman"/>
             <w:noProof/>
             <w:webHidden/>
           </w:rPr>
-          <w:t>19</w:t>
-        </w:r>
-        <w:r>
-          <w:rPr>
-            <w:rFonts w:cs="Times New Roman"/>
+          <w:tab/>
+        </w:r>
+        <w:r>
+          <w:rPr>
+            <w:noProof/>
+            <w:webHidden/>
+          </w:rPr>
+          <w:fldChar w:fldCharType="begin"/>
+        </w:r>
+        <w:r>
+          <w:rPr>
+            <w:noProof/>
+            <w:webHidden/>
+          </w:rPr>
+          <w:instrText xml:space="preserve"> PAGEREF _Toc240551045 \h </w:instrText>
+        </w:r>
+        <w:r>
+          <w:rPr>
+            <w:noProof/>
+            <w:webHidden/>
+          </w:rPr>
+        </w:r>
+        <w:r>
+          <w:rPr>
+            <w:noProof/>
+            <w:webHidden/>
+          </w:rPr>
+          <w:fldChar w:fldCharType="separate"/>
+        </w:r>
+        <w:r>
+          <w:rPr>
+            <w:noProof/>
+            <w:webHidden/>
+          </w:rPr>
+          <w:t>20</w:t>
+        </w:r>
+        <w:r>
+          <w:rPr>
+            <w:noProof/>
             <w:webHidden/>
           </w:rPr>
           <w:fldChar w:fldCharType="end"/>
@@ -3619,73 +3629,74 @@
         <w:tabs>
           <w:tab w:val="right" w:leader="dot" w:pos="9016"/>
         </w:tabs>
-        <w:spacing w:before="240" w:line="276" w:lineRule="auto"/>
-        <w:rPr>
-          <w:rFonts w:eastAsiaTheme="minorEastAsia" w:cs="Times New Roman"/>
-        </w:rPr>
-      </w:pPr>
-      <w:hyperlink w:anchor="_Toc240473350" w:history="1">
+        <w:spacing w:after="240"/>
+        <w:rPr>
+          <w:rFonts w:asciiTheme="minorHAnsi" w:eastAsiaTheme="minorEastAsia" w:hAnsiTheme="minorHAnsi"/>
+          <w:noProof/>
+          <w:lang w:val="en-US"/>
+        </w:rPr>
+      </w:pPr>
+      <w:hyperlink w:anchor="_Toc240551046" w:history="1">
         <w:r>
           <w:rPr>
             <w:rStyle w:val="Hyperlink"/>
-            <w:rFonts w:cs="Times New Roman"/>
+            <w:noProof/>
           </w:rPr>
           <w:t>Figure 11: Synthetic test frames with the computed offset, visibility flag and resulting velocity command for each scenario.</w:t>
         </w:r>
         <w:r>
           <w:rPr>
-            <w:rFonts w:cs="Times New Roman"/>
-            <w:webHidden/>
-          </w:rPr>
-          <w:tab/>
-        </w:r>
-        <w:r>
-          <w:rPr>
-            <w:rFonts w:cs="Times New Roman"/>
-            <w:webHidden/>
-          </w:rPr>
-          <w:fldChar w:fldCharType="begin"/>
-        </w:r>
-        <w:r>
-          <w:rPr>
-            <w:rFonts w:cs="Times New Roman"/>
-            <w:webHidden/>
-          </w:rPr>
-          <w:instrText xml:space="preserve"> PAGEREF _Toc240473350 \h </w:instrText>
-        </w:r>
-        <w:r>
-          <w:rPr>
-            <w:rFonts w:cs="Times New Roman"/>
-            <w:webHidden/>
-          </w:rPr>
-        </w:r>
-        <w:r>
-          <w:rPr>
-            <w:rFonts w:cs="Times New Roman"/>
-            <w:webHidden/>
-          </w:rPr>
-          <w:fldChar w:fldCharType="separate"/>
-        </w:r>
-        <w:r>
-          <w:rPr>
-            <w:rFonts w:cs="Times New Roman"/>
             <w:noProof/>
             <w:webHidden/>
           </w:rPr>
-          <w:t>20</w:t>
-        </w:r>
-        <w:r>
-          <w:rPr>
-            <w:rFonts w:cs="Times New Roman"/>
+          <w:tab/>
+        </w:r>
+        <w:r>
+          <w:rPr>
+            <w:noProof/>
             <w:webHidden/>
           </w:rPr>
+          <w:fldChar w:fldCharType="begin"/>
+        </w:r>
+        <w:r>
+          <w:rPr>
+            <w:noProof/>
+            <w:webHidden/>
+          </w:rPr>
+          <w:instrText xml:space="preserve"> PAGEREF _Toc240551046 \h </w:instrText>
+        </w:r>
+        <w:r>
+          <w:rPr>
+            <w:noProof/>
+            <w:webHidden/>
+          </w:rPr>
+        </w:r>
+        <w:r>
+          <w:rPr>
+            <w:noProof/>
+            <w:webHidden/>
+          </w:rPr>
+          <w:fldChar w:fldCharType="separate"/>
+        </w:r>
+        <w:r>
+          <w:rPr>
+            <w:noProof/>
+            <w:webHidden/>
+          </w:rPr>
+          <w:t>21</w:t>
+        </w:r>
+        <w:r>
+          <w:rPr>
+            <w:noProof/>
+            <w:webHidden/>
+          </w:rPr>
           <w:fldChar w:fldCharType="end"/>
         </w:r>
       </w:hyperlink>
     </w:p>
     <w:p>
       <w:pPr>
-        <w:spacing w:before="240" w:line="276" w:lineRule="auto"/>
+        <w:spacing w:before="240" w:after="240" w:line="276" w:lineRule="auto"/>
         <w:rPr>
           <w:rFonts w:cs="Times New Roman"/>
           <w:b/>
@@ -5033,7 +5044,7 @@
       <w:pPr>
         <w:pStyle w:val="FigureStyle"/>
       </w:pPr>
-      <w:bookmarkStart w:id="7" w:name="_Toc240473340"/>
+      <w:bookmarkStart w:id="7" w:name="_Toc240551036"/>
       <w:r>
         <w:t xml:space="preserve">Figure </w:t>
       </w:r>
@@ -5171,7 +5182,7 @@
       <w:pPr>
         <w:pStyle w:val="FigureStyle"/>
       </w:pPr>
-      <w:bookmarkStart w:id="8" w:name="_Toc240473341"/>
+      <w:bookmarkStart w:id="8" w:name="_Toc240551037"/>
       <w:r>
         <w:t xml:space="preserve">Figure </w:t>
       </w:r>
@@ -5404,7 +5415,7 @@
       <w:pPr>
         <w:pStyle w:val="FigureStyle"/>
       </w:pPr>
-      <w:bookmarkStart w:id="9" w:name="_Toc240473342"/>
+      <w:bookmarkStart w:id="9" w:name="_Toc240551038"/>
       <w:r>
         <w:t xml:space="preserve">Figure </w:t>
       </w:r>
@@ -6356,7 +6367,7 @@
       <w:pPr>
         <w:pStyle w:val="FigureStyle"/>
       </w:pPr>
-      <w:bookmarkStart w:id="13" w:name="_Toc240473343"/>
+      <w:bookmarkStart w:id="13" w:name="_Toc240551039"/>
       <w:r>
         <w:t xml:space="preserve">Figure </w:t>
       </w:r>
@@ -6465,7 +6476,7 @@
       <w:pPr>
         <w:pStyle w:val="FigureStyle"/>
       </w:pPr>
-      <w:bookmarkStart w:id="14" w:name="_Toc240473344"/>
+      <w:bookmarkStart w:id="14" w:name="_Toc240551040"/>
       <w:r>
         <w:t xml:space="preserve">Figure </w:t>
       </w:r>
@@ -7079,7 +7090,7 @@
       <w:pPr>
         <w:pStyle w:val="FigureStyle"/>
       </w:pPr>
-      <w:bookmarkStart w:id="18" w:name="_Toc240473345"/>
+      <w:bookmarkStart w:id="18" w:name="_Toc240551041"/>
       <w:r>
         <w:t xml:space="preserve">Figure </w:t>
       </w:r>
@@ -7423,7 +7434,7 @@
       <w:pPr>
         <w:pStyle w:val="FigureStyle"/>
       </w:pPr>
-      <w:bookmarkStart w:id="22" w:name="_Toc240473346"/>
+      <w:bookmarkStart w:id="22" w:name="_Toc240551042"/>
       <w:r>
         <w:t xml:space="preserve">Figure </w:t>
       </w:r>
@@ -7610,7 +7621,7 @@
       <w:pPr>
         <w:pStyle w:val="FigureStyle"/>
       </w:pPr>
-      <w:bookmarkStart w:id="23" w:name="_Toc240473347"/>
+      <w:bookmarkStart w:id="23" w:name="_Toc240551043"/>
       <w:r>
         <w:t xml:space="preserve">Figure </w:t>
       </w:r>
@@ -7713,7 +7724,7 @@
       <w:pPr>
         <w:pStyle w:val="FigureStyle"/>
       </w:pPr>
-      <w:bookmarkStart w:id="24" w:name="_Toc240473348"/>
+      <w:bookmarkStart w:id="24" w:name="_Toc240551044"/>
       <w:r>
         <w:t xml:space="preserve">Figure </w:t>
       </w:r>
@@ -7736,7 +7747,7 @@
         <w:fldChar w:fldCharType="end"/>
       </w:r>
       <w:r>
-        <w:t>: The simulated scene during placement of a target marker and lighting within the world.</w:t>
+        <w:t>: The simulated scene during placement of a target marker within the world.</w:t>
       </w:r>
       <w:bookmarkEnd w:id="24"/>
     </w:p>
@@ -7847,7 +7858,7 @@
       <w:pPr>
         <w:pStyle w:val="FigureStyle"/>
       </w:pPr>
-      <w:bookmarkStart w:id="27" w:name="_Toc240473349"/>
+      <w:bookmarkStart w:id="27" w:name="_Toc240551045"/>
       <w:r>
         <w:t xml:space="preserve">Figure </w:t>
       </w:r>
@@ -8046,7 +8057,7 @@
       <w:pPr>
         <w:pStyle w:val="FigureStyle"/>
       </w:pPr>
-      <w:bookmarkStart w:id="30" w:name="_Toc240473350"/>
+      <w:bookmarkStart w:id="30" w:name="_Toc240551046"/>
       <w:r>
         <w:t xml:space="preserve">Figure </w:t>
       </w:r>
@@ -11795,7 +11806,6 @@
   <w:style w:type="character" w:default="1" w:styleId="DefaultParagraphFont">
     <w:name w:val="Default Paragraph Font"/>
     <w:uiPriority w:val="1"/>
-    <w:semiHidden/>
     <w:unhideWhenUsed/>
   </w:style>
   <w:style w:type="table" w:default="1" w:styleId="TableNormal">

</xml_diff>

<commit_message>
Update Robotics Software and Programming Report: Revise assignment title, submission date, and module details; enhance table of contents and figures; improve compliance statement; add abstract and acknowledgements; refine evaluation and reflection sections; include source code links.
</commit_message>
<xml_diff>
--- a/Sem2/Advanced Robotics Automation and Computer Vision/Report.docx
+++ b/Sem2/Advanced Robotics Automation and Computer Vision/Report.docx
@@ -532,7 +532,25 @@
           <w:sz w:val="28"/>
           <w:szCs w:val="28"/>
         </w:rPr>
-        <w:t>Dr Fahmid Al Farid</w:t>
+        <w:t xml:space="preserve">Dr </w:t>
+      </w:r>
+      <w:proofErr w:type="spellStart"/>
+      <w:r>
+        <w:rPr>
+          <w:rFonts w:cs="Times New Roman"/>
+          <w:sz w:val="28"/>
+          <w:szCs w:val="28"/>
+        </w:rPr>
+        <w:t>Fahmid</w:t>
+      </w:r>
+      <w:proofErr w:type="spellEnd"/>
+      <w:r>
+        <w:rPr>
+          <w:rFonts w:cs="Times New Roman"/>
+          <w:sz w:val="28"/>
+          <w:szCs w:val="28"/>
+        </w:rPr>
+        <w:t xml:space="preserve"> Al Farid</w:t>
       </w:r>
     </w:p>
     <w:p>
@@ -4434,16 +4452,9 @@
     <w:p>
       <w:pPr>
         <w:pStyle w:val="Heading1"/>
-        <w:spacing w:before="0"/>
-        <w:rPr>
-          <w:rFonts w:cs="Times New Roman"/>
-        </w:rPr>
       </w:pPr>
       <w:bookmarkStart w:id="0" w:name="_Toc241062510"/>
       <w:r>
-        <w:rPr>
-          <w:rFonts w:cs="Times New Roman"/>
-        </w:rPr>
         <w:lastRenderedPageBreak/>
         <w:t>Abstract</w:t>
       </w:r>
@@ -4462,7 +4473,21 @@
         <w:rPr>
           <w:rFonts w:ascii="Times New Roman" w:hAnsi="Times New Roman" w:cs="Times New Roman"/>
         </w:rPr>
-        <w:t>This report covers two related projects for the module Advanced Robotics Automation and Computer Vision. The first is a deep learning vision system for crop health monitoring, trained on PlantVillage and adapted through augmentation to approximate low-altitude drone imagery, covering viewpoint change, motion blur and variable lighting. A MobileNetV2 backbone, pretrained on ImageNet, was fine-tuned on 54,305 leaf images across 38 classes using an 80/20 split, reaching 99.11% validation accuracy, 98.64% macro precision, 99.06% macro recall and 98.83% macro F1 over eight epochs. The classifier has around 2.27 million parameters, suited to onboard drone inference.</w:t>
+        <w:t xml:space="preserve">This report covers two related projects for the module Advanced Robotics Automation and Computer Vision. The first is a deep learning vision system for crop health monitoring, trained on </w:t>
+      </w:r>
+      <w:proofErr w:type="spellStart"/>
+      <w:r>
+        <w:rPr>
+          <w:rFonts w:ascii="Times New Roman" w:hAnsi="Times New Roman" w:cs="Times New Roman"/>
+        </w:rPr>
+        <w:t>PlantVillage</w:t>
+      </w:r>
+      <w:proofErr w:type="spellEnd"/>
+      <w:r>
+        <w:rPr>
+          <w:rFonts w:ascii="Times New Roman" w:hAnsi="Times New Roman" w:cs="Times New Roman"/>
+        </w:rPr>
+        <w:t xml:space="preserve"> and adapted through augmentation to approximate low-altitude drone imagery, covering viewpoint change, motion blur and variable lighting. A MobileNetV2 backbone, pretrained on ImageNet, was fine-tuned on 54,305 leaf images across 38 classes using an 80/20 split, reaching 99.11% validation accuracy, 98.64% macro precision, 99.06% macro recall and 98.83% macro F1 over eight epochs. The classifier has around 2.27 million parameters, suited to onboard drone inference.</w:t>
       </w:r>
     </w:p>
     <w:p>
@@ -4499,12 +4524,26 @@
         <w:rPr>
           <w:rFonts w:ascii="Times New Roman" w:hAnsi="Times New Roman" w:cs="Times New Roman"/>
         </w:rPr>
-        <w:t xml:space="preserve">guided navigation for a simulated TurtleBot3 in a ROS 2 Gazebo environment, using OpenCV colour thresholding to detect a marker and a rule-based controller to search, turn and approach it. Perception and control were verified offline against seven synthetic test frames covering centred, off-centre, near, far, absent and distractor scenarios, and a live query of the deployed ROSject reproduced the same proportional turning behaviour to five decimal places. </w:t>
-      </w:r>
+        <w:t xml:space="preserve">guided navigation for a simulated TurtleBot3 in a ROS 2 Gazebo environment, using OpenCV colour thresholding to detect a marker and a rule-based controller to search, turn and approach it. Perception and control were verified offline against seven synthetic test frames covering centred, off-centre, near, far, absent and distractor scenarios, and a live query of the deployed </w:t>
+      </w:r>
+      <w:proofErr w:type="spellStart"/>
       <w:r>
         <w:rPr>
           <w:rFonts w:ascii="Times New Roman" w:hAnsi="Times New Roman" w:cs="Times New Roman"/>
         </w:rPr>
+        <w:t>ROSject</w:t>
+      </w:r>
+      <w:proofErr w:type="spellEnd"/>
+      <w:r>
+        <w:rPr>
+          <w:rFonts w:ascii="Times New Roman" w:hAnsi="Times New Roman" w:cs="Times New Roman"/>
+        </w:rPr>
+        <w:t xml:space="preserve"> reproduced the same proportional turning behaviour to five decimal places. </w:t>
+      </w:r>
+      <w:r>
+        <w:rPr>
+          <w:rFonts w:ascii="Times New Roman" w:hAnsi="Times New Roman" w:cs="Times New Roman"/>
+        </w:rPr>
         <w:t>Seen side by side, the two projects make the case that a learned, offline approach and a classical, real-time one each fit their own robotic context.</w:t>
       </w:r>
       <w:r>
@@ -4517,16 +4556,9 @@
     <w:p>
       <w:pPr>
         <w:pStyle w:val="Heading1"/>
-        <w:spacing w:before="0"/>
-        <w:rPr>
-          <w:rFonts w:cs="Times New Roman"/>
-        </w:rPr>
       </w:pPr>
       <w:bookmarkStart w:id="1" w:name="_Toc241062511"/>
       <w:r>
-        <w:rPr>
-          <w:rFonts w:cs="Times New Roman"/>
-        </w:rPr>
         <w:lastRenderedPageBreak/>
         <w:t>Introduction</w:t>
       </w:r>
@@ -4674,25 +4706,15 @@
     <w:p>
       <w:pPr>
         <w:pStyle w:val="Heading1"/>
-        <w:spacing w:before="0"/>
-        <w:rPr>
-          <w:rFonts w:cs="Times New Roman"/>
-        </w:rPr>
       </w:pPr>
       <w:bookmarkStart w:id="2" w:name="_Toc26094236"/>
       <w:bookmarkStart w:id="3" w:name="_Toc241062512"/>
       <w:r>
-        <w:rPr>
-          <w:rFonts w:cs="Times New Roman"/>
-        </w:rPr>
         <w:lastRenderedPageBreak/>
         <w:t xml:space="preserve">Task 1 </w:t>
       </w:r>
       <w:bookmarkEnd w:id="2"/>
       <w:r>
-        <w:rPr>
-          <w:rFonts w:cs="Times New Roman"/>
-        </w:rPr>
         <w:t>- Autonomous Drone-Based Vision System for Crop Health Monitoring and Disease Classification</w:t>
       </w:r>
       <w:bookmarkEnd w:id="3"/>
@@ -4752,8 +4774,8 @@
           <w:rFonts w:cs="Times New Roman"/>
         </w:rPr>
       </w:pPr>
-      <w:bookmarkStart w:id="5" w:name="design-and-implementation"/>
-      <w:bookmarkStart w:id="6" w:name="_Toc241062514"/>
+      <w:bookmarkStart w:id="5" w:name="_Toc241062514"/>
+      <w:bookmarkStart w:id="6" w:name="design-and-implementation"/>
       <w:r>
         <w:rPr>
           <w:rFonts w:cs="Times New Roman"/>
@@ -4766,7 +4788,7 @@
         </w:rPr>
         <w:t>Literature Review</w:t>
       </w:r>
-      <w:bookmarkEnd w:id="6"/>
+      <w:bookmarkEnd w:id="5"/>
     </w:p>
     <w:p>
       <w:pPr>
@@ -4812,7 +4834,35 @@
         <w:rPr>
           <w:rFonts w:cs="Times New Roman"/>
         </w:rPr>
-        <w:t>Hughes and Salathe (2016) were among the first to show deep CNNs trained on PlantVillage could exceed 99% accuracy, though using the dataset's original close range, controlled photographs. Pal et al. (2025) built on this with a lightweight, explainable CNN reaching 99.47% on PlantVillage and 97.73% on a larger 58</w:t>
+        <w:t xml:space="preserve">Hughes and Salathe (2016) were among the first to show deep CNNs trained on </w:t>
+      </w:r>
+      <w:proofErr w:type="spellStart"/>
+      <w:r>
+        <w:rPr>
+          <w:rFonts w:cs="Times New Roman"/>
+        </w:rPr>
+        <w:t>PlantVillage</w:t>
+      </w:r>
+      <w:proofErr w:type="spellEnd"/>
+      <w:r>
+        <w:rPr>
+          <w:rFonts w:cs="Times New Roman"/>
+        </w:rPr>
+        <w:t xml:space="preserve"> could exceed 99% accuracy, though using the dataset's original close range, controlled photographs. Pal et al. (2025) built on this with a lightweight, explainable CNN reaching 99.47% on </w:t>
+      </w:r>
+      <w:proofErr w:type="spellStart"/>
+      <w:r>
+        <w:rPr>
+          <w:rFonts w:cs="Times New Roman"/>
+        </w:rPr>
+        <w:t>PlantVillage</w:t>
+      </w:r>
+      <w:proofErr w:type="spellEnd"/>
+      <w:r>
+        <w:rPr>
+          <w:rFonts w:cs="Times New Roman"/>
+        </w:rPr>
+        <w:t xml:space="preserve"> and 97.73% on a larger 58</w:t>
       </w:r>
       <w:r>
         <w:rPr>
@@ -4857,7 +4907,21 @@
         <w:rPr>
           <w:rFonts w:cs="Times New Roman"/>
         </w:rPr>
-        <w:t>Manoj et al. (2025) applied disease detection directly to drone imagery over large fields, and a review of AI enabled UAV systems (arXiv, 2023) outlines the sensing and onboard processing limits of aerial platforms. Both point to a gap this project could not fully replicate: real UAV imagery differs from ground</w:t>
+        <w:t>Manoj et al. (2025) applied disease detection directly to drone imagery over large fields, and a review of AI enabled UAV systems (</w:t>
+      </w:r>
+      <w:proofErr w:type="spellStart"/>
+      <w:r>
+        <w:rPr>
+          <w:rFonts w:cs="Times New Roman"/>
+        </w:rPr>
+        <w:t>arXiv</w:t>
+      </w:r>
+      <w:proofErr w:type="spellEnd"/>
+      <w:r>
+        <w:rPr>
+          <w:rFonts w:cs="Times New Roman"/>
+        </w:rPr>
+        <w:t>, 2023) outlines the sensing and onboard processing limits of aerial platforms. Both point to a gap this project could not fully replicate: real UAV imagery differs from ground</w:t>
       </w:r>
       <w:r>
         <w:rPr>
@@ -4909,7 +4973,21 @@
           <w:rFonts w:cs="Times New Roman"/>
         </w:rPr>
         <w:lastRenderedPageBreak/>
-        <w:t>scale. Jlassi et al. (2024) applied MobileNetV2 transfer learning with reweighting to potato leaf disease classification for imbalanced data, with strong results on underrepresented classes, relevant since PlantVillage is also imbalanced.</w:t>
+        <w:t xml:space="preserve">scale. Jlassi et al. (2024) applied MobileNetV2 transfer learning with reweighting to potato leaf disease classification for imbalanced data, with strong results on underrepresented classes, relevant since </w:t>
+      </w:r>
+      <w:proofErr w:type="spellStart"/>
+      <w:r>
+        <w:rPr>
+          <w:rFonts w:cs="Times New Roman"/>
+        </w:rPr>
+        <w:t>PlantVillage</w:t>
+      </w:r>
+      <w:proofErr w:type="spellEnd"/>
+      <w:r>
+        <w:rPr>
+          <w:rFonts w:cs="Times New Roman"/>
+        </w:rPr>
+        <w:t xml:space="preserve"> is also imbalanced.</w:t>
       </w:r>
     </w:p>
     <w:p>
@@ -4964,11 +5042,89 @@
         </w:rPr>
         <w:t xml:space="preserve">The </w:t>
       </w:r>
+      <w:proofErr w:type="spellStart"/>
       <w:r>
         <w:rPr>
           <w:rFonts w:ascii="Times New Roman" w:hAnsi="Times New Roman" w:cs="Times New Roman"/>
         </w:rPr>
-        <w:t>PlantVillage dataset was used via the Hugging Face datasets library (mohanty/PlantVillage), using the colour configuration, mirroring the original repository (mohanty/PlantVillage, 2016; PlantVillage-Dataset, 2016), comprising 54,305 labelled leaf images across 38 classes, a widely used baseline in plant pathology research (Mohanty, Hughes and Salathe, 2016).</w:t>
+        <w:t>PlantVillage</w:t>
+      </w:r>
+      <w:proofErr w:type="spellEnd"/>
+      <w:r>
+        <w:rPr>
+          <w:rFonts w:ascii="Times New Roman" w:hAnsi="Times New Roman" w:cs="Times New Roman"/>
+        </w:rPr>
+        <w:t xml:space="preserve"> dataset was used via the Hugging Face datasets library (</w:t>
+      </w:r>
+      <w:proofErr w:type="spellStart"/>
+      <w:r>
+        <w:rPr>
+          <w:rFonts w:ascii="Times New Roman" w:hAnsi="Times New Roman" w:cs="Times New Roman"/>
+        </w:rPr>
+        <w:t>mohanty</w:t>
+      </w:r>
+      <w:proofErr w:type="spellEnd"/>
+      <w:r>
+        <w:rPr>
+          <w:rFonts w:ascii="Times New Roman" w:hAnsi="Times New Roman" w:cs="Times New Roman"/>
+        </w:rPr>
+        <w:t>/</w:t>
+      </w:r>
+      <w:proofErr w:type="spellStart"/>
+      <w:r>
+        <w:rPr>
+          <w:rFonts w:ascii="Times New Roman" w:hAnsi="Times New Roman" w:cs="Times New Roman"/>
+        </w:rPr>
+        <w:t>PlantVillage</w:t>
+      </w:r>
+      <w:proofErr w:type="spellEnd"/>
+      <w:r>
+        <w:rPr>
+          <w:rFonts w:ascii="Times New Roman" w:hAnsi="Times New Roman" w:cs="Times New Roman"/>
+        </w:rPr>
+        <w:t>), using the colour configuration, mirroring the original repository (</w:t>
+      </w:r>
+      <w:proofErr w:type="spellStart"/>
+      <w:r>
+        <w:rPr>
+          <w:rFonts w:ascii="Times New Roman" w:hAnsi="Times New Roman" w:cs="Times New Roman"/>
+        </w:rPr>
+        <w:t>mohanty</w:t>
+      </w:r>
+      <w:proofErr w:type="spellEnd"/>
+      <w:r>
+        <w:rPr>
+          <w:rFonts w:ascii="Times New Roman" w:hAnsi="Times New Roman" w:cs="Times New Roman"/>
+        </w:rPr>
+        <w:t>/</w:t>
+      </w:r>
+      <w:proofErr w:type="spellStart"/>
+      <w:r>
+        <w:rPr>
+          <w:rFonts w:ascii="Times New Roman" w:hAnsi="Times New Roman" w:cs="Times New Roman"/>
+        </w:rPr>
+        <w:t>PlantVillage</w:t>
+      </w:r>
+      <w:proofErr w:type="spellEnd"/>
+      <w:r>
+        <w:rPr>
+          <w:rFonts w:ascii="Times New Roman" w:hAnsi="Times New Roman" w:cs="Times New Roman"/>
+        </w:rPr>
+        <w:t xml:space="preserve">, 2016; </w:t>
+      </w:r>
+      <w:proofErr w:type="spellStart"/>
+      <w:r>
+        <w:rPr>
+          <w:rFonts w:ascii="Times New Roman" w:hAnsi="Times New Roman" w:cs="Times New Roman"/>
+        </w:rPr>
+        <w:t>PlantVillage</w:t>
+      </w:r>
+      <w:proofErr w:type="spellEnd"/>
+      <w:r>
+        <w:rPr>
+          <w:rFonts w:ascii="Times New Roman" w:hAnsi="Times New Roman" w:cs="Times New Roman"/>
+        </w:rPr>
+        <w:t>-Dataset, 2016), comprising 54,305 labelled leaf images across 38 classes, a widely used baseline in plant pathology research (Mohanty, Hughes and Salathe, 2016).</w:t>
       </w:r>
     </w:p>
     <w:p>
@@ -4983,7 +5139,21 @@
         <w:rPr>
           <w:rFonts w:cs="Times New Roman"/>
         </w:rPr>
-        <w:t>Class counts were inspected prior to splitting, since PlantVillage is not perfectly balanced</w:t>
+        <w:t xml:space="preserve">Class counts were inspected prior to splitting, since </w:t>
+      </w:r>
+      <w:proofErr w:type="spellStart"/>
+      <w:r>
+        <w:rPr>
+          <w:rFonts w:cs="Times New Roman"/>
+        </w:rPr>
+        <w:t>PlantVillage</w:t>
+      </w:r>
+      <w:proofErr w:type="spellEnd"/>
+      <w:r>
+        <w:rPr>
+          <w:rFonts w:cs="Times New Roman"/>
+        </w:rPr>
+        <w:t xml:space="preserve"> is not perfectly balanced</w:t>
       </w:r>
       <w:r>
         <w:rPr>
@@ -5106,7 +5276,15 @@
         <w:fldChar w:fldCharType="end"/>
       </w:r>
       <w:r>
-        <w:t>: Distribution of images across the 38 PlantVillage classes, illustrating the class imbalance referred to above.</w:t>
+        <w:t xml:space="preserve">: Distribution of images across the 38 </w:t>
+      </w:r>
+      <w:proofErr w:type="spellStart"/>
+      <w:r>
+        <w:t>PlantVillage</w:t>
+      </w:r>
+      <w:proofErr w:type="spellEnd"/>
+      <w:r>
+        <w:t xml:space="preserve"> classes, illustrating the class imbalance referred to above.</w:t>
       </w:r>
       <w:bookmarkEnd w:id="8"/>
     </w:p>
@@ -5273,7 +5451,35 @@
         <w:rPr>
           <w:rFonts w:cs="Times New Roman"/>
         </w:rPr>
-        <w:t xml:space="preserve"> was selected as backbone, pretrained on ImageNet and fine-tuned on PlantVillage, with the 1000-class output layer replaced by a linear layer for the 38 PlantVillage classes, giving a final model of approximately 2.27 million trainable parameters.</w:t>
+        <w:t xml:space="preserve"> was selected as backbone, pretrained on ImageNet and fine-tuned on </w:t>
+      </w:r>
+      <w:proofErr w:type="spellStart"/>
+      <w:r>
+        <w:rPr>
+          <w:rFonts w:cs="Times New Roman"/>
+        </w:rPr>
+        <w:t>PlantVillage</w:t>
+      </w:r>
+      <w:proofErr w:type="spellEnd"/>
+      <w:r>
+        <w:rPr>
+          <w:rFonts w:cs="Times New Roman"/>
+        </w:rPr>
+        <w:t xml:space="preserve">, with the 1000-class output layer replaced by a linear layer for the 38 </w:t>
+      </w:r>
+      <w:proofErr w:type="spellStart"/>
+      <w:r>
+        <w:rPr>
+          <w:rFonts w:cs="Times New Roman"/>
+        </w:rPr>
+        <w:t>PlantVillage</w:t>
+      </w:r>
+      <w:proofErr w:type="spellEnd"/>
+      <w:r>
+        <w:rPr>
+          <w:rFonts w:cs="Times New Roman"/>
+        </w:rPr>
+        <w:t xml:space="preserve"> classes, giving a final model of approximately 2.27 million trainable parameters.</w:t>
       </w:r>
       <w:r>
         <w:rPr>
@@ -5294,7 +5500,21 @@
         <w:rPr>
           <w:rFonts w:cs="Times New Roman"/>
         </w:rPr>
-        <w:t>MobileNetV2's key feature is the inverted residual block with linear bottlenecks. It relies on depthwise separable convolutions to cut parameter count relative to standard architectures of comparable depth (Sandler et al., 2018), a good fit for a drone's tight compute, memory and power budget.</w:t>
+        <w:t xml:space="preserve">MobileNetV2's key feature is the inverted residual block with linear bottlenecks. It relies on </w:t>
+      </w:r>
+      <w:proofErr w:type="spellStart"/>
+      <w:r>
+        <w:rPr>
+          <w:rFonts w:cs="Times New Roman"/>
+        </w:rPr>
+        <w:t>depthwise</w:t>
+      </w:r>
+      <w:proofErr w:type="spellEnd"/>
+      <w:r>
+        <w:rPr>
+          <w:rFonts w:cs="Times New Roman"/>
+        </w:rPr>
+        <w:t xml:space="preserve"> separable convolutions to cut parameter count relative to standard architectures of comparable depth (Sandler et al., 2018), a good fit for a drone's tight compute, memory and power budget.</w:t>
       </w:r>
       <w:r>
         <w:rPr>
@@ -5306,7 +5526,21 @@
         <w:rPr>
           <w:rFonts w:cs="Times New Roman"/>
         </w:rPr>
-        <w:t>Figure 3 summarises this structure, showing the pretrained backbone feeding the replaced classification head. Pal et al. (2025) and Kumar et al. (2025) similarly report MobileNet-family accuracy above 99% while remaining edge deployable, supporting the choice made here.</w:t>
+        <w:t xml:space="preserve">Figure 3 summarises this structure, showing the pretrained backbone feeding the replaced classification head. Pal et al. (2025) and Kumar et al. (2025) similarly report </w:t>
+      </w:r>
+      <w:proofErr w:type="spellStart"/>
+      <w:r>
+        <w:rPr>
+          <w:rFonts w:cs="Times New Roman"/>
+        </w:rPr>
+        <w:t>MobileNet</w:t>
+      </w:r>
+      <w:proofErr w:type="spellEnd"/>
+      <w:r>
+        <w:rPr>
+          <w:rFonts w:cs="Times New Roman"/>
+        </w:rPr>
+        <w:t>-family accuracy above 99% while remaining edge deployable, supporting the choice made here.</w:t>
       </w:r>
     </w:p>
     <w:p>
@@ -5439,9 +5673,9 @@
           <w:rFonts w:cs="Times New Roman"/>
         </w:rPr>
       </w:pPr>
-      <w:bookmarkStart w:id="11" w:name="execution-and-testing"/>
-      <w:bookmarkStart w:id="12" w:name="_Toc241062516"/>
-      <w:bookmarkEnd w:id="5"/>
+      <w:bookmarkStart w:id="11" w:name="_Toc241062516"/>
+      <w:bookmarkStart w:id="12" w:name="execution-and-testing"/>
+      <w:bookmarkEnd w:id="6"/>
       <w:r>
         <w:rPr>
           <w:rFonts w:cs="Times New Roman"/>
@@ -5466,14 +5700,30 @@
         </w:rPr>
         <w:t>Code Implementation</w:t>
       </w:r>
-      <w:bookmarkEnd w:id="12"/>
+      <w:bookmarkEnd w:id="11"/>
     </w:p>
     <w:p>
       <w:pPr>
         <w:spacing w:line="360" w:lineRule="auto"/>
       </w:pPr>
       <w:r>
-        <w:t>The system is implemented as a Python package (src/) imported by the notebook, so results are identical whether run locally or in Colab.</w:t>
+        <w:t>The system is implemented as a Python package (</w:t>
+      </w:r>
+      <w:proofErr w:type="spellStart"/>
+      <w:r>
+        <w:t>src</w:t>
+      </w:r>
+      <w:proofErr w:type="spellEnd"/>
+      <w:r>
+        <w:t xml:space="preserve">/) imported by the notebook, so results are identical whether run locally or in </w:t>
+      </w:r>
+      <w:proofErr w:type="spellStart"/>
+      <w:r>
+        <w:t>Colab</w:t>
+      </w:r>
+      <w:proofErr w:type="spellEnd"/>
+      <w:r>
+        <w:t>.</w:t>
       </w:r>
     </w:p>
     <w:p>
@@ -5497,11 +5747,33 @@
         </w:rPr>
         <w:t xml:space="preserve"> </w:t>
       </w:r>
+      <w:proofErr w:type="spellStart"/>
       <w:r>
         <w:rPr>
           <w:lang w:val="en-US"/>
         </w:rPr>
-        <w:t>load_plantvillage() builds a stratified 80/20 split. Augmentation is applied only to training data</w:t>
+        <w:t>load_</w:t>
+      </w:r>
+      <w:proofErr w:type="gramStart"/>
+      <w:r>
+        <w:rPr>
+          <w:lang w:val="en-US"/>
+        </w:rPr>
+        <w:t>plantvillage</w:t>
+      </w:r>
+      <w:proofErr w:type="spellEnd"/>
+      <w:r>
+        <w:rPr>
+          <w:lang w:val="en-US"/>
+        </w:rPr>
+        <w:t>(</w:t>
+      </w:r>
+      <w:proofErr w:type="gramEnd"/>
+      <w:r>
+        <w:rPr>
+          <w:lang w:val="en-US"/>
+        </w:rPr>
+        <w:t>) builds a stratified 80/20 split. Augmentation is applied only to training data</w:t>
       </w:r>
       <w:r>
         <w:rPr>
@@ -5521,13 +5793,43 @@
           <w:szCs w:val="22"/>
         </w:rPr>
       </w:pPr>
+      <w:proofErr w:type="spellStart"/>
       <w:r>
         <w:rPr>
           <w:rFonts w:ascii="Courier New" w:hAnsi="Courier New" w:cs="Courier New"/>
           <w:sz w:val="22"/>
           <w:szCs w:val="22"/>
         </w:rPr>
-        <w:t>train_transform = transforms.Compose([</w:t>
+        <w:t>train_transform</w:t>
+      </w:r>
+      <w:proofErr w:type="spellEnd"/>
+      <w:r>
+        <w:rPr>
+          <w:rFonts w:ascii="Courier New" w:hAnsi="Courier New" w:cs="Courier New"/>
+          <w:sz w:val="22"/>
+          <w:szCs w:val="22"/>
+        </w:rPr>
+        <w:t xml:space="preserve"> = </w:t>
+      </w:r>
+      <w:proofErr w:type="spellStart"/>
+      <w:proofErr w:type="gramStart"/>
+      <w:r>
+        <w:rPr>
+          <w:rFonts w:ascii="Courier New" w:hAnsi="Courier New" w:cs="Courier New"/>
+          <w:sz w:val="22"/>
+          <w:szCs w:val="22"/>
+        </w:rPr>
+        <w:t>transforms.Compose</w:t>
+      </w:r>
+      <w:proofErr w:type="spellEnd"/>
+      <w:proofErr w:type="gramEnd"/>
+      <w:r>
+        <w:rPr>
+          <w:rFonts w:ascii="Courier New" w:hAnsi="Courier New" w:cs="Courier New"/>
+          <w:sz w:val="22"/>
+          <w:szCs w:val="22"/>
+        </w:rPr>
+        <w:t>([</w:t>
       </w:r>
     </w:p>
     <w:p>
@@ -5547,7 +5849,55 @@
           <w:sz w:val="22"/>
           <w:szCs w:val="22"/>
         </w:rPr>
-        <w:t xml:space="preserve">    transforms.RandomRotation(cfg.rotation_degrees),</w:t>
+        <w:t xml:space="preserve">    </w:t>
+      </w:r>
+      <w:proofErr w:type="spellStart"/>
+      <w:proofErr w:type="gramStart"/>
+      <w:r>
+        <w:rPr>
+          <w:rFonts w:ascii="Courier New" w:hAnsi="Courier New" w:cs="Courier New"/>
+          <w:sz w:val="22"/>
+          <w:szCs w:val="22"/>
+        </w:rPr>
+        <w:t>transforms.RandomRotation</w:t>
+      </w:r>
+      <w:proofErr w:type="spellEnd"/>
+      <w:proofErr w:type="gramEnd"/>
+      <w:r>
+        <w:rPr>
+          <w:rFonts w:ascii="Courier New" w:hAnsi="Courier New" w:cs="Courier New"/>
+          <w:sz w:val="22"/>
+          <w:szCs w:val="22"/>
+        </w:rPr>
+        <w:t>(</w:t>
+      </w:r>
+      <w:proofErr w:type="spellStart"/>
+      <w:proofErr w:type="gramStart"/>
+      <w:r>
+        <w:rPr>
+          <w:rFonts w:ascii="Courier New" w:hAnsi="Courier New" w:cs="Courier New"/>
+          <w:sz w:val="22"/>
+          <w:szCs w:val="22"/>
+        </w:rPr>
+        <w:t>cfg.rotation</w:t>
+      </w:r>
+      <w:proofErr w:type="gramEnd"/>
+      <w:r>
+        <w:rPr>
+          <w:rFonts w:ascii="Courier New" w:hAnsi="Courier New" w:cs="Courier New"/>
+          <w:sz w:val="22"/>
+          <w:szCs w:val="22"/>
+        </w:rPr>
+        <w:t>_degrees</w:t>
+      </w:r>
+      <w:proofErr w:type="spellEnd"/>
+      <w:r>
+        <w:rPr>
+          <w:rFonts w:ascii="Courier New" w:hAnsi="Courier New" w:cs="Courier New"/>
+          <w:sz w:val="22"/>
+          <w:szCs w:val="22"/>
+        </w:rPr>
+        <w:t>),</w:t>
       </w:r>
     </w:p>
     <w:p>
@@ -5567,7 +5917,47 @@
           <w:sz w:val="22"/>
           <w:szCs w:val="22"/>
         </w:rPr>
-        <w:t xml:space="preserve">    transforms.ColorJitter(...), transforms.RandomPerspective(...),</w:t>
+        <w:t xml:space="preserve">    </w:t>
+      </w:r>
+      <w:proofErr w:type="spellStart"/>
+      <w:proofErr w:type="gramStart"/>
+      <w:r>
+        <w:rPr>
+          <w:rFonts w:ascii="Courier New" w:hAnsi="Courier New" w:cs="Courier New"/>
+          <w:sz w:val="22"/>
+          <w:szCs w:val="22"/>
+        </w:rPr>
+        <w:t>transforms.ColorJitter</w:t>
+      </w:r>
+      <w:proofErr w:type="spellEnd"/>
+      <w:proofErr w:type="gramEnd"/>
+      <w:r>
+        <w:rPr>
+          <w:rFonts w:ascii="Courier New" w:hAnsi="Courier New" w:cs="Courier New"/>
+          <w:sz w:val="22"/>
+          <w:szCs w:val="22"/>
+        </w:rPr>
+        <w:t xml:space="preserve">(...), </w:t>
+      </w:r>
+      <w:proofErr w:type="spellStart"/>
+      <w:proofErr w:type="gramStart"/>
+      <w:r>
+        <w:rPr>
+          <w:rFonts w:ascii="Courier New" w:hAnsi="Courier New" w:cs="Courier New"/>
+          <w:sz w:val="22"/>
+          <w:szCs w:val="22"/>
+        </w:rPr>
+        <w:t>transforms.RandomPerspective</w:t>
+      </w:r>
+      <w:proofErr w:type="spellEnd"/>
+      <w:proofErr w:type="gramEnd"/>
+      <w:r>
+        <w:rPr>
+          <w:rFonts w:ascii="Courier New" w:hAnsi="Courier New" w:cs="Courier New"/>
+          <w:sz w:val="22"/>
+          <w:szCs w:val="22"/>
+        </w:rPr>
+        <w:t>(...),</w:t>
       </w:r>
     </w:p>
     <w:p>
@@ -5587,7 +5977,47 @@
           <w:sz w:val="22"/>
           <w:szCs w:val="22"/>
         </w:rPr>
-        <w:t xml:space="preserve">    transforms.GaussianBlur(...), transforms.RandomHorizontalFlip(p=0.5),</w:t>
+        <w:t xml:space="preserve">    </w:t>
+      </w:r>
+      <w:proofErr w:type="spellStart"/>
+      <w:proofErr w:type="gramStart"/>
+      <w:r>
+        <w:rPr>
+          <w:rFonts w:ascii="Courier New" w:hAnsi="Courier New" w:cs="Courier New"/>
+          <w:sz w:val="22"/>
+          <w:szCs w:val="22"/>
+        </w:rPr>
+        <w:t>transforms.GaussianBlur</w:t>
+      </w:r>
+      <w:proofErr w:type="spellEnd"/>
+      <w:proofErr w:type="gramEnd"/>
+      <w:r>
+        <w:rPr>
+          <w:rFonts w:ascii="Courier New" w:hAnsi="Courier New" w:cs="Courier New"/>
+          <w:sz w:val="22"/>
+          <w:szCs w:val="22"/>
+        </w:rPr>
+        <w:t xml:space="preserve">(...), </w:t>
+      </w:r>
+      <w:proofErr w:type="spellStart"/>
+      <w:proofErr w:type="gramStart"/>
+      <w:r>
+        <w:rPr>
+          <w:rFonts w:ascii="Courier New" w:hAnsi="Courier New" w:cs="Courier New"/>
+          <w:sz w:val="22"/>
+          <w:szCs w:val="22"/>
+        </w:rPr>
+        <w:t>transforms.RandomHorizontalFlip</w:t>
+      </w:r>
+      <w:proofErr w:type="spellEnd"/>
+      <w:proofErr w:type="gramEnd"/>
+      <w:r>
+        <w:rPr>
+          <w:rFonts w:ascii="Courier New" w:hAnsi="Courier New" w:cs="Courier New"/>
+          <w:sz w:val="22"/>
+          <w:szCs w:val="22"/>
+        </w:rPr>
+        <w:t>(p=0.5),</w:t>
       </w:r>
     </w:p>
     <w:p>
@@ -5607,7 +6037,103 @@
           <w:sz w:val="22"/>
           <w:szCs w:val="22"/>
         </w:rPr>
-        <w:t xml:space="preserve">    transforms.ToTensor(), transforms.Normalize(cfg.imagenet_mean, cfg.imagenet_std),</w:t>
+        <w:t xml:space="preserve">    </w:t>
+      </w:r>
+      <w:proofErr w:type="spellStart"/>
+      <w:proofErr w:type="gramStart"/>
+      <w:r>
+        <w:rPr>
+          <w:rFonts w:ascii="Courier New" w:hAnsi="Courier New" w:cs="Courier New"/>
+          <w:sz w:val="22"/>
+          <w:szCs w:val="22"/>
+        </w:rPr>
+        <w:t>transforms.ToTensor</w:t>
+      </w:r>
+      <w:proofErr w:type="spellEnd"/>
+      <w:proofErr w:type="gramEnd"/>
+      <w:r>
+        <w:rPr>
+          <w:rFonts w:ascii="Courier New" w:hAnsi="Courier New" w:cs="Courier New"/>
+          <w:sz w:val="22"/>
+          <w:szCs w:val="22"/>
+        </w:rPr>
+        <w:t xml:space="preserve">(), </w:t>
+      </w:r>
+      <w:proofErr w:type="spellStart"/>
+      <w:proofErr w:type="gramStart"/>
+      <w:r>
+        <w:rPr>
+          <w:rFonts w:ascii="Courier New" w:hAnsi="Courier New" w:cs="Courier New"/>
+          <w:sz w:val="22"/>
+          <w:szCs w:val="22"/>
+        </w:rPr>
+        <w:t>transforms.Normalize</w:t>
+      </w:r>
+      <w:proofErr w:type="spellEnd"/>
+      <w:proofErr w:type="gramEnd"/>
+      <w:r>
+        <w:rPr>
+          <w:rFonts w:ascii="Courier New" w:hAnsi="Courier New" w:cs="Courier New"/>
+          <w:sz w:val="22"/>
+          <w:szCs w:val="22"/>
+        </w:rPr>
+        <w:t>(</w:t>
+      </w:r>
+      <w:proofErr w:type="spellStart"/>
+      <w:proofErr w:type="gramStart"/>
+      <w:r>
+        <w:rPr>
+          <w:rFonts w:ascii="Courier New" w:hAnsi="Courier New" w:cs="Courier New"/>
+          <w:sz w:val="22"/>
+          <w:szCs w:val="22"/>
+        </w:rPr>
+        <w:t>cfg.imagenet</w:t>
+      </w:r>
+      <w:proofErr w:type="gramEnd"/>
+      <w:r>
+        <w:rPr>
+          <w:rFonts w:ascii="Courier New" w:hAnsi="Courier New" w:cs="Courier New"/>
+          <w:sz w:val="22"/>
+          <w:szCs w:val="22"/>
+        </w:rPr>
+        <w:t>_mean</w:t>
+      </w:r>
+      <w:proofErr w:type="spellEnd"/>
+      <w:r>
+        <w:rPr>
+          <w:rFonts w:ascii="Courier New" w:hAnsi="Courier New" w:cs="Courier New"/>
+          <w:sz w:val="22"/>
+          <w:szCs w:val="22"/>
+        </w:rPr>
+        <w:t xml:space="preserve">, </w:t>
+      </w:r>
+      <w:proofErr w:type="spellStart"/>
+      <w:proofErr w:type="gramStart"/>
+      <w:r>
+        <w:rPr>
+          <w:rFonts w:ascii="Courier New" w:hAnsi="Courier New" w:cs="Courier New"/>
+          <w:sz w:val="22"/>
+          <w:szCs w:val="22"/>
+        </w:rPr>
+        <w:t>cfg.imagenet</w:t>
+      </w:r>
+      <w:proofErr w:type="gramEnd"/>
+      <w:r>
+        <w:rPr>
+          <w:rFonts w:ascii="Courier New" w:hAnsi="Courier New" w:cs="Courier New"/>
+          <w:sz w:val="22"/>
+          <w:szCs w:val="22"/>
+        </w:rPr>
+        <w:t>_std</w:t>
+      </w:r>
+      <w:proofErr w:type="spellEnd"/>
+      <w:r>
+        <w:rPr>
+          <w:rFonts w:ascii="Courier New" w:hAnsi="Courier New" w:cs="Courier New"/>
+          <w:sz w:val="22"/>
+          <w:szCs w:val="22"/>
+        </w:rPr>
+        <w:t>),</w:t>
       </w:r>
     </w:p>
     <w:p>
@@ -5672,7 +6198,25 @@
           <w:sz w:val="22"/>
           <w:szCs w:val="22"/>
         </w:rPr>
-        <w:t>model = models.mobilenet_v2(weights=MobileNet_V2_Weights.IMAGENET1K_V1)</w:t>
+        <w:t xml:space="preserve">model = </w:t>
+      </w:r>
+      <w:proofErr w:type="gramStart"/>
+      <w:r>
+        <w:rPr>
+          <w:rFonts w:ascii="Courier New" w:hAnsi="Courier New" w:cs="Courier New"/>
+          <w:sz w:val="22"/>
+          <w:szCs w:val="22"/>
+        </w:rPr>
+        <w:t>models.mobilenet</w:t>
+      </w:r>
+      <w:proofErr w:type="gramEnd"/>
+      <w:r>
+        <w:rPr>
+          <w:rFonts w:ascii="Courier New" w:hAnsi="Courier New" w:cs="Courier New"/>
+          <w:sz w:val="22"/>
+          <w:szCs w:val="22"/>
+        </w:rPr>
+        <w:t>_v2(weights=MobileNet_V2_Weights.IMAGENET1K_V1)</w:t>
       </w:r>
     </w:p>
     <w:p>
@@ -5686,13 +6230,101 @@
           <w:szCs w:val="22"/>
         </w:rPr>
       </w:pPr>
+      <w:proofErr w:type="spellStart"/>
+      <w:proofErr w:type="gramStart"/>
       <w:r>
         <w:rPr>
           <w:rFonts w:ascii="Courier New" w:hAnsi="Courier New" w:cs="Courier New"/>
           <w:sz w:val="22"/>
           <w:szCs w:val="22"/>
         </w:rPr>
-        <w:t>model.classifier[1] = nn.Linear(model.classifier[1].in_features, num_classes)</w:t>
+        <w:t>model.classifier</w:t>
+      </w:r>
+      <w:proofErr w:type="spellEnd"/>
+      <w:proofErr w:type="gramEnd"/>
+      <w:r>
+        <w:rPr>
+          <w:rFonts w:ascii="Courier New" w:hAnsi="Courier New" w:cs="Courier New"/>
+          <w:sz w:val="22"/>
+          <w:szCs w:val="22"/>
+        </w:rPr>
+        <w:t xml:space="preserve">[1] = </w:t>
+      </w:r>
+      <w:proofErr w:type="spellStart"/>
+      <w:proofErr w:type="gramStart"/>
+      <w:r>
+        <w:rPr>
+          <w:rFonts w:ascii="Courier New" w:hAnsi="Courier New" w:cs="Courier New"/>
+          <w:sz w:val="22"/>
+          <w:szCs w:val="22"/>
+        </w:rPr>
+        <w:t>nn.Linear</w:t>
+      </w:r>
+      <w:proofErr w:type="spellEnd"/>
+      <w:proofErr w:type="gramEnd"/>
+      <w:r>
+        <w:rPr>
+          <w:rFonts w:ascii="Courier New" w:hAnsi="Courier New" w:cs="Courier New"/>
+          <w:sz w:val="22"/>
+          <w:szCs w:val="22"/>
+        </w:rPr>
+        <w:t>(</w:t>
+      </w:r>
+      <w:proofErr w:type="spellStart"/>
+      <w:proofErr w:type="gramStart"/>
+      <w:r>
+        <w:rPr>
+          <w:rFonts w:ascii="Courier New" w:hAnsi="Courier New" w:cs="Courier New"/>
+          <w:sz w:val="22"/>
+          <w:szCs w:val="22"/>
+        </w:rPr>
+        <w:t>model.classifier</w:t>
+      </w:r>
+      <w:proofErr w:type="spellEnd"/>
+      <w:proofErr w:type="gramEnd"/>
+      <w:r>
+        <w:rPr>
+          <w:rFonts w:ascii="Courier New" w:hAnsi="Courier New" w:cs="Courier New"/>
+          <w:sz w:val="22"/>
+          <w:szCs w:val="22"/>
+        </w:rPr>
+        <w:t>[1].</w:t>
+      </w:r>
+      <w:proofErr w:type="spellStart"/>
+      <w:r>
+        <w:rPr>
+          <w:rFonts w:ascii="Courier New" w:hAnsi="Courier New" w:cs="Courier New"/>
+          <w:sz w:val="22"/>
+          <w:szCs w:val="22"/>
+        </w:rPr>
+        <w:t>in_features</w:t>
+      </w:r>
+      <w:proofErr w:type="spellEnd"/>
+      <w:r>
+        <w:rPr>
+          <w:rFonts w:ascii="Courier New" w:hAnsi="Courier New" w:cs="Courier New"/>
+          <w:sz w:val="22"/>
+          <w:szCs w:val="22"/>
+        </w:rPr>
+        <w:t xml:space="preserve">, </w:t>
+      </w:r>
+      <w:proofErr w:type="spellStart"/>
+      <w:r>
+        <w:rPr>
+          <w:rFonts w:ascii="Courier New" w:hAnsi="Courier New" w:cs="Courier New"/>
+          <w:sz w:val="22"/>
+          <w:szCs w:val="22"/>
+        </w:rPr>
+        <w:t>num_classes</w:t>
+      </w:r>
+      <w:proofErr w:type="spellEnd"/>
+      <w:r>
+        <w:rPr>
+          <w:rFonts w:ascii="Courier New" w:hAnsi="Courier New" w:cs="Courier New"/>
+          <w:sz w:val="22"/>
+          <w:szCs w:val="22"/>
+        </w:rPr>
+        <w:t>)</w:t>
       </w:r>
     </w:p>
     <w:p>
@@ -5730,7 +6362,93 @@
           <w:sz w:val="22"/>
           <w:szCs w:val="22"/>
         </w:rPr>
-        <w:t>optimizer = optim.Adam(model.parameters(), lr=cfg.learning_rate)</w:t>
+        <w:t xml:space="preserve">optimizer = </w:t>
+      </w:r>
+      <w:proofErr w:type="spellStart"/>
+      <w:proofErr w:type="gramStart"/>
+      <w:r>
+        <w:rPr>
+          <w:rFonts w:ascii="Courier New" w:hAnsi="Courier New" w:cs="Courier New"/>
+          <w:sz w:val="22"/>
+          <w:szCs w:val="22"/>
+        </w:rPr>
+        <w:t>optim.Adam</w:t>
+      </w:r>
+      <w:proofErr w:type="spellEnd"/>
+      <w:proofErr w:type="gramEnd"/>
+      <w:r>
+        <w:rPr>
+          <w:rFonts w:ascii="Courier New" w:hAnsi="Courier New" w:cs="Courier New"/>
+          <w:sz w:val="22"/>
+          <w:szCs w:val="22"/>
+        </w:rPr>
+        <w:t>(</w:t>
+      </w:r>
+      <w:proofErr w:type="spellStart"/>
+      <w:proofErr w:type="gramStart"/>
+      <w:r>
+        <w:rPr>
+          <w:rFonts w:ascii="Courier New" w:hAnsi="Courier New" w:cs="Courier New"/>
+          <w:sz w:val="22"/>
+          <w:szCs w:val="22"/>
+        </w:rPr>
+        <w:t>model.parameters</w:t>
+      </w:r>
+      <w:proofErr w:type="spellEnd"/>
+      <w:proofErr w:type="gramEnd"/>
+      <w:r>
+        <w:rPr>
+          <w:rFonts w:ascii="Courier New" w:hAnsi="Courier New" w:cs="Courier New"/>
+          <w:sz w:val="22"/>
+          <w:szCs w:val="22"/>
+        </w:rPr>
+        <w:t xml:space="preserve">(), </w:t>
+      </w:r>
+      <w:proofErr w:type="spellStart"/>
+      <w:r>
+        <w:rPr>
+          <w:rFonts w:ascii="Courier New" w:hAnsi="Courier New" w:cs="Courier New"/>
+          <w:sz w:val="22"/>
+          <w:szCs w:val="22"/>
+        </w:rPr>
+        <w:t>lr</w:t>
+      </w:r>
+      <w:proofErr w:type="spellEnd"/>
+      <w:r>
+        <w:rPr>
+          <w:rFonts w:ascii="Courier New" w:hAnsi="Courier New" w:cs="Courier New"/>
+          <w:sz w:val="22"/>
+          <w:szCs w:val="22"/>
+        </w:rPr>
+        <w:t>=</w:t>
+      </w:r>
+      <w:proofErr w:type="spellStart"/>
+      <w:proofErr w:type="gramStart"/>
+      <w:r>
+        <w:rPr>
+          <w:rFonts w:ascii="Courier New" w:hAnsi="Courier New" w:cs="Courier New"/>
+          <w:sz w:val="22"/>
+          <w:szCs w:val="22"/>
+        </w:rPr>
+        <w:t>cfg.learning</w:t>
+      </w:r>
+      <w:proofErr w:type="gramEnd"/>
+      <w:r>
+        <w:rPr>
+          <w:rFonts w:ascii="Courier New" w:hAnsi="Courier New" w:cs="Courier New"/>
+          <w:sz w:val="22"/>
+          <w:szCs w:val="22"/>
+        </w:rPr>
+        <w:t>_rate</w:t>
+      </w:r>
+      <w:proofErr w:type="spellEnd"/>
+      <w:r>
+        <w:rPr>
+          <w:rFonts w:ascii="Courier New" w:hAnsi="Courier New" w:cs="Courier New"/>
+          <w:sz w:val="22"/>
+          <w:szCs w:val="22"/>
+        </w:rPr>
+        <w:t>)</w:t>
       </w:r>
     </w:p>
     <w:p>
@@ -5750,7 +6468,35 @@
           <w:sz w:val="22"/>
           <w:szCs w:val="22"/>
         </w:rPr>
-        <w:t>scheduler = optim.lr_scheduler.ReduceLROnPlateau(optimizer, mode="min")</w:t>
+        <w:t xml:space="preserve">scheduler = </w:t>
+      </w:r>
+      <w:proofErr w:type="spellStart"/>
+      <w:r>
+        <w:rPr>
+          <w:rFonts w:ascii="Courier New" w:hAnsi="Courier New" w:cs="Courier New"/>
+          <w:sz w:val="22"/>
+          <w:szCs w:val="22"/>
+        </w:rPr>
+        <w:t>optim.lr_</w:t>
+      </w:r>
+      <w:proofErr w:type="gramStart"/>
+      <w:r>
+        <w:rPr>
+          <w:rFonts w:ascii="Courier New" w:hAnsi="Courier New" w:cs="Courier New"/>
+          <w:sz w:val="22"/>
+          <w:szCs w:val="22"/>
+        </w:rPr>
+        <w:t>scheduler.ReduceLROnPlateau</w:t>
+      </w:r>
+      <w:proofErr w:type="spellEnd"/>
+      <w:proofErr w:type="gramEnd"/>
+      <w:r>
+        <w:rPr>
+          <w:rFonts w:ascii="Courier New" w:hAnsi="Courier New" w:cs="Courier New"/>
+          <w:sz w:val="22"/>
+          <w:szCs w:val="22"/>
+        </w:rPr>
+        <w:t>(optimizer, mode="min")</w:t>
       </w:r>
     </w:p>
     <w:p>
@@ -5827,7 +6573,21 @@
         <w:rPr>
           <w:rFonts w:ascii="Times New Roman" w:hAnsi="Times New Roman" w:cs="Times New Roman"/>
         </w:rPr>
-        <w:t xml:space="preserve"> on a machine with a single CUDA GPU visible to PyTorch, for eight epochs with a batch size of 32 and a learning rate of 3e-4. The notebook is publicly available at </w:t>
+        <w:t xml:space="preserve"> on a machine with a single CUDA GPU visible to </w:t>
+      </w:r>
+      <w:proofErr w:type="spellStart"/>
+      <w:r>
+        <w:rPr>
+          <w:rFonts w:ascii="Times New Roman" w:hAnsi="Times New Roman" w:cs="Times New Roman"/>
+        </w:rPr>
+        <w:t>PyTorch</w:t>
+      </w:r>
+      <w:proofErr w:type="spellEnd"/>
+      <w:r>
+        <w:rPr>
+          <w:rFonts w:ascii="Times New Roman" w:hAnsi="Times New Roman" w:cs="Times New Roman"/>
+        </w:rPr>
+        <w:t xml:space="preserve">, for eight epochs with a batch size of 32 and a learning rate of 3e-4. The notebook is publicly available at </w:t>
       </w:r>
       <w:hyperlink r:id="rId16" w:history="1">
         <w:r>
@@ -6795,9 +7555,9 @@
           <w:rFonts w:cs="Times New Roman"/>
         </w:rPr>
       </w:pPr>
-      <w:bookmarkStart w:id="17" w:name="evaluation-and-reflection"/>
-      <w:bookmarkStart w:id="18" w:name="_Toc241062518"/>
-      <w:bookmarkEnd w:id="11"/>
+      <w:bookmarkStart w:id="17" w:name="_Toc241062518"/>
+      <w:bookmarkStart w:id="18" w:name="evaluation-and-reflection"/>
+      <w:bookmarkEnd w:id="12"/>
       <w:r>
         <w:rPr>
           <w:rFonts w:cs="Times New Roman"/>
@@ -6816,7 +7576,7 @@
         </w:rPr>
         <w:t xml:space="preserve"> Evaluation and Reflection</w:t>
       </w:r>
-      <w:bookmarkEnd w:id="18"/>
+      <w:bookmarkEnd w:id="17"/>
     </w:p>
     <w:p>
       <w:pPr>
@@ -7462,7 +8222,21 @@
         <w:rPr>
           <w:rFonts w:cs="Times New Roman"/>
         </w:rPr>
-        <w:t>Two limitations sit outside these results. First, the aerial conditions targeted here are simulated through augmentation of ground-level, close-range photographs rather than genuine drone imagery. This is a reasonable proxy where aerial training data is unavailable, but it misses some characteristics of true UAV imagery, such as how altitude affects object scale. UAV-specific datasets from reviews of AI-enabled UAV systems (arXiv, 2023) and recent drone-based work (Manoj et al., 2025) offer a more direct route to closing this gap</w:t>
+        <w:t>Two limitations sit outside these results. First, the aerial conditions targeted here are simulated through augmentation of ground-level, close-range photographs rather than genuine drone imagery. This is a reasonable proxy where aerial training data is unavailable, but it misses some characteristics of true UAV imagery, such as how altitude affects object scale. UAV-specific datasets from reviews of AI-enabled UAV systems (</w:t>
+      </w:r>
+      <w:proofErr w:type="spellStart"/>
+      <w:r>
+        <w:rPr>
+          <w:rFonts w:cs="Times New Roman"/>
+        </w:rPr>
+        <w:t>arXiv</w:t>
+      </w:r>
+      <w:proofErr w:type="spellEnd"/>
+      <w:r>
+        <w:rPr>
+          <w:rFonts w:cs="Times New Roman"/>
+        </w:rPr>
+        <w:t>, 2023) and recent drone-based work (Manoj et al., 2025) offer a more direct route to closing this gap</w:t>
       </w:r>
       <w:r>
         <w:rPr>
@@ -7484,7 +8258,21 @@
         <w:rPr>
           <w:rFonts w:cs="Times New Roman"/>
         </w:rPr>
-        <w:t>Second, class imbalance in PlantVillage means that, without intervention such as class weighted loss, the classifier risks weaker performance on rarer disease categories, where correct detection matters most. The parameter count achieved supports the goal of onboard, low</w:t>
+        <w:t xml:space="preserve">Second, class imbalance in </w:t>
+      </w:r>
+      <w:proofErr w:type="spellStart"/>
+      <w:r>
+        <w:rPr>
+          <w:rFonts w:cs="Times New Roman"/>
+        </w:rPr>
+        <w:t>PlantVillage</w:t>
+      </w:r>
+      <w:proofErr w:type="spellEnd"/>
+      <w:r>
+        <w:rPr>
+          <w:rFonts w:cs="Times New Roman"/>
+        </w:rPr>
+        <w:t xml:space="preserve"> means that, without intervention such as class weighted loss, the classifier risks weaker performance on rarer disease categories, where correct detection matters most. The parameter count achieved supports the goal of onboard, low</w:t>
       </w:r>
       <w:r>
         <w:rPr>
@@ -7499,7 +8287,7 @@
         <w:t>power inference. A realistic path to field deployment would require converting the model to a runtime format such as TensorFlow Lite or ONNX, integrating GPS metadata to map detections onto the field, and validating against genuine UAV imagery.</w:t>
       </w:r>
     </w:p>
-    <w:bookmarkEnd w:id="17"/>
+    <w:bookmarkEnd w:id="18"/>
     <w:p>
       <w:pPr>
         <w:pStyle w:val="BodyText"/>
@@ -7518,20 +8306,12 @@
     <w:p>
       <w:pPr>
         <w:pStyle w:val="Heading1"/>
-        <w:tabs>
-          <w:tab w:val="left" w:pos="3120"/>
-        </w:tabs>
-        <w:spacing w:before="0"/>
-        <w:rPr>
-          <w:rFonts w:cs="Times New Roman"/>
+        <w:rPr>
           <w:bCs/>
         </w:rPr>
       </w:pPr>
       <w:bookmarkStart w:id="21" w:name="_Toc241062519"/>
       <w:r>
-        <w:rPr>
-          <w:rFonts w:cs="Times New Roman"/>
-        </w:rPr>
         <w:lastRenderedPageBreak/>
         <w:t>Task 2 - Vision-Guided Autonomous Navigation in ROS</w:t>
       </w:r>
@@ -7544,15 +8324,15 @@
           <w:rFonts w:cs="Times New Roman"/>
         </w:rPr>
       </w:pPr>
-      <w:bookmarkStart w:id="22" w:name="project-definition-1"/>
-      <w:bookmarkStart w:id="23" w:name="_Toc241062520"/>
+      <w:bookmarkStart w:id="22" w:name="_Toc241062520"/>
+      <w:bookmarkStart w:id="23" w:name="project-definition-1"/>
       <w:r>
         <w:rPr>
           <w:rFonts w:cs="Times New Roman"/>
         </w:rPr>
         <w:t>4.1 Project Definition</w:t>
       </w:r>
-      <w:bookmarkEnd w:id="23"/>
+      <w:bookmarkEnd w:id="22"/>
     </w:p>
     <w:p>
       <w:pPr>
@@ -7579,7 +8359,21 @@
         <w:rPr>
           <w:rFonts w:ascii="Times New Roman" w:hAnsi="Times New Roman" w:cs="Times New Roman"/>
         </w:rPr>
-        <w:t>guided navigation for a simulated TurtleBot3 mobile robot, run within TheConstruct.ai's ROS 2 Gazebo environment (TheConstruct.ai, 2024). The objective is for the robot to detect a coloured marker using its onboard RGB camera and navigate toward it using simple, interpretable vision-based rules rather than a learned control policy.</w:t>
+        <w:t xml:space="preserve">guided navigation for a simulated TurtleBot3 mobile robot, run within </w:t>
+      </w:r>
+      <w:proofErr w:type="spellStart"/>
+      <w:r>
+        <w:rPr>
+          <w:rFonts w:ascii="Times New Roman" w:hAnsi="Times New Roman" w:cs="Times New Roman"/>
+        </w:rPr>
+        <w:t>TheConstruct.ai's</w:t>
+      </w:r>
+      <w:proofErr w:type="spellEnd"/>
+      <w:r>
+        <w:rPr>
+          <w:rFonts w:ascii="Times New Roman" w:hAnsi="Times New Roman" w:cs="Times New Roman"/>
+        </w:rPr>
+        <w:t xml:space="preserve"> ROS 2 Gazebo environment (TheConstruct.ai, 2024). The objective is for the robot to detect a coloured marker using its onboard RGB camera and navigate toward it using simple, interpretable vision-based rules rather than a learned control policy.</w:t>
       </w:r>
     </w:p>
     <w:p>
@@ -7594,7 +8388,49 @@
         <w:rPr>
           <w:rFonts w:cs="Times New Roman"/>
         </w:rPr>
-        <w:t>Development and testing were carried out on TheConstruct.ai's browser based ROSject platform, inside ROSject vVGb1L3fxD (URL identifier 1049584), workspace ros2_ws.</w:t>
+        <w:t xml:space="preserve">Development and testing were carried out on </w:t>
+      </w:r>
+      <w:proofErr w:type="spellStart"/>
+      <w:r>
+        <w:rPr>
+          <w:rFonts w:cs="Times New Roman"/>
+        </w:rPr>
+        <w:t>TheConstruct.ai's</w:t>
+      </w:r>
+      <w:proofErr w:type="spellEnd"/>
+      <w:r>
+        <w:rPr>
+          <w:rFonts w:cs="Times New Roman"/>
+        </w:rPr>
+        <w:t xml:space="preserve"> browser based </w:t>
+      </w:r>
+      <w:proofErr w:type="spellStart"/>
+      <w:r>
+        <w:rPr>
+          <w:rFonts w:cs="Times New Roman"/>
+        </w:rPr>
+        <w:t>ROSject</w:t>
+      </w:r>
+      <w:proofErr w:type="spellEnd"/>
+      <w:r>
+        <w:rPr>
+          <w:rFonts w:cs="Times New Roman"/>
+        </w:rPr>
+        <w:t xml:space="preserve"> platform, inside </w:t>
+      </w:r>
+      <w:proofErr w:type="spellStart"/>
+      <w:r>
+        <w:rPr>
+          <w:rFonts w:cs="Times New Roman"/>
+        </w:rPr>
+        <w:t>ROSject</w:t>
+      </w:r>
+      <w:proofErr w:type="spellEnd"/>
+      <w:r>
+        <w:rPr>
+          <w:rFonts w:cs="Times New Roman"/>
+        </w:rPr>
+        <w:t xml:space="preserve"> vVGb1L3fxD (URL identifier 1049584), workspace ros2_ws.</w:t>
       </w:r>
       <w:r>
         <w:rPr>
@@ -7705,7 +8541,47 @@
         <w:fldChar w:fldCharType="end"/>
       </w:r>
       <w:r>
-        <w:t>: TheConstruct.ai ROSject workspace (rosject 1049584), showing the turtlebot3_vision_nav package files and a terminal session used to inspect /cmd_vel, /target_offset and /target_visible directly with ros2 topic echo.</w:t>
+        <w:t xml:space="preserve">: TheConstruct.ai </w:t>
+      </w:r>
+      <w:proofErr w:type="spellStart"/>
+      <w:r>
+        <w:t>ROSject</w:t>
+      </w:r>
+      <w:proofErr w:type="spellEnd"/>
+      <w:r>
+        <w:t xml:space="preserve"> workspace (</w:t>
+      </w:r>
+      <w:proofErr w:type="spellStart"/>
+      <w:r>
+        <w:t>rosject</w:t>
+      </w:r>
+      <w:proofErr w:type="spellEnd"/>
+      <w:r>
+        <w:t xml:space="preserve"> 1049584), showing the turtlebot3_vision_nav package files and a terminal session used to inspect /</w:t>
+      </w:r>
+      <w:proofErr w:type="spellStart"/>
+      <w:r>
+        <w:t>cmd_vel</w:t>
+      </w:r>
+      <w:proofErr w:type="spellEnd"/>
+      <w:r>
+        <w:t>, /</w:t>
+      </w:r>
+      <w:proofErr w:type="spellStart"/>
+      <w:r>
+        <w:t>target_offset</w:t>
+      </w:r>
+      <w:proofErr w:type="spellEnd"/>
+      <w:r>
+        <w:t xml:space="preserve"> and /</w:t>
+      </w:r>
+      <w:proofErr w:type="spellStart"/>
+      <w:r>
+        <w:t>target_visible</w:t>
+      </w:r>
+      <w:proofErr w:type="spellEnd"/>
+      <w:r>
+        <w:t xml:space="preserve"> directly with ros2 topic echo.</w:t>
       </w:r>
       <w:bookmarkEnd w:id="24"/>
     </w:p>
@@ -7736,6 +8612,7 @@
         </w:rPr>
         <w:t xml:space="preserve"> provided with the TurtleBot3 packages, run in Gazebo Sim with the </w:t>
       </w:r>
+      <w:proofErr w:type="spellStart"/>
       <w:r>
         <w:rPr>
           <w:rStyle w:val="VerbatimChar"/>
@@ -7743,6 +8620,7 @@
         </w:rPr>
         <w:t>waffle_pi</w:t>
       </w:r>
+      <w:proofErr w:type="spellEnd"/>
       <w:r>
         <w:rPr>
           <w:rFonts w:cs="Times New Roman"/>
@@ -7841,7 +8719,15 @@
         <w:fldChar w:fldCharType="end"/>
       </w:r>
       <w:r>
-        <w:t>: The waffle_pi TurtleBot3 spawned in turtlebot3_world, showing the entity tree and simulation configuration.</w:t>
+        <w:t xml:space="preserve">: The </w:t>
+      </w:r>
+      <w:proofErr w:type="spellStart"/>
+      <w:r>
+        <w:t>waffle_pi</w:t>
+      </w:r>
+      <w:proofErr w:type="spellEnd"/>
+      <w:r>
+        <w:t xml:space="preserve"> TurtleBot3 spawned in turtlebot3_world, showing the entity tree and simulation configuration.</w:t>
       </w:r>
       <w:bookmarkEnd w:id="25"/>
     </w:p>
@@ -7946,9 +8832,9 @@
           <w:rFonts w:cs="Times New Roman"/>
         </w:rPr>
       </w:pPr>
-      <w:bookmarkStart w:id="27" w:name="design-and-implementation-1"/>
-      <w:bookmarkStart w:id="28" w:name="_Toc241062521"/>
-      <w:bookmarkEnd w:id="22"/>
+      <w:bookmarkStart w:id="27" w:name="_Toc241062521"/>
+      <w:bookmarkStart w:id="28" w:name="design-and-implementation-1"/>
+      <w:bookmarkEnd w:id="23"/>
       <w:r>
         <w:rPr>
           <w:rFonts w:cs="Times New Roman"/>
@@ -7956,7 +8842,7 @@
         <w:lastRenderedPageBreak/>
         <w:t>4.2 Design and Implementation</w:t>
       </w:r>
-      <w:bookmarkEnd w:id="28"/>
+      <w:bookmarkEnd w:id="27"/>
     </w:p>
     <w:p>
       <w:pPr>
@@ -8085,7 +8971,21 @@
         <w:rPr>
           <w:rFonts w:cs="Times New Roman"/>
         </w:rPr>
-        <w:t>In vision_detector, each frame is converted to HSV colour space, chosen over RGB for its robustness to lighting variation. A binary mask of the target colour range is cleaned via morphological opening and closing, and the largest contour above a minimum area threshold is taken as the marker. Its centroid offset is normalised to minus one to one and published with a visibility flag.</w:t>
+        <w:t xml:space="preserve">In </w:t>
+      </w:r>
+      <w:proofErr w:type="spellStart"/>
+      <w:r>
+        <w:rPr>
+          <w:rFonts w:cs="Times New Roman"/>
+        </w:rPr>
+        <w:t>vision_detector</w:t>
+      </w:r>
+      <w:proofErr w:type="spellEnd"/>
+      <w:r>
+        <w:rPr>
+          <w:rFonts w:cs="Times New Roman"/>
+        </w:rPr>
+        <w:t>, each frame is converted to HSV colour space, chosen over RGB for its robustness to lighting variation. A binary mask of the target colour range is cleaned via morphological opening and closing, and the largest contour above a minimum area threshold is taken as the marker. Its centroid offset is normalised to minus one to one and published with a visibility flag.</w:t>
       </w:r>
     </w:p>
     <w:p>
@@ -8102,11 +9002,19 @@
         </w:rPr>
         <w:t xml:space="preserve">The </w:t>
       </w:r>
-      <w:r>
-        <w:rPr>
-          <w:rFonts w:cs="Times New Roman"/>
-        </w:rPr>
-        <w:t>navigation_controller node subscribes to both signals and runs the rule-based controller. With no marker visible, the robot rotates slowly to search. Once visible, it turns toward the marker if the offset exceeds a centring threshold, scaling turn rate to offset and capping angular velocity, then drives forward at a fixed speed once centred, publishing commands at roughly ten hertz.</w:t>
+      <w:proofErr w:type="spellStart"/>
+      <w:r>
+        <w:rPr>
+          <w:rFonts w:cs="Times New Roman"/>
+        </w:rPr>
+        <w:t>navigation_controller</w:t>
+      </w:r>
+      <w:proofErr w:type="spellEnd"/>
+      <w:r>
+        <w:rPr>
+          <w:rFonts w:cs="Times New Roman"/>
+        </w:rPr>
+        <w:t xml:space="preserve"> node subscribes to both signals and runs the rule-based controller. With no marker visible, the robot rotates slowly to search. Once visible, it turns toward the marker if the offset exceeds a centring threshold, scaling turn rate to offset and capping angular velocity, then drives forward at a fixed speed once centred, publishing commands at roughly ten hertz.</w:t>
       </w:r>
     </w:p>
     <w:p>
@@ -8116,9 +9024,9 @@
           <w:rFonts w:cs="Times New Roman"/>
         </w:rPr>
       </w:pPr>
-      <w:bookmarkStart w:id="30" w:name="execution-and-testing-1"/>
-      <w:bookmarkStart w:id="31" w:name="_Toc241062522"/>
-      <w:bookmarkEnd w:id="27"/>
+      <w:bookmarkStart w:id="30" w:name="_Toc241062522"/>
+      <w:bookmarkStart w:id="31" w:name="execution-and-testing-1"/>
+      <w:bookmarkEnd w:id="28"/>
       <w:r>
         <w:rPr>
           <w:rFonts w:cs="Times New Roman"/>
@@ -8126,7 +9034,7 @@
         <w:lastRenderedPageBreak/>
         <w:t>4.3 Execution and Testing</w:t>
       </w:r>
-      <w:bookmarkEnd w:id="31"/>
+      <w:bookmarkEnd w:id="30"/>
     </w:p>
     <w:p>
       <w:pPr>
@@ -8141,7 +9049,21 @@
         <w:rPr>
           <w:rFonts w:ascii="Times New Roman" w:hAnsi="Times New Roman" w:cs="Times New Roman"/>
         </w:rPr>
-        <w:t>Testing proceeded in two stages: perception and control logic was first verified offline against seven synthetic test frames covering the scenarios the brief recommends, shown in Figure 11, then the same nodes were launched inside the ROSject and queried directly against the live simulation using ros2 topic echo.</w:t>
+        <w:t xml:space="preserve">Testing proceeded in two stages: perception and control logic was first verified offline against seven synthetic test frames covering the scenarios the brief recommends, shown in Figure 11, then the same nodes were launched inside the </w:t>
+      </w:r>
+      <w:proofErr w:type="spellStart"/>
+      <w:r>
+        <w:rPr>
+          <w:rFonts w:ascii="Times New Roman" w:hAnsi="Times New Roman" w:cs="Times New Roman"/>
+        </w:rPr>
+        <w:t>ROSject</w:t>
+      </w:r>
+      <w:proofErr w:type="spellEnd"/>
+      <w:r>
+        <w:rPr>
+          <w:rFonts w:ascii="Times New Roman" w:hAnsi="Times New Roman" w:cs="Times New Roman"/>
+        </w:rPr>
+        <w:t xml:space="preserve"> and queried directly against the live simulation using ros2 topic echo.</w:t>
       </w:r>
     </w:p>
     <w:p>
@@ -8389,11 +9311,19 @@
                 <w:rFonts w:ascii="Times New Roman" w:hAnsi="Times New Roman" w:cs="Times New Roman"/>
               </w:rPr>
             </w:pPr>
-            <w:r>
-              <w:rPr>
-                <w:rFonts w:ascii="Times New Roman" w:hAnsi="Times New Roman" w:cs="Times New Roman"/>
-              </w:rPr>
-              <w:t>lin_x (m/s)</w:t>
+            <w:proofErr w:type="spellStart"/>
+            <w:r>
+              <w:rPr>
+                <w:rFonts w:ascii="Times New Roman" w:hAnsi="Times New Roman" w:cs="Times New Roman"/>
+              </w:rPr>
+              <w:t>lin_x</w:t>
+            </w:r>
+            <w:proofErr w:type="spellEnd"/>
+            <w:r>
+              <w:rPr>
+                <w:rFonts w:ascii="Times New Roman" w:hAnsi="Times New Roman" w:cs="Times New Roman"/>
+              </w:rPr>
+              <w:t xml:space="preserve"> (m/s)</w:t>
             </w:r>
           </w:p>
         </w:tc>
@@ -8416,11 +9346,19 @@
                 <w:rFonts w:ascii="Times New Roman" w:hAnsi="Times New Roman" w:cs="Times New Roman"/>
               </w:rPr>
             </w:pPr>
-            <w:r>
-              <w:rPr>
-                <w:rFonts w:ascii="Times New Roman" w:hAnsi="Times New Roman" w:cs="Times New Roman"/>
-              </w:rPr>
-              <w:t>ang_z (rad/s)</w:t>
+            <w:proofErr w:type="spellStart"/>
+            <w:r>
+              <w:rPr>
+                <w:rFonts w:ascii="Times New Roman" w:hAnsi="Times New Roman" w:cs="Times New Roman"/>
+              </w:rPr>
+              <w:t>ang_z</w:t>
+            </w:r>
+            <w:proofErr w:type="spellEnd"/>
+            <w:r>
+              <w:rPr>
+                <w:rFonts w:ascii="Times New Roman" w:hAnsi="Times New Roman" w:cs="Times New Roman"/>
+              </w:rPr>
+              <w:t xml:space="preserve"> (rad/s)</w:t>
             </w:r>
           </w:p>
         </w:tc>
@@ -9612,7 +10550,15 @@
         <w:fldChar w:fldCharType="end"/>
       </w:r>
       <w:r>
-        <w:t xml:space="preserve">: Live ROSject verification (ros2 topic echo, single query each, shown in Figure </w:t>
+        <w:t xml:space="preserve">: Live </w:t>
+      </w:r>
+      <w:proofErr w:type="spellStart"/>
+      <w:r>
+        <w:t>ROSject</w:t>
+      </w:r>
+      <w:proofErr w:type="spellEnd"/>
+      <w:r>
+        <w:t xml:space="preserve"> verification (ros2 topic echo, single query each, shown in Figure </w:t>
       </w:r>
       <w:r>
         <w:t>7</w:t>
@@ -9721,8 +10667,26 @@
                 <w:rStyle w:val="VerbatimChar"/>
                 <w:rFonts w:ascii="Times New Roman" w:hAnsi="Times New Roman" w:cs="Times New Roman"/>
               </w:rPr>
-              <w:t>/target_visible</w:t>
-            </w:r>
+              <w:t>/</w:t>
+            </w:r>
+            <w:proofErr w:type="spellStart"/>
+            <w:proofErr w:type="gramStart"/>
+            <w:r>
+              <w:rPr>
+                <w:rStyle w:val="VerbatimChar"/>
+                <w:rFonts w:ascii="Times New Roman" w:hAnsi="Times New Roman" w:cs="Times New Roman"/>
+              </w:rPr>
+              <w:t>target</w:t>
+            </w:r>
+            <w:proofErr w:type="gramEnd"/>
+            <w:r>
+              <w:rPr>
+                <w:rStyle w:val="VerbatimChar"/>
+                <w:rFonts w:ascii="Times New Roman" w:hAnsi="Times New Roman" w:cs="Times New Roman"/>
+              </w:rPr>
+              <w:t>_visible</w:t>
+            </w:r>
+            <w:proofErr w:type="spellEnd"/>
           </w:p>
         </w:tc>
         <w:tc>
@@ -9779,8 +10743,26 @@
                 <w:rStyle w:val="VerbatimChar"/>
                 <w:rFonts w:ascii="Times New Roman" w:hAnsi="Times New Roman" w:cs="Times New Roman"/>
               </w:rPr>
-              <w:t>/target_offset</w:t>
-            </w:r>
+              <w:t>/</w:t>
+            </w:r>
+            <w:proofErr w:type="spellStart"/>
+            <w:proofErr w:type="gramStart"/>
+            <w:r>
+              <w:rPr>
+                <w:rStyle w:val="VerbatimChar"/>
+                <w:rFonts w:ascii="Times New Roman" w:hAnsi="Times New Roman" w:cs="Times New Roman"/>
+              </w:rPr>
+              <w:t>target</w:t>
+            </w:r>
+            <w:proofErr w:type="gramEnd"/>
+            <w:r>
+              <w:rPr>
+                <w:rStyle w:val="VerbatimChar"/>
+                <w:rFonts w:ascii="Times New Roman" w:hAnsi="Times New Roman" w:cs="Times New Roman"/>
+              </w:rPr>
+              <w:t>_offset</w:t>
+            </w:r>
+            <w:proofErr w:type="spellEnd"/>
           </w:p>
         </w:tc>
         <w:tc>
@@ -9836,14 +10818,40 @@
                 <w:rStyle w:val="VerbatimChar"/>
                 <w:rFonts w:ascii="Times New Roman" w:hAnsi="Times New Roman" w:cs="Times New Roman"/>
               </w:rPr>
-              <w:t>/cmd_vel</w:t>
-            </w:r>
-            <w:r>
-              <w:rPr>
-                <w:rFonts w:ascii="Times New Roman" w:hAnsi="Times New Roman" w:cs="Times New Roman"/>
-              </w:rPr>
-              <w:t xml:space="preserve"> linear.x</w:t>
-            </w:r>
+              <w:t>/</w:t>
+            </w:r>
+            <w:proofErr w:type="spellStart"/>
+            <w:proofErr w:type="gramStart"/>
+            <w:r>
+              <w:rPr>
+                <w:rStyle w:val="VerbatimChar"/>
+                <w:rFonts w:ascii="Times New Roman" w:hAnsi="Times New Roman" w:cs="Times New Roman"/>
+              </w:rPr>
+              <w:t>cmd</w:t>
+            </w:r>
+            <w:proofErr w:type="gramEnd"/>
+            <w:r>
+              <w:rPr>
+                <w:rStyle w:val="VerbatimChar"/>
+                <w:rFonts w:ascii="Times New Roman" w:hAnsi="Times New Roman" w:cs="Times New Roman"/>
+              </w:rPr>
+              <w:t>_vel</w:t>
+            </w:r>
+            <w:proofErr w:type="spellEnd"/>
+            <w:r>
+              <w:rPr>
+                <w:rFonts w:ascii="Times New Roman" w:hAnsi="Times New Roman" w:cs="Times New Roman"/>
+              </w:rPr>
+              <w:t xml:space="preserve"> </w:t>
+            </w:r>
+            <w:proofErr w:type="spellStart"/>
+            <w:r>
+              <w:rPr>
+                <w:rFonts w:ascii="Times New Roman" w:hAnsi="Times New Roman" w:cs="Times New Roman"/>
+              </w:rPr>
+              <w:t>linear.x</w:t>
+            </w:r>
+            <w:proofErr w:type="spellEnd"/>
           </w:p>
         </w:tc>
         <w:tc>
@@ -9900,14 +10908,42 @@
                 <w:rStyle w:val="VerbatimChar"/>
                 <w:rFonts w:ascii="Times New Roman" w:hAnsi="Times New Roman" w:cs="Times New Roman"/>
               </w:rPr>
-              <w:t>/cmd_vel</w:t>
-            </w:r>
-            <w:r>
-              <w:rPr>
-                <w:rFonts w:ascii="Times New Roman" w:hAnsi="Times New Roman" w:cs="Times New Roman"/>
-              </w:rPr>
-              <w:t xml:space="preserve"> angular.z</w:t>
-            </w:r>
+              <w:t>/</w:t>
+            </w:r>
+            <w:proofErr w:type="spellStart"/>
+            <w:proofErr w:type="gramStart"/>
+            <w:r>
+              <w:rPr>
+                <w:rStyle w:val="VerbatimChar"/>
+                <w:rFonts w:ascii="Times New Roman" w:hAnsi="Times New Roman" w:cs="Times New Roman"/>
+              </w:rPr>
+              <w:t>cmd</w:t>
+            </w:r>
+            <w:proofErr w:type="gramEnd"/>
+            <w:r>
+              <w:rPr>
+                <w:rStyle w:val="VerbatimChar"/>
+                <w:rFonts w:ascii="Times New Roman" w:hAnsi="Times New Roman" w:cs="Times New Roman"/>
+              </w:rPr>
+              <w:t>_vel</w:t>
+            </w:r>
+            <w:proofErr w:type="spellEnd"/>
+            <w:r>
+              <w:rPr>
+                <w:rFonts w:ascii="Times New Roman" w:hAnsi="Times New Roman" w:cs="Times New Roman"/>
+              </w:rPr>
+              <w:t xml:space="preserve"> </w:t>
+            </w:r>
+            <w:proofErr w:type="spellStart"/>
+            <w:proofErr w:type="gramStart"/>
+            <w:r>
+              <w:rPr>
+                <w:rFonts w:ascii="Times New Roman" w:hAnsi="Times New Roman" w:cs="Times New Roman"/>
+              </w:rPr>
+              <w:t>angular.z</w:t>
+            </w:r>
+            <w:proofErr w:type="spellEnd"/>
+            <w:proofErr w:type="gramEnd"/>
           </w:p>
         </w:tc>
         <w:tc>
@@ -9964,7 +11000,65 @@
         <w:rPr>
           <w:rFonts w:cs="Times New Roman"/>
         </w:rPr>
-        <w:t>Applying this to the live offset of -0.4618 gives 0.3694 rad/s, matching the live /cmd_vel value of 0.36944 rad/s to five decimal places. The negative offset correctly produced a positive angular.z (a left turn), and linear.x remained zero since the offset exceeded the centring threshold, closing the loop between offline verification and genuine ROSject behaviour.</w:t>
+        <w:t>Applying this to the live offset of -0.4618 gives 0.3694 rad/s, matching the live /</w:t>
+      </w:r>
+      <w:proofErr w:type="spellStart"/>
+      <w:r>
+        <w:rPr>
+          <w:rFonts w:cs="Times New Roman"/>
+        </w:rPr>
+        <w:t>cmd_vel</w:t>
+      </w:r>
+      <w:proofErr w:type="spellEnd"/>
+      <w:r>
+        <w:rPr>
+          <w:rFonts w:cs="Times New Roman"/>
+        </w:rPr>
+        <w:t xml:space="preserve"> value of 0.36944 rad/s to five decimal places. The negative offset correctly produced a positive </w:t>
+      </w:r>
+      <w:proofErr w:type="spellStart"/>
+      <w:proofErr w:type="gramStart"/>
+      <w:r>
+        <w:rPr>
+          <w:rFonts w:cs="Times New Roman"/>
+        </w:rPr>
+        <w:t>angular.z</w:t>
+      </w:r>
+      <w:proofErr w:type="spellEnd"/>
+      <w:proofErr w:type="gramEnd"/>
+      <w:r>
+        <w:rPr>
+          <w:rFonts w:cs="Times New Roman"/>
+        </w:rPr>
+        <w:t xml:space="preserve"> (a left turn), and </w:t>
+      </w:r>
+      <w:proofErr w:type="spellStart"/>
+      <w:r>
+        <w:rPr>
+          <w:rFonts w:cs="Times New Roman"/>
+        </w:rPr>
+        <w:t>linear.x</w:t>
+      </w:r>
+      <w:proofErr w:type="spellEnd"/>
+      <w:r>
+        <w:rPr>
+          <w:rFonts w:cs="Times New Roman"/>
+        </w:rPr>
+        <w:t xml:space="preserve"> remained zero since the offset exceeded the centring threshold, closing the loop between offline verification and genuine </w:t>
+      </w:r>
+      <w:proofErr w:type="spellStart"/>
+      <w:r>
+        <w:rPr>
+          <w:rFonts w:cs="Times New Roman"/>
+        </w:rPr>
+        <w:t>ROSject</w:t>
+      </w:r>
+      <w:proofErr w:type="spellEnd"/>
+      <w:r>
+        <w:rPr>
+          <w:rFonts w:cs="Times New Roman"/>
+        </w:rPr>
+        <w:t xml:space="preserve"> behaviour.</w:t>
       </w:r>
     </w:p>
     <w:p>
@@ -9974,16 +11068,16 @@
           <w:rFonts w:cs="Times New Roman"/>
         </w:rPr>
       </w:pPr>
-      <w:bookmarkStart w:id="35" w:name="evaluation-and-reflection-1"/>
-      <w:bookmarkStart w:id="36" w:name="_Toc241062523"/>
-      <w:bookmarkEnd w:id="30"/>
+      <w:bookmarkStart w:id="35" w:name="_Toc241062523"/>
+      <w:bookmarkStart w:id="36" w:name="evaluation-and-reflection-1"/>
+      <w:bookmarkEnd w:id="31"/>
       <w:r>
         <w:rPr>
           <w:rFonts w:cs="Times New Roman"/>
         </w:rPr>
         <w:t>4.4 Evaluation and Reflection</w:t>
       </w:r>
-      <w:bookmarkEnd w:id="36"/>
+      <w:bookmarkEnd w:id="35"/>
     </w:p>
     <w:p>
       <w:pPr>
@@ -10055,7 +11149,7 @@
         </w:rPr>
       </w:pPr>
       <w:bookmarkStart w:id="37" w:name="combined-evaluation-and-reflection"/>
-      <w:bookmarkEnd w:id="35"/>
+      <w:bookmarkEnd w:id="36"/>
       <w:r>
         <w:rPr>
           <w:rFonts w:cs="Times New Roman"/>
@@ -10121,15 +11215,9 @@
     <w:p>
       <w:pPr>
         <w:pStyle w:val="Heading1"/>
-        <w:rPr>
-          <w:rFonts w:cs="Times New Roman"/>
-        </w:rPr>
       </w:pPr>
       <w:bookmarkStart w:id="38" w:name="_Toc241062524"/>
       <w:r>
-        <w:rPr>
-          <w:rFonts w:cs="Times New Roman"/>
-        </w:rPr>
         <w:t>Combined Evaluation and Reflection</w:t>
       </w:r>
       <w:bookmarkEnd w:id="38"/>
@@ -10207,14 +11295,8 @@
     <w:p>
       <w:pPr>
         <w:pStyle w:val="Heading1"/>
-        <w:rPr>
-          <w:rFonts w:cs="Times New Roman"/>
-        </w:rPr>
-      </w:pPr>
-      <w:r>
-        <w:rPr>
-          <w:rFonts w:cs="Times New Roman"/>
-        </w:rPr>
+      </w:pPr>
+      <w:r>
         <w:lastRenderedPageBreak/>
         <w:t>Concluding Remarks</w:t>
       </w:r>
@@ -10233,7 +11315,35 @@
         <w:rPr>
           <w:rFonts w:ascii="Times New Roman" w:hAnsi="Times New Roman" w:cs="Times New Roman"/>
         </w:rPr>
-        <w:t>This report has presented two robotic vision systems for the module Advanced Robotics Automation and Computer Vision. Task 1 produced a MobileNetV2 based plant disease classifier trained on PlantVillage, reaching the accuracy and F1 performance reported in the Executive Summary while remaining light enough for embedded deployment. Task 2 produced a ROS 2 perception and navigation design for a simulated TurtleBot3 using HSV colour thresholding and a rule-based controller, verified offline across seven scenarios and confirmed on the live ROSject, matching the controller's proportional gain to five decimal places.</w:t>
+        <w:t xml:space="preserve">This report has presented two robotic vision systems for the module Advanced Robotics Automation and Computer Vision. Task 1 produced a MobileNetV2 based plant disease classifier trained on </w:t>
+      </w:r>
+      <w:proofErr w:type="spellStart"/>
+      <w:r>
+        <w:rPr>
+          <w:rFonts w:ascii="Times New Roman" w:hAnsi="Times New Roman" w:cs="Times New Roman"/>
+        </w:rPr>
+        <w:t>PlantVillage</w:t>
+      </w:r>
+      <w:proofErr w:type="spellEnd"/>
+      <w:r>
+        <w:rPr>
+          <w:rFonts w:ascii="Times New Roman" w:hAnsi="Times New Roman" w:cs="Times New Roman"/>
+        </w:rPr>
+        <w:t xml:space="preserve">, reaching the accuracy and F1 performance reported in the Executive Summary while remaining light enough for embedded deployment. Task 2 produced a ROS 2 perception and navigation design for a simulated TurtleBot3 using HSV colour thresholding and a rule-based controller, verified offline across seven scenarios and confirmed on the live </w:t>
+      </w:r>
+      <w:proofErr w:type="spellStart"/>
+      <w:r>
+        <w:rPr>
+          <w:rFonts w:ascii="Times New Roman" w:hAnsi="Times New Roman" w:cs="Times New Roman"/>
+        </w:rPr>
+        <w:t>ROSject</w:t>
+      </w:r>
+      <w:proofErr w:type="spellEnd"/>
+      <w:r>
+        <w:rPr>
+          <w:rFonts w:ascii="Times New Roman" w:hAnsi="Times New Roman" w:cs="Times New Roman"/>
+        </w:rPr>
+        <w:t>, matching the controller's proportional gain to five decimal places.</w:t>
       </w:r>
     </w:p>
     <w:p>
@@ -10285,15 +11395,9 @@
     <w:p>
       <w:pPr>
         <w:pStyle w:val="Heading1"/>
-        <w:rPr>
-          <w:rFonts w:cs="Times New Roman"/>
-        </w:rPr>
       </w:pPr>
       <w:bookmarkStart w:id="40" w:name="_Toc241062526"/>
       <w:r>
-        <w:rPr>
-          <w:rFonts w:cs="Times New Roman"/>
-        </w:rPr>
         <w:lastRenderedPageBreak/>
         <w:t>Acknowledgement</w:t>
       </w:r>
@@ -10378,23 +11482,29 @@
           <w:szCs w:val="40"/>
         </w:rPr>
       </w:pPr>
+      <w:r>
+        <w:rPr>
+          <w:rFonts w:eastAsiaTheme="majorEastAsia" w:cs="Times New Roman"/>
+          <w:b/>
+          <w:bCs/>
+          <w:color w:val="000000" w:themeColor="text1"/>
+          <w:sz w:val="28"/>
+          <w:szCs w:val="40"/>
+        </w:rPr>
+        <w:br w:type="page"/>
+      </w:r>
     </w:p>
     <w:p>
       <w:pPr>
         <w:pStyle w:val="Heading1"/>
-        <w:pageBreakBefore/>
-        <w:spacing w:before="0"/>
-        <w:rPr>
-          <w:rFonts w:cs="Times New Roman"/>
-        </w:rPr>
       </w:pPr>
       <w:bookmarkStart w:id="41" w:name="_Toc241062527"/>
       <w:r>
-        <w:rPr>
-          <w:rFonts w:cs="Times New Roman"/>
-        </w:rPr>
         <w:lastRenderedPageBreak/>
-        <w:t>References</w:t>
+        <w:t>R</w:t>
+      </w:r>
+      <w:r>
+        <w:t>eferences</w:t>
       </w:r>
       <w:bookmarkEnd w:id="41"/>
     </w:p>
@@ -10410,7 +11520,21 @@
         <w:rPr>
           <w:rFonts w:cs="Times New Roman"/>
         </w:rPr>
-        <w:t xml:space="preserve">Jlassi, A., Elaoud, A., Ghazouani, H., and Barhoumi, W. (2024) 'Potato Leaf Disease Classification Using Transfer Learning and Reweighting-Based Training with Imbalanced Data.' SN Computer Science 5, 987. [online] Available from </w:t>
+        <w:t>Jlassi, A., El</w:t>
+      </w:r>
+      <w:proofErr w:type="spellStart"/>
+      <w:r>
+        <w:rPr>
+          <w:rFonts w:cs="Times New Roman"/>
+        </w:rPr>
+        <w:t>aoud</w:t>
+      </w:r>
+      <w:proofErr w:type="spellEnd"/>
+      <w:r>
+        <w:rPr>
+          <w:rFonts w:cs="Times New Roman"/>
+        </w:rPr>
+        <w:t xml:space="preserve">, A., Ghazouani, H., and Barhoumi, W. (2024) 'Potato Leaf Disease Classification Using Transfer Learning and Reweighting-Based Training with Imbalanced Data.' SN Computer Science 5, 987. [online] Available from </w:t>
       </w:r>
       <w:hyperlink r:id="rId25" w:history="1">
         <w:r>
@@ -10502,11 +11626,33 @@
           <w:rFonts w:cs="Times New Roman"/>
         </w:rPr>
       </w:pPr>
-      <w:r>
-        <w:rPr>
-          <w:rFonts w:cs="Times New Roman"/>
-        </w:rPr>
-        <w:t xml:space="preserve">mohanty/PlantVillage (2016) [online] Available from </w:t>
+      <w:proofErr w:type="spellStart"/>
+      <w:r>
+        <w:rPr>
+          <w:rFonts w:cs="Times New Roman"/>
+        </w:rPr>
+        <w:t>mohanty</w:t>
+      </w:r>
+      <w:proofErr w:type="spellEnd"/>
+      <w:r>
+        <w:rPr>
+          <w:rFonts w:cs="Times New Roman"/>
+        </w:rPr>
+        <w:t>/</w:t>
+      </w:r>
+      <w:proofErr w:type="spellStart"/>
+      <w:r>
+        <w:rPr>
+          <w:rFonts w:cs="Times New Roman"/>
+        </w:rPr>
+        <w:t>PlantVillage</w:t>
+      </w:r>
+      <w:proofErr w:type="spellEnd"/>
+      <w:r>
+        <w:rPr>
+          <w:rFonts w:cs="Times New Roman"/>
+        </w:rPr>
+        <w:t xml:space="preserve"> (2016) [online] Available from </w:t>
       </w:r>
       <w:hyperlink r:id="rId28">
         <w:r>
@@ -10630,11 +11776,19 @@
           <w:rFonts w:cs="Times New Roman"/>
         </w:rPr>
       </w:pPr>
-      <w:r>
-        <w:rPr>
-          <w:rFonts w:cs="Times New Roman"/>
-        </w:rPr>
-        <w:t xml:space="preserve">PlantVillage-Dataset (2016) [online] Available from </w:t>
+      <w:proofErr w:type="spellStart"/>
+      <w:r>
+        <w:rPr>
+          <w:rFonts w:cs="Times New Roman"/>
+        </w:rPr>
+        <w:t>PlantVillage</w:t>
+      </w:r>
+      <w:proofErr w:type="spellEnd"/>
+      <w:r>
+        <w:rPr>
+          <w:rFonts w:cs="Times New Roman"/>
+        </w:rPr>
+        <w:t xml:space="preserve">-Dataset (2016) [online] Available from </w:t>
       </w:r>
       <w:hyperlink r:id="rId31">
         <w:r>
@@ -10665,7 +11819,21 @@
           <w:rFonts w:cs="Times New Roman"/>
         </w:rPr>
         <w:lastRenderedPageBreak/>
-        <w:t>Quigley, M., Conley, K., Gerkey, B., Faust, J., Foote, T., Leibs, J., Wheeler, R., and Ng, A.Y. (2009) ‘ROS: an open-source Robot Operating System.’ In: ICRA Workshop on Open Source Software. Kobe: IEEE.</w:t>
+        <w:t xml:space="preserve">Quigley, M., Conley, K., Gerkey, B., Faust, J., Foote, T., Leibs, J., Wheeler, R., and Ng, A.Y. (2009) ‘ROS: an open-source Robot Operating System.’ In: ICRA Workshop on </w:t>
+      </w:r>
+      <w:proofErr w:type="gramStart"/>
+      <w:r>
+        <w:rPr>
+          <w:rFonts w:cs="Times New Roman"/>
+        </w:rPr>
+        <w:t>Open Source</w:t>
+      </w:r>
+      <w:proofErr w:type="gramEnd"/>
+      <w:r>
+        <w:rPr>
+          <w:rFonts w:cs="Times New Roman"/>
+        </w:rPr>
+        <w:t xml:space="preserve"> Software. Kobe: IEEE.</w:t>
       </w:r>
     </w:p>
     <w:p>
@@ -11509,7 +12677,7 @@
     <w:autoRedefine/>
     <w:uiPriority w:val="9"/>
     <w:qFormat/>
-    <w:rsid w:val="00CB4CA7"/>
+    <w:rsid w:val="007052AC"/>
     <w:pPr>
       <w:keepNext/>
       <w:keepLines/>
@@ -11517,11 +12685,11 @@
       <w:outlineLvl w:val="0"/>
     </w:pPr>
     <w:rPr>
-      <w:rFonts w:eastAsiaTheme="majorEastAsia" w:cstheme="majorBidi"/>
+      <w:rFonts w:eastAsiaTheme="majorEastAsia" w:cs="Times New Roman"/>
       <w:b/>
       <w:color w:val="000000" w:themeColor="text1"/>
-      <w:sz w:val="28"/>
-      <w:szCs w:val="40"/>
+      <w:sz w:val="32"/>
+      <w:szCs w:val="32"/>
     </w:rPr>
   </w:style>
   <w:style w:type="paragraph" w:styleId="Heading2">
@@ -11701,6 +12869,7 @@
   <w:style w:type="character" w:default="1" w:styleId="DefaultParagraphFont">
     <w:name w:val="Default Paragraph Font"/>
     <w:uiPriority w:val="1"/>
+    <w:semiHidden/>
     <w:unhideWhenUsed/>
   </w:style>
   <w:style w:type="table" w:default="1" w:styleId="TableNormal">
@@ -11729,13 +12898,14 @@
     <w:basedOn w:val="DefaultParagraphFont"/>
     <w:link w:val="Heading1"/>
     <w:uiPriority w:val="9"/>
-    <w:rsid w:val="00CB4CA7"/>
+    <w:rsid w:val="007052AC"/>
     <w:rPr>
-      <w:rFonts w:ascii="Times New Roman" w:eastAsiaTheme="majorEastAsia" w:hAnsi="Times New Roman" w:cstheme="majorBidi"/>
+      <w:rFonts w:ascii="Times New Roman" w:eastAsiaTheme="majorEastAsia" w:hAnsi="Times New Roman" w:cs="Times New Roman"/>
       <w:b/>
       <w:color w:val="000000" w:themeColor="text1"/>
-      <w:sz w:val="28"/>
-      <w:szCs w:val="40"/>
+      <w:sz w:val="32"/>
+      <w:szCs w:val="32"/>
+      <w:lang w:val="en-GB"/>
     </w:rPr>
   </w:style>
   <w:style w:type="character" w:customStyle="1" w:styleId="Heading2Char">
@@ -12317,8 +13487,6 @@
       <w:b w:val="0"/>
       <w:color w:val="2F5496" w:themeColor="accent1" w:themeShade="BF"/>
       <w:kern w:val="0"/>
-      <w:sz w:val="32"/>
-      <w:szCs w:val="32"/>
       <w14:ligatures w14:val="none"/>
     </w:rPr>
   </w:style>

</xml_diff>